<commit_message>
Actualizacion de Guia con URL de Repositorio
</commit_message>
<xml_diff>
--- a/Laboratorio_Kubernetes.docx
+++ b/Laboratorio_Kubernetes.docx
@@ -851,6 +851,735 @@
       </w:pPr>
     </w:p>
     <w:p>
+      <w:pPr>
+        <w:pStyle w:val="Heading1"/>
+        <w:spacing w:after="80"/>
+      </w:pPr>
+      <w:r>
+        <w:t>Material del laboratorio</w:t>
+      </w:r>
+    </w:p>
+    <w:p>
+      <w:pPr>
+        <w:spacing w:after="120"/>
+        <w:jc w:val="both"/>
+      </w:pPr>
+      <w:r>
+        <w:t xml:space="preserve">Todo el material vive en un repositorio público de GitHub:</w:t>
+      </w:r>
+    </w:p>
+    <w:tbl>
+      <w:tblPr>
+        <w:tblStyle w:val="TableGrid"/>
+        <w:tblW w:w="8829" w:type="dxa"/>
+        <w:tblBorders>
+          <w:top w:val="nil"/>
+          <w:left w:val="nil"/>
+          <w:bottom w:val="nil"/>
+          <w:right w:val="nil"/>
+          <w:insideH w:val="nil"/>
+          <w:insideV w:val="nil"/>
+        </w:tblBorders>
+        <w:tblLayout w:type="fixed"/>
+        <w:tblCellMar>
+          <w:top w:w="100" w:type="dxa"/>
+          <w:left w:w="140" w:type="dxa"/>
+          <w:bottom w:w="100" w:type="dxa"/>
+          <w:right w:w="140" w:type="dxa"/>
+        </w:tblCellMar>
+        <w:tblLook w:val="0600" w:firstRow="0" w:lastRow="0" w:firstColumn="0" w:lastColumn="0" w:noHBand="1" w:noVBand="1"/>
+      </w:tblPr>
+      <w:tblGrid>
+        <w:gridCol w:w="8829"/>
+      </w:tblGrid>
+      <w:tr>
+        <w:trPr>
+          <w:cantSplit/>
+        </w:trPr>
+        <w:tc>
+          <w:tcPr>
+            <w:tcW w:w="8829" w:type="dxa"/>
+            <w:shd w:val="clear" w:color="auto" w:fill="1E1E1E"/>
+          </w:tcPr>
+          <w:p>
+            <w:pPr>
+              <w:spacing w:after="0" w:line="240" w:lineRule="auto"/>
+            </w:pPr>
+            <w:r>
+              <w:rPr>
+                <w:rFonts w:ascii="Consolas" w:hAnsi="Consolas" w:cs="Courier New"/>
+                <w:color w:val="FFFFFF"/>
+                <w:sz w:val="18"/>
+                <w:szCs w:val="18"/>
+                <w:lang w:val="en-US"/>
+              </w:rPr>
+              <w:t xml:space="preserve">https://github.com/luiscarlosge/laboratorio-kubernetes-minikube</w:t>
+            </w:r>
+          </w:p>
+        </w:tc>
+      </w:tr>
+    </w:tbl>
+    <w:p>
+      <w:pPr>
+        <w:spacing w:after="0" w:line="140" w:lineRule="exact"/>
+      </w:pPr>
+    </w:p>
+    <w:p>
+      <w:pPr>
+        <w:spacing w:after="120"/>
+        <w:jc w:val="both"/>
+      </w:pPr>
+      <w:r>
+        <w:t xml:space="preserve">Los archivos se descargan </w:t>
+      </w:r>
+      <w:r>
+        <w:rPr>
+          <w:b/>
+          <w:bCs/>
+        </w:rPr>
+        <w:t xml:space="preserve">directamente en la máquina virtual</w:t>
+      </w:r>
+      <w:r>
+        <w:t xml:space="preserve">, así que no hace falta copiar nada desde su equipo. El repositorio contiene:</w:t>
+      </w:r>
+    </w:p>
+    <w:tbl>
+      <w:tblPr>
+        <w:tblW w:w="8829" w:type="dxa"/>
+        <w:tblBorders>
+          <w:top w:val="single" w:sz="4" w:space="0" w:color="BFBFBF"/>
+          <w:left w:val="single" w:sz="4" w:space="0" w:color="BFBFBF"/>
+          <w:bottom w:val="single" w:sz="4" w:space="0" w:color="BFBFBF"/>
+          <w:right w:val="single" w:sz="4" w:space="0" w:color="BFBFBF"/>
+          <w:insideH w:val="single" w:sz="4" w:space="0" w:color="BFBFBF"/>
+          <w:insideV w:val="single" w:sz="4" w:space="0" w:color="BFBFBF"/>
+        </w:tblBorders>
+        <w:tblLayout w:type="fixed"/>
+        <w:tblCellMar>
+          <w:top w:w="40" w:type="dxa"/>
+          <w:left w:w="90" w:type="dxa"/>
+          <w:bottom w:w="40" w:type="dxa"/>
+          <w:right w:w="90" w:type="dxa"/>
+        </w:tblCellMar>
+        <w:tblLook w:val="0420" w:firstRow="1" w:lastRow="0" w:firstColumn="0" w:lastColumn="0" w:noHBand="0" w:noVBand="1"/>
+      </w:tblPr>
+      <w:tblGrid>
+        <w:gridCol w:w="2400"/>
+        <w:gridCol w:w="6429"/>
+      </w:tblGrid>
+      <w:tr>
+        <w:trPr>
+          <w:cantSplit/>
+          <w:tblHeader/>
+        </w:trPr>
+        <w:tc>
+          <w:tcPr>
+            <w:tcW w:w="2400" w:type="dxa"/>
+            <w:shd w:val="clear" w:color="auto" w:fill="2E74B5"/>
+            <w:vAlign w:val="center"/>
+          </w:tcPr>
+          <w:p>
+            <w:pPr>
+              <w:spacing w:before="20" w:after="20" w:line="240" w:lineRule="auto"/>
+            </w:pPr>
+            <w:r>
+              <w:rPr>
+                <w:b/>
+                <w:bCs/>
+                <w:color w:val="FFFFFF"/>
+                <w:sz w:val="19"/>
+                <w:szCs w:val="19"/>
+              </w:rPr>
+              <w:t xml:space="preserve">Ruta</w:t>
+            </w:r>
+          </w:p>
+        </w:tc>
+        <w:tc>
+          <w:tcPr>
+            <w:tcW w:w="6429" w:type="dxa"/>
+            <w:shd w:val="clear" w:color="auto" w:fill="2E74B5"/>
+            <w:vAlign w:val="center"/>
+          </w:tcPr>
+          <w:p>
+            <w:pPr>
+              <w:spacing w:before="20" w:after="20" w:line="240" w:lineRule="auto"/>
+            </w:pPr>
+            <w:r>
+              <w:rPr>
+                <w:b/>
+                <w:bCs/>
+                <w:color w:val="FFFFFF"/>
+                <w:sz w:val="19"/>
+                <w:szCs w:val="19"/>
+              </w:rPr>
+              <w:t xml:space="preserve">Qué contiene</w:t>
+            </w:r>
+          </w:p>
+        </w:tc>
+      </w:tr>
+      <w:tr>
+        <w:trPr>
+          <w:cantSplit/>
+        </w:trPr>
+        <w:tc>
+          <w:tcPr>
+            <w:tcW w:w="2400" w:type="dxa"/>
+            <w:shd w:val="clear" w:color="auto" w:fill="FFFFFF"/>
+          </w:tcPr>
+          <w:p>
+            <w:pPr>
+              <w:spacing w:before="20" w:after="20" w:line="252" w:lineRule="auto"/>
+            </w:pPr>
+            <w:r>
+              <w:rPr>
+                <w:rStyle w:val="HTMLCode"/>
+                <w:rFonts w:eastAsiaTheme="minorHAnsi"/>
+                <w:color w:val="E83E8C"/>
+                <w:shd w:val="clear" w:color="auto" w:fill="F9F2F4"/>
+                <w:sz w:val="19"/>
+                <w:szCs w:val="19"/>
+              </w:rPr>
+              <w:t xml:space="preserve">azuredeploy.json</w:t>
+            </w:r>
+          </w:p>
+        </w:tc>
+        <w:tc>
+          <w:tcPr>
+            <w:tcW w:w="6429" w:type="dxa"/>
+            <w:shd w:val="clear" w:color="auto" w:fill="FFFFFF"/>
+          </w:tcPr>
+          <w:p>
+            <w:pPr>
+              <w:spacing w:before="20" w:after="20" w:line="252" w:lineRule="auto"/>
+            </w:pPr>
+            <w:r>
+              <w:rPr>
+                <w:sz w:val="19"/>
+                <w:szCs w:val="19"/>
+              </w:rPr>
+              <w:t xml:space="preserve">Plantilla ARM: VNet, NSG, IP pública con DNS, la VM y el apagado automático</w:t>
+            </w:r>
+          </w:p>
+        </w:tc>
+      </w:tr>
+      <w:tr>
+        <w:trPr>
+          <w:cantSplit/>
+        </w:trPr>
+        <w:tc>
+          <w:tcPr>
+            <w:tcW w:w="2400" w:type="dxa"/>
+            <w:shd w:val="clear" w:color="auto" w:fill="F7F9FC"/>
+          </w:tcPr>
+          <w:p>
+            <w:pPr>
+              <w:spacing w:before="20" w:after="20" w:line="252" w:lineRule="auto"/>
+            </w:pPr>
+            <w:r>
+              <w:rPr>
+                <w:rStyle w:val="HTMLCode"/>
+                <w:rFonts w:eastAsiaTheme="minorHAnsi"/>
+                <w:color w:val="E83E8C"/>
+                <w:shd w:val="clear" w:color="auto" w:fill="F9F2F4"/>
+                <w:sz w:val="19"/>
+                <w:szCs w:val="19"/>
+              </w:rPr>
+              <w:t xml:space="preserve">deploy.sh</w:t>
+            </w:r>
+          </w:p>
+        </w:tc>
+        <w:tc>
+          <w:tcPr>
+            <w:tcW w:w="6429" w:type="dxa"/>
+            <w:shd w:val="clear" w:color="auto" w:fill="F7F9FC"/>
+          </w:tcPr>
+          <w:p>
+            <w:pPr>
+              <w:spacing w:before="20" w:after="20" w:line="252" w:lineRule="auto"/>
+            </w:pPr>
+            <w:r>
+              <w:rPr>
+                <w:sz w:val="19"/>
+                <w:szCs w:val="19"/>
+              </w:rPr>
+              <w:t xml:space="preserve">Despliegue con Azure CLI, como alternativa a crear la VM desde el portal</w:t>
+            </w:r>
+          </w:p>
+        </w:tc>
+      </w:tr>
+      <w:tr>
+        <w:trPr>
+          <w:cantSplit/>
+        </w:trPr>
+        <w:tc>
+          <w:tcPr>
+            <w:tcW w:w="2400" w:type="dxa"/>
+            <w:shd w:val="clear" w:color="auto" w:fill="FFFFFF"/>
+          </w:tcPr>
+          <w:p>
+            <w:pPr>
+              <w:spacing w:before="20" w:after="20" w:line="252" w:lineRule="auto"/>
+            </w:pPr>
+            <w:r>
+              <w:rPr>
+                <w:rStyle w:val="HTMLCode"/>
+                <w:rFonts w:eastAsiaTheme="minorHAnsi"/>
+                <w:color w:val="E83E8C"/>
+                <w:shd w:val="clear" w:color="auto" w:fill="F9F2F4"/>
+                <w:sz w:val="19"/>
+                <w:szCs w:val="19"/>
+              </w:rPr>
+              <w:t xml:space="preserve">install-minikube.sh</w:t>
+            </w:r>
+          </w:p>
+        </w:tc>
+        <w:tc>
+          <w:tcPr>
+            <w:tcW w:w="6429" w:type="dxa"/>
+            <w:shd w:val="clear" w:color="auto" w:fill="FFFFFF"/>
+          </w:tcPr>
+          <w:p>
+            <w:pPr>
+              <w:spacing w:before="20" w:after="20" w:line="252" w:lineRule="auto"/>
+            </w:pPr>
+            <w:r>
+              <w:rPr>
+                <w:sz w:val="19"/>
+                <w:szCs w:val="19"/>
+              </w:rPr>
+              <w:t xml:space="preserve">Instalador que corre en la VM: Docker, </w:t>
+            </w:r>
+            <w:r>
+              <w:rPr>
+                <w:rStyle w:val="HTMLCode"/>
+                <w:rFonts w:eastAsiaTheme="minorHAnsi"/>
+                <w:color w:val="E83E8C"/>
+                <w:shd w:val="clear" w:color="auto" w:fill="F9F2F4"/>
+                <w:sz w:val="19"/>
+                <w:szCs w:val="19"/>
+              </w:rPr>
+              <w:t xml:space="preserve">kubectl</w:t>
+            </w:r>
+            <w:r>
+              <w:rPr>
+                <w:sz w:val="19"/>
+                <w:szCs w:val="19"/>
+              </w:rPr>
+              <w:t xml:space="preserve">, minikube y los servicios de systemd que publican los NodePort</w:t>
+            </w:r>
+          </w:p>
+        </w:tc>
+      </w:tr>
+      <w:tr>
+        <w:trPr>
+          <w:cantSplit/>
+        </w:trPr>
+        <w:tc>
+          <w:tcPr>
+            <w:tcW w:w="2400" w:type="dxa"/>
+            <w:shd w:val="clear" w:color="auto" w:fill="F7F9FC"/>
+          </w:tcPr>
+          <w:p>
+            <w:pPr>
+              <w:spacing w:before="20" w:after="20" w:line="252" w:lineRule="auto"/>
+            </w:pPr>
+            <w:r>
+              <w:rPr>
+                <w:rStyle w:val="HTMLCode"/>
+                <w:rFonts w:eastAsiaTheme="minorHAnsi"/>
+                <w:color w:val="E83E8C"/>
+                <w:shd w:val="clear" w:color="auto" w:fill="F9F2F4"/>
+                <w:sz w:val="19"/>
+                <w:szCs w:val="19"/>
+              </w:rPr>
+              <w:t xml:space="preserve">app-guia/</w:t>
+            </w:r>
+          </w:p>
+        </w:tc>
+        <w:tc>
+          <w:tcPr>
+            <w:tcW w:w="6429" w:type="dxa"/>
+            <w:shd w:val="clear" w:color="auto" w:fill="F7F9FC"/>
+          </w:tcPr>
+          <w:p>
+            <w:pPr>
+              <w:spacing w:before="20" w:after="20" w:line="252" w:lineRule="auto"/>
+            </w:pPr>
+            <w:r>
+              <w:rPr>
+                <w:sz w:val="19"/>
+                <w:szCs w:val="19"/>
+              </w:rPr>
+              <w:t xml:space="preserve">Imagen del contenedor con la guía interactiva: </w:t>
+            </w:r>
+            <w:r>
+              <w:rPr>
+                <w:rStyle w:val="HTMLCode"/>
+                <w:rFonts w:eastAsiaTheme="minorHAnsi"/>
+                <w:color w:val="E83E8C"/>
+                <w:shd w:val="clear" w:color="auto" w:fill="F9F2F4"/>
+                <w:sz w:val="19"/>
+                <w:szCs w:val="19"/>
+              </w:rPr>
+              <w:t xml:space="preserve">Dockerfile</w:t>
+            </w:r>
+            <w:r>
+              <w:rPr>
+                <w:sz w:val="19"/>
+                <w:szCs w:val="19"/>
+              </w:rPr>
+              <w:t xml:space="preserve">, </w:t>
+            </w:r>
+            <w:r>
+              <w:rPr>
+                <w:rStyle w:val="HTMLCode"/>
+                <w:rFonts w:eastAsiaTheme="minorHAnsi"/>
+                <w:color w:val="E83E8C"/>
+                <w:shd w:val="clear" w:color="auto" w:fill="F9F2F4"/>
+                <w:sz w:val="19"/>
+                <w:szCs w:val="19"/>
+              </w:rPr>
+              <w:t xml:space="preserve">index.html</w:t>
+            </w:r>
+            <w:r>
+              <w:rPr>
+                <w:sz w:val="19"/>
+                <w:szCs w:val="19"/>
+              </w:rPr>
+              <w:t xml:space="preserve"> y el script que publica la identidad del Pod</w:t>
+            </w:r>
+          </w:p>
+        </w:tc>
+      </w:tr>
+      <w:tr>
+        <w:trPr>
+          <w:cantSplit/>
+        </w:trPr>
+        <w:tc>
+          <w:tcPr>
+            <w:tcW w:w="2400" w:type="dxa"/>
+            <w:shd w:val="clear" w:color="auto" w:fill="FFFFFF"/>
+          </w:tcPr>
+          <w:p>
+            <w:pPr>
+              <w:spacing w:before="20" w:after="20" w:line="252" w:lineRule="auto"/>
+            </w:pPr>
+            <w:r>
+              <w:rPr>
+                <w:rStyle w:val="HTMLCode"/>
+                <w:rFonts w:eastAsiaTheme="minorHAnsi"/>
+                <w:color w:val="E83E8C"/>
+                <w:shd w:val="clear" w:color="auto" w:fill="F9F2F4"/>
+                <w:sz w:val="19"/>
+                <w:szCs w:val="19"/>
+              </w:rPr>
+              <w:t xml:space="preserve">app-portal/</w:t>
+            </w:r>
+          </w:p>
+        </w:tc>
+        <w:tc>
+          <w:tcPr>
+            <w:tcW w:w="6429" w:type="dxa"/>
+            <w:shd w:val="clear" w:color="auto" w:fill="FFFFFF"/>
+          </w:tcPr>
+          <w:p>
+            <w:pPr>
+              <w:spacing w:before="20" w:after="20" w:line="252" w:lineRule="auto"/>
+            </w:pPr>
+            <w:r>
+              <w:rPr>
+                <w:sz w:val="19"/>
+                <w:szCs w:val="19"/>
+              </w:rPr>
+              <w:t xml:space="preserve">Imagen del portal que construye el estudiante, con el </w:t>
+            </w:r>
+            <w:r>
+              <w:rPr>
+                <w:rStyle w:val="HTMLCode"/>
+                <w:rFonts w:eastAsiaTheme="minorHAnsi"/>
+                <w:color w:val="E83E8C"/>
+                <w:shd w:val="clear" w:color="auto" w:fill="F9F2F4"/>
+                <w:sz w:val="19"/>
+                <w:szCs w:val="19"/>
+              </w:rPr>
+              <w:t xml:space="preserve">Dockerfile</w:t>
+            </w:r>
+            <w:r>
+              <w:rPr>
+                <w:sz w:val="19"/>
+                <w:szCs w:val="19"/>
+              </w:rPr>
+              <w:t xml:space="preserve"> comentado línea por línea</w:t>
+            </w:r>
+          </w:p>
+        </w:tc>
+      </w:tr>
+      <w:tr>
+        <w:trPr>
+          <w:cantSplit/>
+        </w:trPr>
+        <w:tc>
+          <w:tcPr>
+            <w:tcW w:w="2400" w:type="dxa"/>
+            <w:shd w:val="clear" w:color="auto" w:fill="F7F9FC"/>
+          </w:tcPr>
+          <w:p>
+            <w:pPr>
+              <w:spacing w:before="20" w:after="20" w:line="252" w:lineRule="auto"/>
+            </w:pPr>
+            <w:r>
+              <w:rPr>
+                <w:rStyle w:val="HTMLCode"/>
+                <w:rFonts w:eastAsiaTheme="minorHAnsi"/>
+                <w:color w:val="E83E8C"/>
+                <w:shd w:val="clear" w:color="auto" w:fill="F9F2F4"/>
+                <w:sz w:val="19"/>
+                <w:szCs w:val="19"/>
+              </w:rPr>
+              <w:t xml:space="preserve">manifests/</w:t>
+            </w:r>
+          </w:p>
+        </w:tc>
+        <w:tc>
+          <w:tcPr>
+            <w:tcW w:w="6429" w:type="dxa"/>
+            <w:shd w:val="clear" w:color="auto" w:fill="F7F9FC"/>
+          </w:tcPr>
+          <w:p>
+            <w:pPr>
+              <w:spacing w:before="20" w:after="20" w:line="252" w:lineRule="auto"/>
+            </w:pPr>
+            <w:r>
+              <w:rPr>
+                <w:sz w:val="19"/>
+                <w:szCs w:val="19"/>
+              </w:rPr>
+              <w:t xml:space="preserve">Namespaces, Deployments, Services de tipo NodePort, RBAC, Ingress y Dashboard</w:t>
+            </w:r>
+          </w:p>
+        </w:tc>
+      </w:tr>
+      <w:tr>
+        <w:trPr>
+          <w:cantSplit/>
+        </w:trPr>
+        <w:tc>
+          <w:tcPr>
+            <w:tcW w:w="2400" w:type="dxa"/>
+            <w:shd w:val="clear" w:color="auto" w:fill="FFFFFF"/>
+          </w:tcPr>
+          <w:p>
+            <w:pPr>
+              <w:spacing w:before="20" w:after="20" w:line="252" w:lineRule="auto"/>
+            </w:pPr>
+            <w:r>
+              <w:rPr>
+                <w:rStyle w:val="HTMLCode"/>
+                <w:rFonts w:eastAsiaTheme="minorHAnsi"/>
+                <w:color w:val="E83E8C"/>
+                <w:shd w:val="clear" w:color="auto" w:fill="F9F2F4"/>
+                <w:sz w:val="19"/>
+                <w:szCs w:val="19"/>
+              </w:rPr>
+              <w:t xml:space="preserve">scripts/limpiar.sh</w:t>
+            </w:r>
+          </w:p>
+        </w:tc>
+        <w:tc>
+          <w:tcPr>
+            <w:tcW w:w="6429" w:type="dxa"/>
+            <w:shd w:val="clear" w:color="auto" w:fill="FFFFFF"/>
+          </w:tcPr>
+          <w:p>
+            <w:pPr>
+              <w:spacing w:before="20" w:after="20" w:line="252" w:lineRule="auto"/>
+            </w:pPr>
+            <w:r>
+              <w:rPr>
+                <w:sz w:val="19"/>
+                <w:szCs w:val="19"/>
+              </w:rPr>
+              <w:t xml:space="preserve">Deshace el laboratorio dentro de la máquina virtual</w:t>
+            </w:r>
+          </w:p>
+        </w:tc>
+      </w:tr>
+      <w:tr>
+        <w:trPr>
+          <w:cantSplit/>
+        </w:trPr>
+        <w:tc>
+          <w:tcPr>
+            <w:tcW w:w="2400" w:type="dxa"/>
+            <w:shd w:val="clear" w:color="auto" w:fill="F7F9FC"/>
+          </w:tcPr>
+          <w:p>
+            <w:pPr>
+              <w:spacing w:before="20" w:after="20" w:line="252" w:lineRule="auto"/>
+            </w:pPr>
+            <w:r>
+              <w:rPr>
+                <w:rStyle w:val="HTMLCode"/>
+                <w:rFonts w:eastAsiaTheme="minorHAnsi"/>
+                <w:color w:val="E83E8C"/>
+                <w:shd w:val="clear" w:color="auto" w:fill="F9F2F4"/>
+                <w:sz w:val="19"/>
+                <w:szCs w:val="19"/>
+              </w:rPr>
+              <w:t xml:space="preserve">diagramas/</w:t>
+            </w:r>
+          </w:p>
+        </w:tc>
+        <w:tc>
+          <w:tcPr>
+            <w:tcW w:w="6429" w:type="dxa"/>
+            <w:shd w:val="clear" w:color="auto" w:fill="F7F9FC"/>
+          </w:tcPr>
+          <w:p>
+            <w:pPr>
+              <w:spacing w:before="20" w:after="20" w:line="252" w:lineRule="auto"/>
+            </w:pPr>
+            <w:r>
+              <w:rPr>
+                <w:sz w:val="19"/>
+                <w:szCs w:val="19"/>
+              </w:rPr>
+              <w:t xml:space="preserve">Las figuras de este documento, en PNG y SVG</w:t>
+            </w:r>
+          </w:p>
+        </w:tc>
+      </w:tr>
+      <w:tr>
+        <w:trPr>
+          <w:cantSplit/>
+        </w:trPr>
+        <w:tc>
+          <w:tcPr>
+            <w:tcW w:w="2400" w:type="dxa"/>
+            <w:shd w:val="clear" w:color="auto" w:fill="FFFFFF"/>
+          </w:tcPr>
+          <w:p>
+            <w:pPr>
+              <w:spacing w:before="20" w:after="20" w:line="252" w:lineRule="auto"/>
+            </w:pPr>
+            <w:r>
+              <w:rPr>
+                <w:rStyle w:val="HTMLCode"/>
+                <w:rFonts w:eastAsiaTheme="minorHAnsi"/>
+                <w:color w:val="E83E8C"/>
+                <w:shd w:val="clear" w:color="auto" w:fill="F9F2F4"/>
+                <w:sz w:val="19"/>
+                <w:szCs w:val="19"/>
+              </w:rPr>
+              <w:t xml:space="preserve">GUIA-LABORATORIO.md</w:t>
+            </w:r>
+          </w:p>
+        </w:tc>
+        <w:tc>
+          <w:tcPr>
+            <w:tcW w:w="6429" w:type="dxa"/>
+            <w:shd w:val="clear" w:color="auto" w:fill="FFFFFF"/>
+          </w:tcPr>
+          <w:p>
+            <w:pPr>
+              <w:spacing w:before="20" w:after="20" w:line="252" w:lineRule="auto"/>
+            </w:pPr>
+            <w:r>
+              <w:rPr>
+                <w:sz w:val="19"/>
+                <w:szCs w:val="19"/>
+              </w:rPr>
+              <w:t xml:space="preserve">Versión en Markdown de esta guía, para consultar desde la consola</w:t>
+            </w:r>
+          </w:p>
+        </w:tc>
+      </w:tr>
+    </w:tbl>
+    <w:p>
+      <w:pPr>
+        <w:spacing w:after="0" w:line="140" w:lineRule="exact"/>
+      </w:pPr>
+    </w:p>
+    <w:tbl>
+      <w:tblPr>
+        <w:tblW w:w="8829" w:type="dxa"/>
+        <w:tblBorders>
+          <w:top w:val="nil"/>
+          <w:left w:val="single" w:sz="36" w:space="0" w:color="2E74B5"/>
+          <w:bottom w:val="nil"/>
+          <w:right w:val="nil"/>
+          <w:insideH w:val="nil"/>
+          <w:insideV w:val="nil"/>
+        </w:tblBorders>
+        <w:tblLayout w:type="fixed"/>
+        <w:tblCellMar>
+          <w:top w:w="90" w:type="dxa"/>
+          <w:left w:w="180" w:type="dxa"/>
+          <w:bottom w:w="90" w:type="dxa"/>
+          <w:right w:w="140" w:type="dxa"/>
+        </w:tblCellMar>
+        <w:tblLook w:val="0600" w:firstRow="0" w:lastRow="0" w:firstColumn="0" w:lastColumn="0" w:noHBand="1" w:noVBand="1"/>
+      </w:tblPr>
+      <w:tblGrid>
+        <w:gridCol w:w="8829"/>
+      </w:tblGrid>
+      <w:tr>
+        <w:trPr>
+          <w:cantSplit/>
+        </w:trPr>
+        <w:tc>
+          <w:tcPr>
+            <w:tcW w:w="8829" w:type="dxa"/>
+            <w:shd w:val="clear" w:color="auto" w:fill="EAF2FB"/>
+          </w:tcPr>
+          <w:p>
+            <w:pPr>
+              <w:spacing w:before="30" w:after="30" w:line="252" w:lineRule="auto"/>
+              <w:jc w:val="both"/>
+            </w:pPr>
+            <w:r>
+              <w:rPr>
+                <w:b/>
+                <w:bCs/>
+                <w:color w:val="2E74B5"/>
+              </w:rPr>
+              <w:t xml:space="preserve">Correcciones y trabajo propio. </w:t>
+            </w:r>
+            <w:r>
+              <w:t xml:space="preserve">Si durante el semestre se publica una corrección, basta con ejecutar </w:t>
+            </w:r>
+            <w:r>
+              <w:rPr>
+                <w:rStyle w:val="HTMLCode"/>
+                <w:rFonts w:eastAsiaTheme="minorHAnsi"/>
+                <w:color w:val="E83E8C"/>
+                <w:shd w:val="clear" w:color="auto" w:fill="F9F2F4"/>
+              </w:rPr>
+              <w:t xml:space="preserve">git pull</w:t>
+            </w:r>
+            <w:r>
+              <w:t xml:space="preserve"> dentro de la carpeta clonada; no hay que volver a crear la máquina virtual. Y si quiere versionar sus propios cambios —su portal personalizado, su manifiesto de Service—, haga un </w:t>
+            </w:r>
+            <w:r>
+              <w:rPr>
+                <w:i/>
+                <w:iCs/>
+              </w:rPr>
+              <w:t xml:space="preserve">fork</w:t>
+            </w:r>
+            <w:r>
+              <w:t xml:space="preserve"> del repositorio a su cuenta y clone ese fork en lugar del original.</w:t>
+            </w:r>
+          </w:p>
+        </w:tc>
+      </w:tr>
+    </w:tbl>
+    <w:p>
+      <w:pPr>
+        <w:spacing w:after="0" w:line="140" w:lineRule="exact"/>
+      </w:pPr>
+    </w:p>
+    <w:p>
       <w:r>
         <w:br w:type="page"/>
       </w:r>
@@ -6307,7 +7036,7 @@
         <w:spacing w:before="200" w:after="60"/>
       </w:pPr>
       <w:r>
-        <w:t>Parte 1. Instalar el clúster</w:t>
+        <w:t>Parte 1. Clonar el repositorio e instalar el clúster</w:t>
       </w:r>
     </w:p>
     <w:p>
@@ -6316,7 +7045,7 @@
         <w:jc w:val="both"/>
       </w:pPr>
       <w:r>
-        <w:t xml:space="preserve">Copie el paquete del laboratorio a la máquina y ejecute el instalador. Reemplace </w:t>
+        <w:t xml:space="preserve">Conéctese a la máquina virtual por SSH. Reemplace </w:t>
       </w:r>
       <w:r>
         <w:rPr>
@@ -6340,7 +7069,7 @@
         <w:t xml:space="preserve">azureuser</w:t>
       </w:r>
       <w:r>
-        <w:t xml:space="preserve"> por el usuario administrador que haya definido.</w:t>
+        <w:t xml:space="preserve"> por el usuario administrador que haya definido al crearla.</w:t>
       </w:r>
     </w:p>
     <w:tbl>
@@ -6388,37 +7117,7 @@
                 <w:szCs w:val="18"/>
                 <w:lang w:val="en-US"/>
               </w:rPr>
-              <w:t xml:space="preserve">scp -r k8s-lab-minikube azureuser@FQDN:~/</w:t>
-            </w:r>
-          </w:p>
-          <w:p>
-            <w:pPr>
-              <w:spacing w:after="0" w:line="240" w:lineRule="auto"/>
-            </w:pPr>
-            <w:r>
-              <w:rPr>
-                <w:rFonts w:ascii="Consolas" w:hAnsi="Consolas" w:cs="Courier New"/>
-                <w:color w:val="FFFFFF"/>
-                <w:sz w:val="18"/>
-                <w:szCs w:val="18"/>
-                <w:lang w:val="en-US"/>
-              </w:rPr>
               <w:t xml:space="preserve">ssh azureuser@FQDN</w:t>
-            </w:r>
-          </w:p>
-          <w:p>
-            <w:pPr>
-              <w:spacing w:after="0" w:line="240" w:lineRule="auto"/>
-            </w:pPr>
-            <w:r>
-              <w:rPr>
-                <w:rFonts w:ascii="Consolas" w:hAnsi="Consolas" w:cs="Courier New"/>
-                <w:color w:val="FFFFFF"/>
-                <w:sz w:val="18"/>
-                <w:szCs w:val="18"/>
-                <w:lang w:val="en-US"/>
-              </w:rPr>
-              <w:t xml:space="preserve">sudo bash ~/k8s-lab-minikube/install-minikube.sh</w:t>
             </w:r>
           </w:p>
         </w:tc>
@@ -6435,7 +7134,7 @@
         <w:jc w:val="both"/>
       </w:pPr>
       <w:r>
-        <w:t xml:space="preserve">El script tarda entre 5 y 10 minutos. Instala Docker, </w:t>
+        <w:t xml:space="preserve">Ya dentro de la máquina, clone el repositorio del laboratorio en su directorio personal. Ubuntu Server 24.04 trae </w:t>
       </w:r>
       <w:r>
         <w:rPr>
@@ -6444,225 +7143,10 @@
           <w:color w:val="E83E8C"/>
           <w:shd w:val="clear" w:color="auto" w:fill="F9F2F4"/>
         </w:rPr>
-        <w:t xml:space="preserve">kubectl</w:t>
-      </w:r>
-      <w:r>
-        <w:t xml:space="preserve"> y minikube; arranca el clúster con el controlador </w:t>
-      </w:r>
-      <w:r>
-        <w:rPr>
-          <w:rStyle w:val="HTMLCode"/>
-          <w:rFonts w:eastAsiaTheme="minorHAnsi"/>
-          <w:color w:val="E83E8C"/>
-          <w:shd w:val="clear" w:color="auto" w:fill="F9F2F4"/>
-        </w:rPr>
-        <w:t xml:space="preserve">docker</w:t>
-      </w:r>
-      <w:r>
-        <w:t xml:space="preserve"> y el runtime </w:t>
-      </w:r>
-      <w:r>
-        <w:rPr>
-          <w:rStyle w:val="HTMLCode"/>
-          <w:rFonts w:eastAsiaTheme="minorHAnsi"/>
-          <w:color w:val="E83E8C"/>
-          <w:shd w:val="clear" w:color="auto" w:fill="F9F2F4"/>
-        </w:rPr>
-        <w:t xml:space="preserve">containerd</w:t>
-      </w:r>
-      <w:r>
-        <w:t xml:space="preserve">; habilita los complementos </w:t>
-      </w:r>
-      <w:r>
-        <w:rPr>
-          <w:rStyle w:val="HTMLCode"/>
-          <w:rFonts w:eastAsiaTheme="minorHAnsi"/>
-          <w:color w:val="E83E8C"/>
-          <w:shd w:val="clear" w:color="auto" w:fill="F9F2F4"/>
-        </w:rPr>
-        <w:t xml:space="preserve">metrics-server</w:t>
-      </w:r>
-      <w:r>
-        <w:t xml:space="preserve">, </w:t>
-      </w:r>
-      <w:r>
-        <w:rPr>
-          <w:rStyle w:val="HTMLCode"/>
-          <w:rFonts w:eastAsiaTheme="minorHAnsi"/>
-          <w:color w:val="E83E8C"/>
-          <w:shd w:val="clear" w:color="auto" w:fill="F9F2F4"/>
-        </w:rPr>
-        <w:t xml:space="preserve">dashboard</w:t>
-      </w:r>
-      <w:r>
-        <w:t xml:space="preserve"> e </w:t>
-      </w:r>
-      <w:r>
-        <w:rPr>
-          <w:rStyle w:val="HTMLCode"/>
-          <w:rFonts w:eastAsiaTheme="minorHAnsi"/>
-          <w:color w:val="E83E8C"/>
-          <w:shd w:val="clear" w:color="auto" w:fill="F9F2F4"/>
-        </w:rPr>
-        <w:t xml:space="preserve">ingress</w:t>
-      </w:r>
-      <w:r>
-        <w:t xml:space="preserve">; y crea dos servicios de systemd:</w:t>
-      </w:r>
-    </w:p>
-    <w:p>
-      <w:pPr>
-        <w:pStyle w:val="ListParagraph"/>
-        <w:numPr>
-          <w:ilvl w:val="0"/>
-          <w:numId w:val="3"/>
-        </w:numPr>
-        <w:spacing w:after="80"/>
-        <w:jc w:val="both"/>
-      </w:pPr>
-      <w:r>
-        <w:rPr>
-          <w:rStyle w:val="HTMLCode"/>
-          <w:rFonts w:eastAsiaTheme="minorHAnsi"/>
-          <w:color w:val="E83E8C"/>
-          <w:shd w:val="clear" w:color="auto" w:fill="F9F2F4"/>
-        </w:rPr>
-        <w:t xml:space="preserve">minikube.service</w:t>
-      </w:r>
-      <w:r>
-        <w:t xml:space="preserve">, que vuelve a levantar el clúster después de un reinicio de la máquina virtual.</w:t>
-      </w:r>
-    </w:p>
-    <w:p>
-      <w:pPr>
-        <w:pStyle w:val="ListParagraph"/>
-        <w:numPr>
-          <w:ilvl w:val="0"/>
-          <w:numId w:val="3"/>
-        </w:numPr>
-        <w:spacing w:after="80"/>
-        <w:jc w:val="both"/>
-      </w:pPr>
-      <w:r>
-        <w:rPr>
-          <w:rStyle w:val="HTMLCode"/>
-          <w:rFonts w:eastAsiaTheme="minorHAnsi"/>
-          <w:color w:val="E83E8C"/>
-          <w:shd w:val="clear" w:color="auto" w:fill="F9F2F4"/>
-        </w:rPr>
-        <w:t xml:space="preserve">minikube-expose@PUERTO.service</w:t>
-      </w:r>
-      <w:r>
-        <w:t xml:space="preserve">, que publica un NodePort en todas las interfaces de la máquina. Queda activo para los puertos 30080, 30081 y 30090.</w:t>
-      </w:r>
-    </w:p>
-    <w:p>
-      <w:pPr>
-        <w:spacing w:after="120"/>
-        <w:jc w:val="both"/>
-      </w:pPr>
-      <w:r>
-        <w:t xml:space="preserve">Al terminar, el material del laboratorio queda en </w:t>
-      </w:r>
-      <w:r>
-        <w:rPr>
-          <w:rStyle w:val="HTMLCode"/>
-          <w:rFonts w:eastAsiaTheme="minorHAnsi"/>
-          <w:color w:val="E83E8C"/>
-          <w:shd w:val="clear" w:color="auto" w:fill="F9F2F4"/>
-        </w:rPr>
-        <w:t xml:space="preserve">~/lab</w:t>
-      </w:r>
-      <w:r>
-        <w:t xml:space="preserve"> (</w:t>
-      </w:r>
-      <w:r>
-        <w:rPr>
-          <w:rStyle w:val="HTMLCode"/>
-          <w:rFonts w:eastAsiaTheme="minorHAnsi"/>
-          <w:color w:val="E83E8C"/>
-          <w:shd w:val="clear" w:color="auto" w:fill="F9F2F4"/>
-        </w:rPr>
-        <w:t xml:space="preserve">app-guia/</w:t>
-      </w:r>
-      <w:r>
-        <w:t xml:space="preserve">, </w:t>
-      </w:r>
-      <w:r>
-        <w:rPr>
-          <w:rStyle w:val="HTMLCode"/>
-          <w:rFonts w:eastAsiaTheme="minorHAnsi"/>
-          <w:color w:val="E83E8C"/>
-          <w:shd w:val="clear" w:color="auto" w:fill="F9F2F4"/>
-        </w:rPr>
-        <w:t xml:space="preserve">app-portal/</w:t>
-      </w:r>
-      <w:r>
-        <w:t xml:space="preserve">, </w:t>
-      </w:r>
-      <w:r>
-        <w:rPr>
-          <w:rStyle w:val="HTMLCode"/>
-          <w:rFonts w:eastAsiaTheme="minorHAnsi"/>
-          <w:color w:val="E83E8C"/>
-          <w:shd w:val="clear" w:color="auto" w:fill="F9F2F4"/>
-        </w:rPr>
-        <w:t xml:space="preserve">manifests/</w:t>
-      </w:r>
-      <w:r>
-        <w:t xml:space="preserve"> y </w:t>
-      </w:r>
-      <w:r>
-        <w:rPr>
-          <w:rStyle w:val="HTMLCode"/>
-          <w:rFonts w:eastAsiaTheme="minorHAnsi"/>
-          <w:color w:val="E83E8C"/>
-          <w:shd w:val="clear" w:color="auto" w:fill="F9F2F4"/>
-        </w:rPr>
-        <w:t xml:space="preserve">scripts/</w:t>
-      </w:r>
-      <w:r>
-        <w:t xml:space="preserve">), que es la ruta que usan los comandos de aquí en adelante. </w:t>
-      </w:r>
-      <w:r>
-        <w:rPr>
-          <w:b/>
-          <w:bCs/>
-        </w:rPr>
-        <w:t xml:space="preserve">Cierre la sesión SSH y vuelva a entrar</w:t>
-      </w:r>
-      <w:r>
-        <w:t xml:space="preserve">, para que su usuario quede efectivamente en el grupo </w:t>
-      </w:r>
-      <w:r>
-        <w:rPr>
-          <w:rStyle w:val="HTMLCode"/>
-          <w:rFonts w:eastAsiaTheme="minorHAnsi"/>
-          <w:color w:val="E83E8C"/>
-          <w:shd w:val="clear" w:color="auto" w:fill="F9F2F4"/>
-        </w:rPr>
-        <w:t xml:space="preserve">docker</w:t>
-      </w:r>
-      <w:r>
-        <w:t xml:space="preserve">.</w:t>
-      </w:r>
-    </w:p>
-    <w:p>
-      <w:pPr>
-        <w:pStyle w:val="Heading2"/>
-        <w:spacing w:before="200" w:after="60"/>
-      </w:pPr>
-      <w:r>
-        <w:t>Parte 2. Reconocer el clúster</w:t>
-      </w:r>
-    </w:p>
-    <w:p>
-      <w:pPr>
-        <w:spacing w:after="120"/>
-        <w:jc w:val="both"/>
-      </w:pPr>
-      <w:r>
-        <w:t xml:space="preserve">Antes de desplegar nada, mire lo que ya está corriendo.</w:t>
+        <w:t xml:space="preserve">git</w:t>
+      </w:r>
+      <w:r>
+        <w:t xml:space="preserve">, pero conviene asegurarse:</w:t>
       </w:r>
     </w:p>
     <w:tbl>
@@ -6710,7 +7194,7 @@
                 <w:szCs w:val="18"/>
                 <w:lang w:val="en-US"/>
               </w:rPr>
-              <w:t xml:space="preserve">kubectl get nodes -o wide</w:t>
+              <w:t xml:space="preserve">sudo apt-get update</w:t>
             </w:r>
           </w:p>
           <w:p>
@@ -6725,7 +7209,19 @@
                 <w:szCs w:val="18"/>
                 <w:lang w:val="en-US"/>
               </w:rPr>
-              <w:t xml:space="preserve">kubectl get pods -n kube-system</w:t>
+              <w:t xml:space="preserve">sudo apt-get install -y git</w:t>
+            </w:r>
+          </w:p>
+          <w:p>
+            <w:pPr>
+              <w:spacing w:after="0" w:line="240" w:lineRule="auto"/>
+            </w:pPr>
+            <w:r>
+              <w:rPr>
+                <w:rFonts w:ascii="Consolas" w:hAnsi="Consolas"/>
+                <w:sz w:val="18"/>
+              </w:rPr>
+              <w:t xml:space="preserve"> </w:t>
             </w:r>
           </w:p>
           <w:p>
@@ -6740,7 +7236,7 @@
                 <w:szCs w:val="18"/>
                 <w:lang w:val="en-US"/>
               </w:rPr>
-              <w:t xml:space="preserve">kubectl cluster-info</w:t>
+              <w:t xml:space="preserve">git clone https://github.com/luiscarlosge/laboratorio-kubernetes-minikube.git</w:t>
             </w:r>
           </w:p>
           <w:p>
@@ -6755,17 +7251,22 @@
                 <w:szCs w:val="18"/>
                 <w:lang w:val="en-US"/>
               </w:rPr>
-              <w:t xml:space="preserve">minikube ip</w:t>
-            </w:r>
+              <w:t xml:space="preserve">cd laboratorio-kubernetes-minikube</w:t>
+            </w:r>
+          </w:p>
+          <w:p>
+            <w:pPr>
+              <w:spacing w:after="0" w:line="240" w:lineRule="auto"/>
+            </w:pPr>
             <w:r>
               <w:rPr>
                 <w:rFonts w:ascii="Consolas" w:hAnsi="Consolas" w:cs="Courier New"/>
-                <w:color w:val="9AA7B4"/>
+                <w:color w:val="FFFFFF"/>
                 <w:sz w:val="18"/>
                 <w:szCs w:val="18"/>
                 <w:lang w:val="en-US"/>
               </w:rPr>
-              <w:t xml:space="preserve">                 # la IP interna del nodo: 192.168.49.2</w:t>
+              <w:t xml:space="preserve">ls -la</w:t>
             </w:r>
           </w:p>
         </w:tc>
@@ -6779,10 +7280,11 @@
     <w:p>
       <w:pPr>
         <w:spacing w:after="120"/>
+        <w:ind w:left="720"/>
         <w:jc w:val="both"/>
       </w:pPr>
       <w:r>
-        <w:t xml:space="preserve">El nodo debe aparecer en estado </w:t>
+        <w:t xml:space="preserve">Si prefiere no usar </w:t>
       </w:r>
       <w:r>
         <w:rPr>
@@ -6791,10 +7293,10 @@
           <w:color w:val="E83E8C"/>
           <w:shd w:val="clear" w:color="auto" w:fill="F9F2F4"/>
         </w:rPr>
-        <w:t xml:space="preserve">Ready</w:t>
-      </w:r>
-      <w:r>
-        <w:t xml:space="preserve"> y con el rol </w:t>
+        <w:t xml:space="preserve">git</w:t>
+      </w:r>
+      <w:r>
+        <w:t xml:space="preserve">, descargue el repositorio como archivo comprimido. El resultado es el mismo, pero después no podrá actualizar con </w:t>
       </w:r>
       <w:r>
         <w:rPr>
@@ -6803,18 +7305,20 @@
           <w:color w:val="E83E8C"/>
           <w:shd w:val="clear" w:color="auto" w:fill="F9F2F4"/>
         </w:rPr>
-        <w:t xml:space="preserve">control-plane</w:t>
-      </w:r>
-      <w:r>
-        <w:t xml:space="preserve">. La segunda orden muestra el plano de control completo, cada componente como un Pod dentro del propio clúster.</w:t>
+        <w:t xml:space="preserve">git pull</w:t>
+      </w:r>
+      <w:r>
+        <w:t xml:space="preserve">:</w:t>
       </w:r>
     </w:p>
     <w:tbl>
       <w:tblPr>
-        <w:tblW w:w="8829" w:type="dxa"/>
+        <w:tblStyle w:val="TableGrid"/>
+        <w:tblW w:w="8109" w:type="dxa"/>
+        <w:tblInd w:w="720" w:type="dxa"/>
         <w:tblBorders>
           <w:top w:val="nil"/>
-          <w:left w:val="single" w:sz="36" w:space="0" w:color="6F42C1"/>
+          <w:left w:val="nil"/>
           <w:bottom w:val="nil"/>
           <w:right w:val="nil"/>
           <w:insideH w:val="nil"/>
@@ -6822,15 +7326,15 @@
         </w:tblBorders>
         <w:tblLayout w:type="fixed"/>
         <w:tblCellMar>
-          <w:top w:w="90" w:type="dxa"/>
-          <w:left w:w="180" w:type="dxa"/>
-          <w:bottom w:w="90" w:type="dxa"/>
+          <w:top w:w="100" w:type="dxa"/>
+          <w:left w:w="140" w:type="dxa"/>
+          <w:bottom w:w="100" w:type="dxa"/>
           <w:right w:w="140" w:type="dxa"/>
         </w:tblCellMar>
         <w:tblLook w:val="0600" w:firstRow="0" w:lastRow="0" w:firstColumn="0" w:lastColumn="0" w:noHBand="1" w:noVBand="1"/>
       </w:tblPr>
       <w:tblGrid>
-        <w:gridCol w:w="8829"/>
+        <w:gridCol w:w="8109"/>
       </w:tblGrid>
       <w:tr>
         <w:trPr>
@@ -6838,48 +7342,67 @@
         </w:trPr>
         <w:tc>
           <w:tcPr>
-            <w:tcW w:w="8829" w:type="dxa"/>
-            <w:shd w:val="clear" w:color="auto" w:fill="F3ECFA"/>
-          </w:tcPr>
-          <w:p>
-            <w:pPr>
-              <w:spacing w:before="30" w:after="30" w:line="252" w:lineRule="auto"/>
-              <w:jc w:val="both"/>
-            </w:pPr>
-            <w:r>
-              <w:rPr>
-                <w:b/>
-                <w:bCs/>
-                <w:color w:val="6F42C1"/>
-              </w:rPr>
-              <w:t xml:space="preserve">Pregunta 1. </w:t>
-            </w:r>
-            <w:r>
-              <w:t xml:space="preserve">Ejecute </w:t>
-            </w:r>
-            <w:r>
-              <w:rPr>
-                <w:rStyle w:val="HTMLCode"/>
-                <w:rFonts w:eastAsiaTheme="minorHAnsi"/>
-                <w:color w:val="E83E8C"/>
-                <w:shd w:val="clear" w:color="auto" w:fill="F9F2F4"/>
-              </w:rPr>
-              <w:t xml:space="preserve">kubectl get nodes -o wide</w:t>
-            </w:r>
-            <w:r>
-              <w:t xml:space="preserve"> y </w:t>
-            </w:r>
-            <w:r>
-              <w:rPr>
-                <w:rStyle w:val="HTMLCode"/>
-                <w:rFonts w:eastAsiaTheme="minorHAnsi"/>
-                <w:color w:val="E83E8C"/>
-                <w:shd w:val="clear" w:color="auto" w:fill="F9F2F4"/>
-              </w:rPr>
-              <w:t xml:space="preserve">kubectl get pods -n kube-system</w:t>
-            </w:r>
-            <w:r>
-              <w:t xml:space="preserve">. Enumere los componentes del plano de control que encuentre y explique, para dos de ellos, qué dejaría de funcionar si se detuvieran.</w:t>
+            <w:tcW w:w="8109" w:type="dxa"/>
+            <w:shd w:val="clear" w:color="auto" w:fill="1E1E1E"/>
+          </w:tcPr>
+          <w:p>
+            <w:pPr>
+              <w:spacing w:after="0" w:line="240" w:lineRule="auto"/>
+            </w:pPr>
+            <w:r>
+              <w:rPr>
+                <w:rFonts w:ascii="Consolas" w:hAnsi="Consolas" w:cs="Courier New"/>
+                <w:color w:val="FFFFFF"/>
+                <w:sz w:val="18"/>
+                <w:szCs w:val="18"/>
+                <w:lang w:val="en-US"/>
+              </w:rPr>
+              <w:t xml:space="preserve">sudo apt-get install -y unzip</w:t>
+            </w:r>
+          </w:p>
+          <w:p>
+            <w:pPr>
+              <w:spacing w:after="0" w:line="240" w:lineRule="auto"/>
+            </w:pPr>
+            <w:r>
+              <w:rPr>
+                <w:rFonts w:ascii="Consolas" w:hAnsi="Consolas" w:cs="Courier New"/>
+                <w:color w:val="FFFFFF"/>
+                <w:sz w:val="18"/>
+                <w:szCs w:val="18"/>
+                <w:lang w:val="en-US"/>
+              </w:rPr>
+              <w:t xml:space="preserve">curl -LO https://github.com/luiscarlosge/laboratorio-kubernetes-minikube/archive/refs/heads/main.zip</w:t>
+            </w:r>
+          </w:p>
+          <w:p>
+            <w:pPr>
+              <w:spacing w:after="0" w:line="240" w:lineRule="auto"/>
+            </w:pPr>
+            <w:r>
+              <w:rPr>
+                <w:rFonts w:ascii="Consolas" w:hAnsi="Consolas" w:cs="Courier New"/>
+                <w:color w:val="FFFFFF"/>
+                <w:sz w:val="18"/>
+                <w:szCs w:val="18"/>
+                <w:lang w:val="en-US"/>
+              </w:rPr>
+              <w:t xml:space="preserve">unzip -q main.zip</w:t>
+            </w:r>
+          </w:p>
+          <w:p>
+            <w:pPr>
+              <w:spacing w:after="0" w:line="240" w:lineRule="auto"/>
+            </w:pPr>
+            <w:r>
+              <w:rPr>
+                <w:rFonts w:ascii="Consolas" w:hAnsi="Consolas" w:cs="Courier New"/>
+                <w:color w:val="FFFFFF"/>
+                <w:sz w:val="18"/>
+                <w:szCs w:val="18"/>
+                <w:lang w:val="en-US"/>
+              </w:rPr>
+              <w:t xml:space="preserve">cd laboratorio-kubernetes-minikube-main</w:t>
             </w:r>
           </w:p>
         </w:tc>
@@ -6892,20 +7415,23 @@
     </w:p>
     <w:p>
       <w:pPr>
-        <w:pStyle w:val="Heading2"/>
-        <w:spacing w:before="200" w:after="60"/>
-      </w:pPr>
-      <w:r>
-        <w:t>Parte 3. Construir la imagen de la guía</w:t>
-      </w:r>
-    </w:p>
-    <w:p>
-      <w:pPr>
         <w:spacing w:after="120"/>
         <w:jc w:val="both"/>
       </w:pPr>
       <w:r>
-        <w:t xml:space="preserve">Revise primero el contexto de construcción: son cuatro archivos y todos terminan dentro de la imagen.</w:t>
+        <w:t xml:space="preserve">Ejecute ahora el instalador. Se ejecuta con </w:t>
+      </w:r>
+      <w:r>
+        <w:rPr>
+          <w:rStyle w:val="HTMLCode"/>
+          <w:rFonts w:eastAsiaTheme="minorHAnsi"/>
+          <w:color w:val="E83E8C"/>
+          <w:shd w:val="clear" w:color="auto" w:fill="F9F2F4"/>
+        </w:rPr>
+        <w:t xml:space="preserve">sudo</w:t>
+      </w:r>
+      <w:r>
+        <w:t xml:space="preserve"> porque instala paquetes y crea servicios de systemd, pero el clúster queda a nombre de su usuario, no de root.</w:t>
       </w:r>
     </w:p>
     <w:tbl>
@@ -6953,37 +7479,7 @@
                 <w:szCs w:val="18"/>
                 <w:lang w:val="en-US"/>
               </w:rPr>
-              <w:t xml:space="preserve">cd ~/lab/app-guia</w:t>
-            </w:r>
-          </w:p>
-          <w:p>
-            <w:pPr>
-              <w:spacing w:after="0" w:line="240" w:lineRule="auto"/>
-            </w:pPr>
-            <w:r>
-              <w:rPr>
-                <w:rFonts w:ascii="Consolas" w:hAnsi="Consolas" w:cs="Courier New"/>
-                <w:color w:val="FFFFFF"/>
-                <w:sz w:val="18"/>
-                <w:szCs w:val="18"/>
-                <w:lang w:val="en-US"/>
-              </w:rPr>
-              <w:t xml:space="preserve">ls -la</w:t>
-            </w:r>
-          </w:p>
-          <w:p>
-            <w:pPr>
-              <w:spacing w:after="0" w:line="240" w:lineRule="auto"/>
-            </w:pPr>
-            <w:r>
-              <w:rPr>
-                <w:rFonts w:ascii="Consolas" w:hAnsi="Consolas" w:cs="Courier New"/>
-                <w:color w:val="FFFFFF"/>
-                <w:sz w:val="18"/>
-                <w:szCs w:val="18"/>
-                <w:lang w:val="en-US"/>
-              </w:rPr>
-              <w:t xml:space="preserve">cat Dockerfile</w:t>
+              <w:t xml:space="preserve">sudo bash install-minikube.sh</w:t>
             </w:r>
           </w:p>
         </w:tc>
@@ -7000,17 +7496,7 @@
         <w:jc w:val="both"/>
       </w:pPr>
       <w:r>
-        <w:t xml:space="preserve">Pruebe el contenedor </w:t>
-      </w:r>
-      <w:r>
-        <w:rPr>
-          <w:b/>
-          <w:bCs/>
-        </w:rPr>
-        <w:t xml:space="preserve">suelto</w:t>
-      </w:r>
-      <w:r>
-        <w:t xml:space="preserve">, con Docker, antes de entregárselo a Kubernetes. Si algo está mal en la imagen, es mucho más rápido descubrirlo aquí que persiguiendo un Pod en </w:t>
+        <w:t xml:space="preserve">El script tarda entre 5 y 10 minutos. Instala Docker, </w:t>
       </w:r>
       <w:r>
         <w:rPr>
@@ -7019,10 +7505,308 @@
           <w:color w:val="E83E8C"/>
           <w:shd w:val="clear" w:color="auto" w:fill="F9F2F4"/>
         </w:rPr>
-        <w:t xml:space="preserve">CrashLoopBackOff</w:t>
-      </w:r>
-      <w:r>
-        <w:t xml:space="preserve">.</w:t>
+        <w:t xml:space="preserve">kubectl</w:t>
+      </w:r>
+      <w:r>
+        <w:t xml:space="preserve"> y minikube; arranca el clúster con el controlador </w:t>
+      </w:r>
+      <w:r>
+        <w:rPr>
+          <w:rStyle w:val="HTMLCode"/>
+          <w:rFonts w:eastAsiaTheme="minorHAnsi"/>
+          <w:color w:val="E83E8C"/>
+          <w:shd w:val="clear" w:color="auto" w:fill="F9F2F4"/>
+        </w:rPr>
+        <w:t xml:space="preserve">docker</w:t>
+      </w:r>
+      <w:r>
+        <w:t xml:space="preserve"> y el runtime </w:t>
+      </w:r>
+      <w:r>
+        <w:rPr>
+          <w:rStyle w:val="HTMLCode"/>
+          <w:rFonts w:eastAsiaTheme="minorHAnsi"/>
+          <w:color w:val="E83E8C"/>
+          <w:shd w:val="clear" w:color="auto" w:fill="F9F2F4"/>
+        </w:rPr>
+        <w:t xml:space="preserve">containerd</w:t>
+      </w:r>
+      <w:r>
+        <w:t xml:space="preserve">; habilita los complementos </w:t>
+      </w:r>
+      <w:r>
+        <w:rPr>
+          <w:rStyle w:val="HTMLCode"/>
+          <w:rFonts w:eastAsiaTheme="minorHAnsi"/>
+          <w:color w:val="E83E8C"/>
+          <w:shd w:val="clear" w:color="auto" w:fill="F9F2F4"/>
+        </w:rPr>
+        <w:t xml:space="preserve">metrics-server</w:t>
+      </w:r>
+      <w:r>
+        <w:t xml:space="preserve">, </w:t>
+      </w:r>
+      <w:r>
+        <w:rPr>
+          <w:rStyle w:val="HTMLCode"/>
+          <w:rFonts w:eastAsiaTheme="minorHAnsi"/>
+          <w:color w:val="E83E8C"/>
+          <w:shd w:val="clear" w:color="auto" w:fill="F9F2F4"/>
+        </w:rPr>
+        <w:t xml:space="preserve">dashboard</w:t>
+      </w:r>
+      <w:r>
+        <w:t xml:space="preserve"> e </w:t>
+      </w:r>
+      <w:r>
+        <w:rPr>
+          <w:rStyle w:val="HTMLCode"/>
+          <w:rFonts w:eastAsiaTheme="minorHAnsi"/>
+          <w:color w:val="E83E8C"/>
+          <w:shd w:val="clear" w:color="auto" w:fill="F9F2F4"/>
+        </w:rPr>
+        <w:t xml:space="preserve">ingress</w:t>
+      </w:r>
+      <w:r>
+        <w:t xml:space="preserve">; y crea dos servicios de systemd:</w:t>
+      </w:r>
+    </w:p>
+    <w:p>
+      <w:pPr>
+        <w:pStyle w:val="ListParagraph"/>
+        <w:numPr>
+          <w:ilvl w:val="0"/>
+          <w:numId w:val="3"/>
+        </w:numPr>
+        <w:spacing w:after="80"/>
+        <w:jc w:val="both"/>
+      </w:pPr>
+      <w:r>
+        <w:rPr>
+          <w:rStyle w:val="HTMLCode"/>
+          <w:rFonts w:eastAsiaTheme="minorHAnsi"/>
+          <w:color w:val="E83E8C"/>
+          <w:shd w:val="clear" w:color="auto" w:fill="F9F2F4"/>
+        </w:rPr>
+        <w:t xml:space="preserve">minikube.service</w:t>
+      </w:r>
+      <w:r>
+        <w:t xml:space="preserve">, que vuelve a levantar el clúster después de un reinicio de la máquina virtual.</w:t>
+      </w:r>
+    </w:p>
+    <w:p>
+      <w:pPr>
+        <w:pStyle w:val="ListParagraph"/>
+        <w:numPr>
+          <w:ilvl w:val="0"/>
+          <w:numId w:val="3"/>
+        </w:numPr>
+        <w:spacing w:after="80"/>
+        <w:jc w:val="both"/>
+      </w:pPr>
+      <w:r>
+        <w:rPr>
+          <w:rStyle w:val="HTMLCode"/>
+          <w:rFonts w:eastAsiaTheme="minorHAnsi"/>
+          <w:color w:val="E83E8C"/>
+          <w:shd w:val="clear" w:color="auto" w:fill="F9F2F4"/>
+        </w:rPr>
+        <w:t xml:space="preserve">minikube-expose@PUERTO.service</w:t>
+      </w:r>
+      <w:r>
+        <w:t xml:space="preserve">, que publica un NodePort en todas las interfaces de la máquina. Queda activo para los puertos 30080, 30081 y 30090.</w:t>
+      </w:r>
+    </w:p>
+    <w:p>
+      <w:pPr>
+        <w:spacing w:after="120"/>
+        <w:jc w:val="both"/>
+      </w:pPr>
+      <w:r>
+        <w:t xml:space="preserve">Al terminar, el instalador copia el material a </w:t>
+      </w:r>
+      <w:r>
+        <w:rPr>
+          <w:rStyle w:val="HTMLCode"/>
+          <w:rFonts w:eastAsiaTheme="minorHAnsi"/>
+          <w:color w:val="E83E8C"/>
+          <w:shd w:val="clear" w:color="auto" w:fill="F9F2F4"/>
+        </w:rPr>
+        <w:t xml:space="preserve">~/lab</w:t>
+      </w:r>
+      <w:r>
+        <w:t xml:space="preserve"> (</w:t>
+      </w:r>
+      <w:r>
+        <w:rPr>
+          <w:rStyle w:val="HTMLCode"/>
+          <w:rFonts w:eastAsiaTheme="minorHAnsi"/>
+          <w:color w:val="E83E8C"/>
+          <w:shd w:val="clear" w:color="auto" w:fill="F9F2F4"/>
+        </w:rPr>
+        <w:t xml:space="preserve">app-guia/</w:t>
+      </w:r>
+      <w:r>
+        <w:t xml:space="preserve">, </w:t>
+      </w:r>
+      <w:r>
+        <w:rPr>
+          <w:rStyle w:val="HTMLCode"/>
+          <w:rFonts w:eastAsiaTheme="minorHAnsi"/>
+          <w:color w:val="E83E8C"/>
+          <w:shd w:val="clear" w:color="auto" w:fill="F9F2F4"/>
+        </w:rPr>
+        <w:t xml:space="preserve">app-portal/</w:t>
+      </w:r>
+      <w:r>
+        <w:t xml:space="preserve">, </w:t>
+      </w:r>
+      <w:r>
+        <w:rPr>
+          <w:rStyle w:val="HTMLCode"/>
+          <w:rFonts w:eastAsiaTheme="minorHAnsi"/>
+          <w:color w:val="E83E8C"/>
+          <w:shd w:val="clear" w:color="auto" w:fill="F9F2F4"/>
+        </w:rPr>
+        <w:t xml:space="preserve">manifests/</w:t>
+      </w:r>
+      <w:r>
+        <w:t xml:space="preserve"> y </w:t>
+      </w:r>
+      <w:r>
+        <w:rPr>
+          <w:rStyle w:val="HTMLCode"/>
+          <w:rFonts w:eastAsiaTheme="minorHAnsi"/>
+          <w:color w:val="E83E8C"/>
+          <w:shd w:val="clear" w:color="auto" w:fill="F9F2F4"/>
+        </w:rPr>
+        <w:t xml:space="preserve">scripts/</w:t>
+      </w:r>
+      <w:r>
+        <w:t xml:space="preserve">), que es la ruta que usan los comandos de aquí en adelante. La carpeta clonada se conserva: sirve para traer correcciones con </w:t>
+      </w:r>
+      <w:r>
+        <w:rPr>
+          <w:rStyle w:val="HTMLCode"/>
+          <w:rFonts w:eastAsiaTheme="minorHAnsi"/>
+          <w:color w:val="E83E8C"/>
+          <w:shd w:val="clear" w:color="auto" w:fill="F9F2F4"/>
+        </w:rPr>
+        <w:t xml:space="preserve">git pull</w:t>
+      </w:r>
+      <w:r>
+        <w:t xml:space="preserve"> y volver a copiar lo que necesite.</w:t>
+      </w:r>
+    </w:p>
+    <w:tbl>
+      <w:tblPr>
+        <w:tblW w:w="8829" w:type="dxa"/>
+        <w:tblBorders>
+          <w:top w:val="nil"/>
+          <w:left w:val="single" w:sz="36" w:space="0" w:color="2E74B5"/>
+          <w:bottom w:val="nil"/>
+          <w:right w:val="nil"/>
+          <w:insideH w:val="nil"/>
+          <w:insideV w:val="nil"/>
+        </w:tblBorders>
+        <w:tblLayout w:type="fixed"/>
+        <w:tblCellMar>
+          <w:top w:w="90" w:type="dxa"/>
+          <w:left w:w="180" w:type="dxa"/>
+          <w:bottom w:w="90" w:type="dxa"/>
+          <w:right w:w="140" w:type="dxa"/>
+        </w:tblCellMar>
+        <w:tblLook w:val="0600" w:firstRow="0" w:lastRow="0" w:firstColumn="0" w:lastColumn="0" w:noHBand="1" w:noVBand="1"/>
+      </w:tblPr>
+      <w:tblGrid>
+        <w:gridCol w:w="8829"/>
+      </w:tblGrid>
+      <w:tr>
+        <w:trPr>
+          <w:cantSplit/>
+        </w:trPr>
+        <w:tc>
+          <w:tcPr>
+            <w:tcW w:w="8829" w:type="dxa"/>
+            <w:shd w:val="clear" w:color="auto" w:fill="EAF2FB"/>
+          </w:tcPr>
+          <w:p>
+            <w:pPr>
+              <w:spacing w:before="30" w:after="30" w:line="252" w:lineRule="auto"/>
+              <w:jc w:val="both"/>
+            </w:pPr>
+            <w:r>
+              <w:rPr>
+                <w:b/>
+                <w:bCs/>
+                <w:color w:val="2E74B5"/>
+              </w:rPr>
+              <w:t xml:space="preserve">Cierre la sesión SSH y vuelva a entrar. </w:t>
+            </w:r>
+            <w:r>
+              <w:t xml:space="preserve">El instalador agrega su usuario al grupo </w:t>
+            </w:r>
+            <w:r>
+              <w:rPr>
+                <w:rStyle w:val="HTMLCode"/>
+                <w:rFonts w:eastAsiaTheme="minorHAnsi"/>
+                <w:color w:val="E83E8C"/>
+                <w:shd w:val="clear" w:color="auto" w:fill="F9F2F4"/>
+              </w:rPr>
+              <w:t xml:space="preserve">docker</w:t>
+            </w:r>
+            <w:r>
+              <w:t xml:space="preserve">, y ese cambio solo surte efecto en una sesión nueva. Si no lo hace, los comandos de </w:t>
+            </w:r>
+            <w:r>
+              <w:rPr>
+                <w:rStyle w:val="HTMLCode"/>
+                <w:rFonts w:eastAsiaTheme="minorHAnsi"/>
+                <w:color w:val="E83E8C"/>
+                <w:shd w:val="clear" w:color="auto" w:fill="F9F2F4"/>
+              </w:rPr>
+              <w:t xml:space="preserve">minikube</w:t>
+            </w:r>
+            <w:r>
+              <w:t xml:space="preserve"> fallarán con </w:t>
+            </w:r>
+            <w:r>
+              <w:rPr>
+                <w:rStyle w:val="HTMLCode"/>
+                <w:rFonts w:eastAsiaTheme="minorHAnsi"/>
+                <w:color w:val="E83E8C"/>
+                <w:shd w:val="clear" w:color="auto" w:fill="F9F2F4"/>
+              </w:rPr>
+              <w:t xml:space="preserve">permission denied</w:t>
+            </w:r>
+            <w:r>
+              <w:t xml:space="preserve"> al hablar con el demonio de Docker.</w:t>
+            </w:r>
+          </w:p>
+        </w:tc>
+      </w:tr>
+    </w:tbl>
+    <w:p>
+      <w:pPr>
+        <w:spacing w:after="0" w:line="140" w:lineRule="exact"/>
+      </w:pPr>
+    </w:p>
+    <w:p>
+      <w:pPr>
+        <w:pStyle w:val="Heading2"/>
+        <w:spacing w:before="200" w:after="60"/>
+      </w:pPr>
+      <w:r>
+        <w:t>Parte 2. Reconocer el clúster</w:t>
+      </w:r>
+    </w:p>
+    <w:p>
+      <w:pPr>
+        <w:spacing w:after="120"/>
+        <w:jc w:val="both"/>
+      </w:pPr>
+      <w:r>
+        <w:t xml:space="preserve">Antes de desplegar nada, mire lo que ya está corriendo.</w:t>
       </w:r>
     </w:p>
     <w:tbl>
@@ -7070,7 +7854,7 @@
                 <w:szCs w:val="18"/>
                 <w:lang w:val="en-US"/>
               </w:rPr>
-              <w:t xml:space="preserve">docker build -t guia-k8s:1.0 .</w:t>
+              <w:t xml:space="preserve">kubectl get nodes -o wide</w:t>
             </w:r>
           </w:p>
           <w:p>
@@ -7085,7 +7869,7 @@
                 <w:szCs w:val="18"/>
                 <w:lang w:val="en-US"/>
               </w:rPr>
-              <w:t xml:space="preserve">docker run -d --name prueba -p 8081:80 guia-k8s:1.0</w:t>
+              <w:t xml:space="preserve">kubectl get pods -n kube-system</w:t>
             </w:r>
           </w:p>
           <w:p>
@@ -7100,7 +7884,7 @@
                 <w:szCs w:val="18"/>
                 <w:lang w:val="en-US"/>
               </w:rPr>
-              <w:t xml:space="preserve">curl -s localhost:8081 | head -5</w:t>
+              <w:t xml:space="preserve">kubectl cluster-info</w:t>
             </w:r>
           </w:p>
           <w:p>
@@ -7115,7 +7899,7 @@
                 <w:szCs w:val="18"/>
                 <w:lang w:val="en-US"/>
               </w:rPr>
-              <w:t xml:space="preserve">curl -s localhost:8081/pod.json</w:t>
+              <w:t xml:space="preserve">minikube ip</w:t>
             </w:r>
             <w:r>
               <w:rPr>
@@ -7125,37 +7909,7 @@
                 <w:szCs w:val="18"/>
                 <w:lang w:val="en-US"/>
               </w:rPr>
-              <w:t xml:space="preserve">      # sin variables dirá "desconocido"</w:t>
-            </w:r>
-          </w:p>
-          <w:p>
-            <w:pPr>
-              <w:spacing w:after="0" w:line="240" w:lineRule="auto"/>
-            </w:pPr>
-            <w:r>
-              <w:rPr>
-                <w:rFonts w:ascii="Consolas" w:hAnsi="Consolas" w:cs="Courier New"/>
-                <w:color w:val="FFFFFF"/>
-                <w:sz w:val="18"/>
-                <w:szCs w:val="18"/>
-                <w:lang w:val="en-US"/>
-              </w:rPr>
-              <w:t xml:space="preserve">docker logs prueba | head</w:t>
-            </w:r>
-          </w:p>
-          <w:p>
-            <w:pPr>
-              <w:spacing w:after="0" w:line="240" w:lineRule="auto"/>
-            </w:pPr>
-            <w:r>
-              <w:rPr>
-                <w:rFonts w:ascii="Consolas" w:hAnsi="Consolas" w:cs="Courier New"/>
-                <w:color w:val="FFFFFF"/>
-                <w:sz w:val="18"/>
-                <w:szCs w:val="18"/>
-                <w:lang w:val="en-US"/>
-              </w:rPr>
-              <w:t xml:space="preserve">docker rm -f prueba</w:t>
+              <w:t xml:space="preserve">                 # la IP interna del nodo: 192.168.49.2</w:t>
             </w:r>
           </w:p>
         </w:tc>
@@ -7172,17 +7926,130 @@
         <w:jc w:val="both"/>
       </w:pPr>
       <w:r>
-        <w:t xml:space="preserve">Ahora constrúyala </w:t>
+        <w:t xml:space="preserve">El nodo debe aparecer en estado </w:t>
       </w:r>
       <w:r>
         <w:rPr>
-          <w:b/>
-          <w:bCs/>
+          <w:rStyle w:val="HTMLCode"/>
+          <w:rFonts w:eastAsiaTheme="minorHAnsi"/>
+          <w:color w:val="E83E8C"/>
+          <w:shd w:val="clear" w:color="auto" w:fill="F9F2F4"/>
         </w:rPr>
-        <w:t xml:space="preserve">dentro</w:t>
-      </w:r>
-      <w:r>
-        <w:t xml:space="preserve"> de minikube, que es donde el clúster puede verla, y compruebe la diferencia entre los dos almacenes:</w:t>
+        <w:t xml:space="preserve">Ready</w:t>
+      </w:r>
+      <w:r>
+        <w:t xml:space="preserve"> y con el rol </w:t>
+      </w:r>
+      <w:r>
+        <w:rPr>
+          <w:rStyle w:val="HTMLCode"/>
+          <w:rFonts w:eastAsiaTheme="minorHAnsi"/>
+          <w:color w:val="E83E8C"/>
+          <w:shd w:val="clear" w:color="auto" w:fill="F9F2F4"/>
+        </w:rPr>
+        <w:t xml:space="preserve">control-plane</w:t>
+      </w:r>
+      <w:r>
+        <w:t xml:space="preserve">. La segunda orden muestra el plano de control completo, cada componente como un Pod dentro del propio clúster.</w:t>
+      </w:r>
+    </w:p>
+    <w:tbl>
+      <w:tblPr>
+        <w:tblW w:w="8829" w:type="dxa"/>
+        <w:tblBorders>
+          <w:top w:val="nil"/>
+          <w:left w:val="single" w:sz="36" w:space="0" w:color="6F42C1"/>
+          <w:bottom w:val="nil"/>
+          <w:right w:val="nil"/>
+          <w:insideH w:val="nil"/>
+          <w:insideV w:val="nil"/>
+        </w:tblBorders>
+        <w:tblLayout w:type="fixed"/>
+        <w:tblCellMar>
+          <w:top w:w="90" w:type="dxa"/>
+          <w:left w:w="180" w:type="dxa"/>
+          <w:bottom w:w="90" w:type="dxa"/>
+          <w:right w:w="140" w:type="dxa"/>
+        </w:tblCellMar>
+        <w:tblLook w:val="0600" w:firstRow="0" w:lastRow="0" w:firstColumn="0" w:lastColumn="0" w:noHBand="1" w:noVBand="1"/>
+      </w:tblPr>
+      <w:tblGrid>
+        <w:gridCol w:w="8829"/>
+      </w:tblGrid>
+      <w:tr>
+        <w:trPr>
+          <w:cantSplit/>
+        </w:trPr>
+        <w:tc>
+          <w:tcPr>
+            <w:tcW w:w="8829" w:type="dxa"/>
+            <w:shd w:val="clear" w:color="auto" w:fill="F3ECFA"/>
+          </w:tcPr>
+          <w:p>
+            <w:pPr>
+              <w:spacing w:before="30" w:after="30" w:line="252" w:lineRule="auto"/>
+              <w:jc w:val="both"/>
+            </w:pPr>
+            <w:r>
+              <w:rPr>
+                <w:b/>
+                <w:bCs/>
+                <w:color w:val="6F42C1"/>
+              </w:rPr>
+              <w:t xml:space="preserve">Pregunta 1. </w:t>
+            </w:r>
+            <w:r>
+              <w:t xml:space="preserve">Ejecute </w:t>
+            </w:r>
+            <w:r>
+              <w:rPr>
+                <w:rStyle w:val="HTMLCode"/>
+                <w:rFonts w:eastAsiaTheme="minorHAnsi"/>
+                <w:color w:val="E83E8C"/>
+                <w:shd w:val="clear" w:color="auto" w:fill="F9F2F4"/>
+              </w:rPr>
+              <w:t xml:space="preserve">kubectl get nodes -o wide</w:t>
+            </w:r>
+            <w:r>
+              <w:t xml:space="preserve"> y </w:t>
+            </w:r>
+            <w:r>
+              <w:rPr>
+                <w:rStyle w:val="HTMLCode"/>
+                <w:rFonts w:eastAsiaTheme="minorHAnsi"/>
+                <w:color w:val="E83E8C"/>
+                <w:shd w:val="clear" w:color="auto" w:fill="F9F2F4"/>
+              </w:rPr>
+              <w:t xml:space="preserve">kubectl get pods -n kube-system</w:t>
+            </w:r>
+            <w:r>
+              <w:t xml:space="preserve">. Enumere los componentes del plano de control que encuentre y explique, para dos de ellos, qué dejaría de funcionar si se detuvieran.</w:t>
+            </w:r>
+          </w:p>
+        </w:tc>
+      </w:tr>
+    </w:tbl>
+    <w:p>
+      <w:pPr>
+        <w:spacing w:after="0" w:line="140" w:lineRule="exact"/>
+      </w:pPr>
+    </w:p>
+    <w:p>
+      <w:pPr>
+        <w:pStyle w:val="Heading2"/>
+        <w:spacing w:before="200" w:after="60"/>
+      </w:pPr>
+      <w:r>
+        <w:t>Parte 3. Construir la imagen de la guía</w:t>
+      </w:r>
+    </w:p>
+    <w:p>
+      <w:pPr>
+        <w:spacing w:after="120"/>
+        <w:jc w:val="both"/>
+      </w:pPr>
+      <w:r>
+        <w:t xml:space="preserve">Revise primero el contexto de construcción: son cuatro archivos y todos terminan dentro de la imagen.</w:t>
       </w:r>
     </w:p>
     <w:tbl>
@@ -7230,7 +8097,7 @@
                 <w:szCs w:val="18"/>
                 <w:lang w:val="en-US"/>
               </w:rPr>
-              <w:t xml:space="preserve">minikube image build -t guia-k8s:1.0 .</w:t>
+              <w:t xml:space="preserve">cd ~/lab/app-guia</w:t>
             </w:r>
           </w:p>
           <w:p>
@@ -7245,19 +8112,7 @@
                 <w:szCs w:val="18"/>
                 <w:lang w:val="en-US"/>
               </w:rPr>
-              <w:t xml:space="preserve">minikube image ls | grep guia-k8s</w:t>
-            </w:r>
-          </w:p>
-          <w:p>
-            <w:pPr>
-              <w:spacing w:after="0" w:line="240" w:lineRule="auto"/>
-            </w:pPr>
-            <w:r>
-              <w:rPr>
-                <w:rFonts w:ascii="Consolas" w:hAnsi="Consolas"/>
-                <w:sz w:val="18"/>
-              </w:rPr>
-              <w:t xml:space="preserve"> </w:t>
+              <w:t xml:space="preserve">ls -la</w:t>
             </w:r>
           </w:p>
           <w:p>
@@ -7272,42 +8127,7 @@
                 <w:szCs w:val="18"/>
                 <w:lang w:val="en-US"/>
               </w:rPr>
-              <w:t xml:space="preserve">docker images | grep guia-k8s</w:t>
-            </w:r>
-            <w:r>
-              <w:rPr>
-                <w:rFonts w:ascii="Consolas" w:hAnsi="Consolas" w:cs="Courier New"/>
-                <w:color w:val="9AA7B4"/>
-                <w:sz w:val="18"/>
-                <w:szCs w:val="18"/>
-                <w:lang w:val="en-US"/>
-              </w:rPr>
-              <w:t xml:space="preserve">                    # almacén de la máquina virtual</w:t>
-            </w:r>
-          </w:p>
-          <w:p>
-            <w:pPr>
-              <w:spacing w:after="0" w:line="240" w:lineRule="auto"/>
-            </w:pPr>
-            <w:r>
-              <w:rPr>
-                <w:rFonts w:ascii="Consolas" w:hAnsi="Consolas" w:cs="Courier New"/>
-                <w:color w:val="FFFFFF"/>
-                <w:sz w:val="18"/>
-                <w:szCs w:val="18"/>
-                <w:lang w:val="en-US"/>
-              </w:rPr>
-              <w:t xml:space="preserve">minikube ssh -- sudo crictl images | grep guia</w:t>
-            </w:r>
-            <w:r>
-              <w:rPr>
-                <w:rFonts w:ascii="Consolas" w:hAnsi="Consolas" w:cs="Courier New"/>
-                <w:color w:val="9AA7B4"/>
-                <w:sz w:val="18"/>
-                <w:szCs w:val="18"/>
-                <w:lang w:val="en-US"/>
-              </w:rPr>
-              <w:t xml:space="preserve">   # almacén del nodo</w:t>
+              <w:t xml:space="preserve">cat Dockerfile</w:t>
             </w:r>
           </w:p>
         </w:tc>
@@ -7321,11 +8141,20 @@
     <w:p>
       <w:pPr>
         <w:spacing w:after="120"/>
-        <w:ind w:left="720"/>
         <w:jc w:val="both"/>
       </w:pPr>
       <w:r>
-        <w:t xml:space="preserve">Si prefiere reutilizar la imagen que ya construyó con Docker, el equivalente es </w:t>
+        <w:t xml:space="preserve">Pruebe el contenedor </w:t>
+      </w:r>
+      <w:r>
+        <w:rPr>
+          <w:b/>
+          <w:bCs/>
+        </w:rPr>
+        <w:t xml:space="preserve">suelto</w:t>
+      </w:r>
+      <w:r>
+        <w:t xml:space="preserve">, con Docker, antes de entregárselo a Kubernetes. Si algo está mal en la imagen, es mucho más rápido descubrirlo aquí que persiguiendo un Pod en </w:t>
       </w:r>
       <w:r>
         <w:rPr>
@@ -7334,28 +8163,10 @@
           <w:color w:val="E83E8C"/>
           <w:shd w:val="clear" w:color="auto" w:fill="F9F2F4"/>
         </w:rPr>
-        <w:t xml:space="preserve">minikube image load guia-k8s:1.0</w:t>
+        <w:t xml:space="preserve">CrashLoopBackOff</w:t>
       </w:r>
       <w:r>
         <w:t xml:space="preserve">.</w:t>
-      </w:r>
-    </w:p>
-    <w:p>
-      <w:pPr>
-        <w:pStyle w:val="Heading2"/>
-        <w:spacing w:before="200" w:after="60"/>
-      </w:pPr>
-      <w:r>
-        <w:t>Parte 4. Desplegar la guía y publicarla</w:t>
-      </w:r>
-    </w:p>
-    <w:p>
-      <w:pPr>
-        <w:spacing w:after="120"/>
-        <w:jc w:val="both"/>
-      </w:pPr>
-      <w:r>
-        <w:t xml:space="preserve">Revise los manifiestos antes de aplicarlos: están comentados y son el material de estudio de esta parte.</w:t>
       </w:r>
     </w:p>
     <w:tbl>
@@ -7403,7 +8214,7 @@
                 <w:szCs w:val="18"/>
                 <w:lang w:val="en-US"/>
               </w:rPr>
-              <w:t xml:space="preserve">cd ~/lab/manifests</w:t>
+              <w:t xml:space="preserve">docker build -t guia-k8s:1.0 .</w:t>
             </w:r>
           </w:p>
           <w:p>
@@ -7418,19 +8229,7 @@
                 <w:szCs w:val="18"/>
                 <w:lang w:val="en-US"/>
               </w:rPr>
-              <w:t xml:space="preserve">cat 00-namespace.yaml 10-deployment-guia.yaml 11-service-guia.yaml</w:t>
-            </w:r>
-          </w:p>
-          <w:p>
-            <w:pPr>
-              <w:spacing w:after="0" w:line="240" w:lineRule="auto"/>
-            </w:pPr>
-            <w:r>
-              <w:rPr>
-                <w:rFonts w:ascii="Consolas" w:hAnsi="Consolas"/>
-                <w:sz w:val="18"/>
-              </w:rPr>
-              <w:t xml:space="preserve"> </w:t>
+              <w:t xml:space="preserve">docker run -d --name prueba -p 8081:80 guia-k8s:1.0</w:t>
             </w:r>
           </w:p>
           <w:p>
@@ -7445,7 +8244,7 @@
                 <w:szCs w:val="18"/>
                 <w:lang w:val="en-US"/>
               </w:rPr>
-              <w:t xml:space="preserve">kubectl apply -f 00-namespace.yaml</w:t>
+              <w:t xml:space="preserve">curl -s localhost:8081 | head -5</w:t>
             </w:r>
           </w:p>
           <w:p>
@@ -7460,7 +8259,17 @@
                 <w:szCs w:val="18"/>
                 <w:lang w:val="en-US"/>
               </w:rPr>
-              <w:t xml:space="preserve">kubectl apply -f 10-deployment-guia.yaml</w:t>
+              <w:t xml:space="preserve">curl -s localhost:8081/pod.json</w:t>
+            </w:r>
+            <w:r>
+              <w:rPr>
+                <w:rFonts w:ascii="Consolas" w:hAnsi="Consolas" w:cs="Courier New"/>
+                <w:color w:val="9AA7B4"/>
+                <w:sz w:val="18"/>
+                <w:szCs w:val="18"/>
+                <w:lang w:val="en-US"/>
+              </w:rPr>
+              <w:t xml:space="preserve">      # sin variables dirá "desconocido"</w:t>
             </w:r>
           </w:p>
           <w:p>
@@ -7475,19 +8284,7 @@
                 <w:szCs w:val="18"/>
                 <w:lang w:val="en-US"/>
               </w:rPr>
-              <w:t xml:space="preserve">kubectl apply -f 11-service-guia.yaml</w:t>
-            </w:r>
-          </w:p>
-          <w:p>
-            <w:pPr>
-              <w:spacing w:after="0" w:line="240" w:lineRule="auto"/>
-            </w:pPr>
-            <w:r>
-              <w:rPr>
-                <w:rFonts w:ascii="Consolas" w:hAnsi="Consolas"/>
-                <w:sz w:val="18"/>
-              </w:rPr>
-              <w:t xml:space="preserve"> </w:t>
+              <w:t xml:space="preserve">docker logs prueba | head</w:t>
             </w:r>
           </w:p>
           <w:p>
@@ -7502,22 +8299,7 @@
                 <w:szCs w:val="18"/>
                 <w:lang w:val="en-US"/>
               </w:rPr>
-              <w:t xml:space="preserve">kubectl -n lab rollout status deployment/guia</w:t>
-            </w:r>
-          </w:p>
-          <w:p>
-            <w:pPr>
-              <w:spacing w:after="0" w:line="240" w:lineRule="auto"/>
-            </w:pPr>
-            <w:r>
-              <w:rPr>
-                <w:rFonts w:ascii="Consolas" w:hAnsi="Consolas" w:cs="Courier New"/>
-                <w:color w:val="FFFFFF"/>
-                <w:sz w:val="18"/>
-                <w:szCs w:val="18"/>
-                <w:lang w:val="en-US"/>
-              </w:rPr>
-              <w:t xml:space="preserve">kubectl -n lab get deployment,replicaset,pod,service</w:t>
+              <w:t xml:space="preserve">docker rm -f prueba</w:t>
             </w:r>
           </w:p>
         </w:tc>
@@ -7534,159 +8316,17 @@
         <w:jc w:val="both"/>
       </w:pPr>
       <w:r>
-        <w:t xml:space="preserve">Abra </w:t>
-      </w:r>
-      <w:r>
-        <w:rPr>
-          <w:rStyle w:val="HTMLCode"/>
-          <w:rFonts w:eastAsiaTheme="minorHAnsi"/>
-          <w:color w:val="E83E8C"/>
-          <w:shd w:val="clear" w:color="auto" w:fill="F9F2F4"/>
-        </w:rPr>
-        <w:t xml:space="preserve">http://FQDN:30080</w:t>
-      </w:r>
-      <w:r>
-        <w:t xml:space="preserve"> en su navegador. La página trae una tarjeta que muestra qué Pod atendió la petición; el botón </w:t>
-      </w:r>
-      <w:r>
-        <w:rPr>
-          <w:i/>
-          <w:iCs/>
-        </w:rPr>
-        <w:t xml:space="preserve">Pedir la página otra vez</w:t>
-      </w:r>
-      <w:r>
-        <w:t xml:space="preserve"> vuelve a consultarla y, como la imagen desactiva las conexiones persistentes de nginx, cada petición se reparte de nuevo entre las réplicas y el nombre del Pod cambia. </w:t>
+        <w:t xml:space="preserve">Ahora constrúyala </w:t>
       </w:r>
       <w:r>
         <w:rPr>
           <w:b/>
           <w:bCs/>
         </w:rPr>
-        <w:t xml:space="preserve">A partir de aquí puede seguir el laboratorio leyendo desde el clúster.</w:t>
-      </w:r>
-    </w:p>
-    <w:tbl>
-      <w:tblPr>
-        <w:tblW w:w="8829" w:type="dxa"/>
-        <w:tblBorders>
-          <w:top w:val="nil"/>
-          <w:left w:val="single" w:sz="36" w:space="0" w:color="2E74B5"/>
-          <w:bottom w:val="nil"/>
-          <w:right w:val="nil"/>
-          <w:insideH w:val="nil"/>
-          <w:insideV w:val="nil"/>
-        </w:tblBorders>
-        <w:tblLayout w:type="fixed"/>
-        <w:tblCellMar>
-          <w:top w:w="90" w:type="dxa"/>
-          <w:left w:w="180" w:type="dxa"/>
-          <w:bottom w:w="90" w:type="dxa"/>
-          <w:right w:w="140" w:type="dxa"/>
-        </w:tblCellMar>
-        <w:tblLook w:val="0600" w:firstRow="0" w:lastRow="0" w:firstColumn="0" w:lastColumn="0" w:noHBand="1" w:noVBand="1"/>
-      </w:tblPr>
-      <w:tblGrid>
-        <w:gridCol w:w="8829"/>
-      </w:tblGrid>
-      <w:tr>
-        <w:trPr>
-          <w:cantSplit/>
-        </w:trPr>
-        <w:tc>
-          <w:tcPr>
-            <w:tcW w:w="8829" w:type="dxa"/>
-            <w:shd w:val="clear" w:color="auto" w:fill="EAF2FB"/>
-          </w:tcPr>
-          <w:p>
-            <w:pPr>
-              <w:spacing w:before="30" w:after="30" w:line="252" w:lineRule="auto"/>
-              <w:jc w:val="both"/>
-            </w:pPr>
-            <w:r>
-              <w:rPr>
-                <w:b/>
-                <w:bCs/>
-                <w:color w:val="2E74B5"/>
-              </w:rPr>
-              <w:t xml:space="preserve">Si no carga, revise en este orden. </w:t>
-            </w:r>
-            <w:r>
-              <w:t xml:space="preserve">Primero </w:t>
-            </w:r>
-            <w:r>
-              <w:rPr>
-                <w:rStyle w:val="HTMLCode"/>
-                <w:rFonts w:eastAsiaTheme="minorHAnsi"/>
-                <w:color w:val="E83E8C"/>
-                <w:shd w:val="clear" w:color="auto" w:fill="F9F2F4"/>
-              </w:rPr>
-              <w:t xml:space="preserve">kubectl -n lab get pods</w:t>
-            </w:r>
-            <w:r>
-              <w:t xml:space="preserve"> (¿están en </w:t>
-            </w:r>
-            <w:r>
-              <w:rPr>
-                <w:rStyle w:val="HTMLCode"/>
-                <w:rFonts w:eastAsiaTheme="minorHAnsi"/>
-                <w:color w:val="E83E8C"/>
-                <w:shd w:val="clear" w:color="auto" w:fill="F9F2F4"/>
-              </w:rPr>
-              <w:t xml:space="preserve">Running</w:t>
-            </w:r>
-            <w:r>
-              <w:t xml:space="preserve">?); luego </w:t>
-            </w:r>
-            <w:r>
-              <w:rPr>
-                <w:rStyle w:val="HTMLCode"/>
-                <w:rFonts w:eastAsiaTheme="minorHAnsi"/>
-                <w:color w:val="E83E8C"/>
-                <w:shd w:val="clear" w:color="auto" w:fill="F9F2F4"/>
-              </w:rPr>
-              <w:t xml:space="preserve">systemctl status minikube-expose@30080</w:t>
-            </w:r>
-            <w:r>
-              <w:t xml:space="preserve"> (¿está activo el reenvío?); por último, la regla del NSG (¿su IP actual está autorizada?).</w:t>
-            </w:r>
-          </w:p>
-        </w:tc>
-      </w:tr>
-    </w:tbl>
-    <w:p>
-      <w:pPr>
-        <w:spacing w:after="0" w:line="140" w:lineRule="exact"/>
-      </w:pPr>
-    </w:p>
-    <w:p>
-      <w:pPr>
-        <w:pStyle w:val="Heading2"/>
-        <w:spacing w:before="200" w:after="60"/>
-      </w:pPr>
-      <w:r>
-        <w:t>Parte 5. Observar los Pods</w:t>
-      </w:r>
-    </w:p>
-    <w:p>
-      <w:pPr>
-        <w:spacing w:after="120"/>
-        <w:jc w:val="both"/>
-      </w:pPr>
-      <w:r>
-        <w:t xml:space="preserve">Cuatro órdenes que se usan a diario. </w:t>
-      </w:r>
-      <w:r>
-        <w:rPr>
-          <w:rStyle w:val="HTMLCode"/>
-          <w:rFonts w:eastAsiaTheme="minorHAnsi"/>
-          <w:color w:val="E83E8C"/>
-          <w:shd w:val="clear" w:color="auto" w:fill="F9F2F4"/>
-        </w:rPr>
-        <w:t xml:space="preserve">describe</w:t>
-      </w:r>
-      <w:r>
-        <w:t xml:space="preserve"> termina con la lista de eventos, que es el primer sitio donde mirar cuando algo falla.</w:t>
+        <w:t xml:space="preserve">dentro</w:t>
+      </w:r>
+      <w:r>
+        <w:t xml:space="preserve"> de minikube, que es donde el clúster puede verla, y compruebe la diferencia entre los dos almacenes:</w:t>
       </w:r>
     </w:p>
     <w:tbl>
@@ -7734,7 +8374,7 @@
                 <w:szCs w:val="18"/>
                 <w:lang w:val="en-US"/>
               </w:rPr>
-              <w:t xml:space="preserve">kubectl -n lab get pods -o wide</w:t>
+              <w:t xml:space="preserve">minikube image build -t guia-k8s:1.0 .</w:t>
             </w:r>
           </w:p>
           <w:p>
@@ -7749,7 +8389,19 @@
                 <w:szCs w:val="18"/>
                 <w:lang w:val="en-US"/>
               </w:rPr>
-              <w:t xml:space="preserve">kubectl -n lab describe pod &lt;nombre-del-pod&gt;</w:t>
+              <w:t xml:space="preserve">minikube image ls | grep guia-k8s</w:t>
+            </w:r>
+          </w:p>
+          <w:p>
+            <w:pPr>
+              <w:spacing w:after="0" w:line="240" w:lineRule="auto"/>
+            </w:pPr>
+            <w:r>
+              <w:rPr>
+                <w:rFonts w:ascii="Consolas" w:hAnsi="Consolas"/>
+                <w:sz w:val="18"/>
+              </w:rPr>
+              <w:t xml:space="preserve"> </w:t>
             </w:r>
           </w:p>
           <w:p>
@@ -7764,7 +8416,17 @@
                 <w:szCs w:val="18"/>
                 <w:lang w:val="en-US"/>
               </w:rPr>
-              <w:t xml:space="preserve">kubectl -n lab logs -l app=guia --tail=20</w:t>
+              <w:t xml:space="preserve">docker images | grep guia-k8s</w:t>
+            </w:r>
+            <w:r>
+              <w:rPr>
+                <w:rFonts w:ascii="Consolas" w:hAnsi="Consolas" w:cs="Courier New"/>
+                <w:color w:val="9AA7B4"/>
+                <w:sz w:val="18"/>
+                <w:szCs w:val="18"/>
+                <w:lang w:val="en-US"/>
+              </w:rPr>
+              <w:t xml:space="preserve">                    # almacén de la máquina virtual</w:t>
             </w:r>
           </w:p>
           <w:p>
@@ -7779,37 +8441,17 @@
                 <w:szCs w:val="18"/>
                 <w:lang w:val="en-US"/>
               </w:rPr>
-              <w:t xml:space="preserve">kubectl -n lab exec -it &lt;nombre-del-pod&gt; -- sh</w:t>
-            </w:r>
-          </w:p>
-          <w:p>
-            <w:pPr>
-              <w:spacing w:after="0" w:line="240" w:lineRule="auto"/>
-            </w:pPr>
+              <w:t xml:space="preserve">minikube ssh -- sudo crictl images | grep guia</w:t>
+            </w:r>
             <w:r>
               <w:rPr>
                 <w:rFonts w:ascii="Consolas" w:hAnsi="Consolas" w:cs="Courier New"/>
-                <w:color w:val="FFFFFF"/>
+                <w:color w:val="9AA7B4"/>
                 <w:sz w:val="18"/>
                 <w:szCs w:val="18"/>
                 <w:lang w:val="en-US"/>
               </w:rPr>
-              <w:t xml:space="preserve">  cat /usr/share/nginx/html/pod.json</w:t>
-            </w:r>
-          </w:p>
-          <w:p>
-            <w:pPr>
-              <w:spacing w:after="0" w:line="240" w:lineRule="auto"/>
-            </w:pPr>
-            <w:r>
-              <w:rPr>
-                <w:rFonts w:ascii="Consolas" w:hAnsi="Consolas" w:cs="Courier New"/>
-                <w:color w:val="FFFFFF"/>
-                <w:sz w:val="18"/>
-                <w:szCs w:val="18"/>
-                <w:lang w:val="en-US"/>
-              </w:rPr>
-              <w:t xml:space="preserve">  exit</w:t>
+              <w:t xml:space="preserve">   # almacén del nodo</w:t>
             </w:r>
           </w:p>
         </w:tc>
@@ -7820,74 +8462,27 @@
         <w:spacing w:after="0" w:line="140" w:lineRule="exact"/>
       </w:pPr>
     </w:p>
-    <w:tbl>
-      <w:tblPr>
-        <w:tblW w:w="8829" w:type="dxa"/>
-        <w:tblBorders>
-          <w:top w:val="nil"/>
-          <w:left w:val="single" w:sz="36" w:space="0" w:color="6F42C1"/>
-          <w:bottom w:val="nil"/>
-          <w:right w:val="nil"/>
-          <w:insideH w:val="nil"/>
-          <w:insideV w:val="nil"/>
-        </w:tblBorders>
-        <w:tblLayout w:type="fixed"/>
-        <w:tblCellMar>
-          <w:top w:w="90" w:type="dxa"/>
-          <w:left w:w="180" w:type="dxa"/>
-          <w:bottom w:w="90" w:type="dxa"/>
-          <w:right w:w="140" w:type="dxa"/>
-        </w:tblCellMar>
-        <w:tblLook w:val="0600" w:firstRow="0" w:lastRow="0" w:firstColumn="0" w:lastColumn="0" w:noHBand="1" w:noVBand="1"/>
-      </w:tblPr>
-      <w:tblGrid>
-        <w:gridCol w:w="8829"/>
-      </w:tblGrid>
-      <w:tr>
-        <w:trPr>
-          <w:cantSplit/>
-        </w:trPr>
-        <w:tc>
-          <w:tcPr>
-            <w:tcW w:w="8829" w:type="dxa"/>
-            <w:shd w:val="clear" w:color="auto" w:fill="F3ECFA"/>
-          </w:tcPr>
-          <w:p>
-            <w:pPr>
-              <w:spacing w:before="30" w:after="30" w:line="252" w:lineRule="auto"/>
-              <w:jc w:val="both"/>
-            </w:pPr>
-            <w:r>
-              <w:rPr>
-                <w:b/>
-                <w:bCs/>
-                <w:color w:val="6F42C1"/>
-              </w:rPr>
-              <w:t xml:space="preserve">Pregunta 2. </w:t>
-            </w:r>
-            <w:r>
-              <w:t xml:space="preserve">Anote las IPs que devuelve </w:t>
-            </w:r>
-            <w:r>
-              <w:rPr>
-                <w:rStyle w:val="HTMLCode"/>
-                <w:rFonts w:eastAsiaTheme="minorHAnsi"/>
-                <w:color w:val="E83E8C"/>
-                <w:shd w:val="clear" w:color="auto" w:fill="F9F2F4"/>
-              </w:rPr>
-              <w:t xml:space="preserve">kubectl -n lab get pods -o wide</w:t>
-            </w:r>
-            <w:r>
-              <w:t xml:space="preserve">. Reinicie un Pod y vuelva a mirarlas. ¿Qué implica esto para una aplicación que quisiera guardar la IP de otra en un archivo de configuración?</w:t>
-            </w:r>
-          </w:p>
-        </w:tc>
-      </w:tr>
-    </w:tbl>
-    <w:p>
-      <w:pPr>
-        <w:spacing w:after="0" w:line="140" w:lineRule="exact"/>
-      </w:pPr>
+    <w:p>
+      <w:pPr>
+        <w:spacing w:after="120"/>
+        <w:ind w:left="720"/>
+        <w:jc w:val="both"/>
+      </w:pPr>
+      <w:r>
+        <w:t xml:space="preserve">Si prefiere reutilizar la imagen que ya construyó con Docker, el equivalente es </w:t>
+      </w:r>
+      <w:r>
+        <w:rPr>
+          <w:rStyle w:val="HTMLCode"/>
+          <w:rFonts w:eastAsiaTheme="minorHAnsi"/>
+          <w:color w:val="E83E8C"/>
+          <w:shd w:val="clear" w:color="auto" w:fill="F9F2F4"/>
+        </w:rPr>
+        <w:t xml:space="preserve">minikube image load guia-k8s:1.0</w:t>
+      </w:r>
+      <w:r>
+        <w:t xml:space="preserve">.</w:t>
+      </w:r>
     </w:p>
     <w:p>
       <w:pPr>
@@ -7895,7 +8490,16 @@
         <w:spacing w:before="200" w:after="60"/>
       </w:pPr>
       <w:r>
-        <w:t>Parte 6. Escalar y comprobar la autosanación</w:t>
+        <w:t>Parte 4. Desplegar la guía y publicarla</w:t>
+      </w:r>
+    </w:p>
+    <w:p>
+      <w:pPr>
+        <w:spacing w:after="120"/>
+        <w:jc w:val="both"/>
+      </w:pPr>
+      <w:r>
+        <w:t xml:space="preserve">Revise los manifiestos antes de aplicarlos: están comentados y son el material de estudio de esta parte.</w:t>
       </w:r>
     </w:p>
     <w:tbl>
@@ -7943,7 +8547,7 @@
                 <w:szCs w:val="18"/>
                 <w:lang w:val="en-US"/>
               </w:rPr>
-              <w:t xml:space="preserve">kubectl -n lab scale deployment/guia --replicas=4</w:t>
+              <w:t xml:space="preserve">cd ~/lab/manifests</w:t>
             </w:r>
           </w:p>
           <w:p>
@@ -7958,17 +8562,7 @@
                 <w:szCs w:val="18"/>
                 <w:lang w:val="en-US"/>
               </w:rPr>
-              <w:t xml:space="preserve">kubectl -n lab get pods -w</w:t>
-            </w:r>
-            <w:r>
-              <w:rPr>
-                <w:rFonts w:ascii="Consolas" w:hAnsi="Consolas" w:cs="Courier New"/>
-                <w:color w:val="9AA7B4"/>
-                <w:sz w:val="18"/>
-                <w:szCs w:val="18"/>
-                <w:lang w:val="en-US"/>
-              </w:rPr>
-              <w:t xml:space="preserve">         # Ctrl-C para salir</w:t>
+              <w:t xml:space="preserve">cat 00-namespace.yaml 10-deployment-guia.yaml 11-service-guia.yaml</w:t>
             </w:r>
           </w:p>
           <w:p>
@@ -7981,21 +8575,6 @@
                 <w:sz w:val="18"/>
               </w:rPr>
               <w:t xml:space="preserve"> </w:t>
-            </w:r>
-          </w:p>
-          <w:p>
-            <w:pPr>
-              <w:spacing w:after="0" w:line="240" w:lineRule="auto"/>
-            </w:pPr>
-            <w:r>
-              <w:rPr>
-                <w:rFonts w:ascii="Consolas" w:hAnsi="Consolas" w:cs="Courier New"/>
-                <w:color w:val="9AA7B4"/>
-                <w:sz w:val="18"/>
-                <w:szCs w:val="18"/>
-                <w:lang w:val="en-US"/>
-              </w:rPr>
-              <w:t xml:space="preserve"># Borre un Pod a propósito y observe cuánto tarda en volver:</w:t>
             </w:r>
           </w:p>
           <w:p>
@@ -8010,7 +8589,7 @@
                 <w:szCs w:val="18"/>
                 <w:lang w:val="en-US"/>
               </w:rPr>
-              <w:t xml:space="preserve">kubectl -n lab delete pod &lt;nombre-del-pod&gt;</w:t>
+              <w:t xml:space="preserve">kubectl apply -f 00-namespace.yaml</w:t>
             </w:r>
           </w:p>
           <w:p>
@@ -8025,7 +8604,64 @@
                 <w:szCs w:val="18"/>
                 <w:lang w:val="en-US"/>
               </w:rPr>
-              <w:t xml:space="preserve">kubectl -n lab get pods</w:t>
+              <w:t xml:space="preserve">kubectl apply -f 10-deployment-guia.yaml</w:t>
+            </w:r>
+          </w:p>
+          <w:p>
+            <w:pPr>
+              <w:spacing w:after="0" w:line="240" w:lineRule="auto"/>
+            </w:pPr>
+            <w:r>
+              <w:rPr>
+                <w:rFonts w:ascii="Consolas" w:hAnsi="Consolas" w:cs="Courier New"/>
+                <w:color w:val="FFFFFF"/>
+                <w:sz w:val="18"/>
+                <w:szCs w:val="18"/>
+                <w:lang w:val="en-US"/>
+              </w:rPr>
+              <w:t xml:space="preserve">kubectl apply -f 11-service-guia.yaml</w:t>
+            </w:r>
+          </w:p>
+          <w:p>
+            <w:pPr>
+              <w:spacing w:after="0" w:line="240" w:lineRule="auto"/>
+            </w:pPr>
+            <w:r>
+              <w:rPr>
+                <w:rFonts w:ascii="Consolas" w:hAnsi="Consolas"/>
+                <w:sz w:val="18"/>
+              </w:rPr>
+              <w:t xml:space="preserve"> </w:t>
+            </w:r>
+          </w:p>
+          <w:p>
+            <w:pPr>
+              <w:spacing w:after="0" w:line="240" w:lineRule="auto"/>
+            </w:pPr>
+            <w:r>
+              <w:rPr>
+                <w:rFonts w:ascii="Consolas" w:hAnsi="Consolas" w:cs="Courier New"/>
+                <w:color w:val="FFFFFF"/>
+                <w:sz w:val="18"/>
+                <w:szCs w:val="18"/>
+                <w:lang w:val="en-US"/>
+              </w:rPr>
+              <w:t xml:space="preserve">kubectl -n lab rollout status deployment/guia</w:t>
+            </w:r>
+          </w:p>
+          <w:p>
+            <w:pPr>
+              <w:spacing w:after="0" w:line="240" w:lineRule="auto"/>
+            </w:pPr>
+            <w:r>
+              <w:rPr>
+                <w:rFonts w:ascii="Consolas" w:hAnsi="Consolas" w:cs="Courier New"/>
+                <w:color w:val="FFFFFF"/>
+                <w:sz w:val="18"/>
+                <w:szCs w:val="18"/>
+                <w:lang w:val="en-US"/>
+              </w:rPr>
+              <w:t xml:space="preserve">kubectl -n lab get deployment,replicaset,pod,service</w:t>
             </w:r>
           </w:p>
         </w:tc>
@@ -8042,7 +8678,36 @@
         <w:jc w:val="both"/>
       </w:pPr>
       <w:r>
-        <w:t xml:space="preserve">Fíjese en que el Pod que aparece tiene un nombre distinto. No resucitó: el ReplicaSet creó uno nuevo.</w:t>
+        <w:t xml:space="preserve">Abra </w:t>
+      </w:r>
+      <w:r>
+        <w:rPr>
+          <w:rStyle w:val="HTMLCode"/>
+          <w:rFonts w:eastAsiaTheme="minorHAnsi"/>
+          <w:color w:val="E83E8C"/>
+          <w:shd w:val="clear" w:color="auto" w:fill="F9F2F4"/>
+        </w:rPr>
+        <w:t xml:space="preserve">http://FQDN:30080</w:t>
+      </w:r>
+      <w:r>
+        <w:t xml:space="preserve"> en su navegador. La página trae una tarjeta que muestra qué Pod atendió la petición; el botón </w:t>
+      </w:r>
+      <w:r>
+        <w:rPr>
+          <w:i/>
+          <w:iCs/>
+        </w:rPr>
+        <w:t xml:space="preserve">Pedir la página otra vez</w:t>
+      </w:r>
+      <w:r>
+        <w:t xml:space="preserve"> vuelve a consultarla y, como la imagen desactiva las conexiones persistentes de nginx, cada petición se reparte de nuevo entre las réplicas y el nombre del Pod cambia. </w:t>
+      </w:r>
+      <w:r>
+        <w:rPr>
+          <w:b/>
+          <w:bCs/>
+        </w:rPr>
+        <w:t xml:space="preserve">A partir de aquí puede seguir el laboratorio leyendo desde el clúster.</w:t>
       </w:r>
     </w:p>
     <w:tbl>
@@ -8050,7 +8715,7 @@
         <w:tblW w:w="8829" w:type="dxa"/>
         <w:tblBorders>
           <w:top w:val="nil"/>
-          <w:left w:val="single" w:sz="36" w:space="0" w:color="6F42C1"/>
+          <w:left w:val="single" w:sz="36" w:space="0" w:color="2E74B5"/>
           <w:bottom w:val="nil"/>
           <w:right w:val="nil"/>
           <w:insideH w:val="nil"/>
@@ -8075,7 +8740,7 @@
         <w:tc>
           <w:tcPr>
             <w:tcW w:w="8829" w:type="dxa"/>
-            <w:shd w:val="clear" w:color="auto" w:fill="F3ECFA"/>
+            <w:shd w:val="clear" w:color="auto" w:fill="EAF2FB"/>
           </w:tcPr>
           <w:p>
             <w:pPr>
@@ -8086,12 +8751,48 @@
               <w:rPr>
                 <w:b/>
                 <w:bCs/>
-                <w:color w:val="6F42C1"/>
-              </w:rPr>
-              <w:t xml:space="preserve">Pregunta 3. </w:t>
-            </w:r>
-            <w:r>
-              <w:t xml:space="preserve">¿Por qué el Pod que se creó tiene un nombre distinto del que usted borró? ¿Qué componente lo creó y cómo supo que hacía falta?</w:t>
+                <w:color w:val="2E74B5"/>
+              </w:rPr>
+              <w:t xml:space="preserve">Si no carga, revise en este orden. </w:t>
+            </w:r>
+            <w:r>
+              <w:t xml:space="preserve">Primero </w:t>
+            </w:r>
+            <w:r>
+              <w:rPr>
+                <w:rStyle w:val="HTMLCode"/>
+                <w:rFonts w:eastAsiaTheme="minorHAnsi"/>
+                <w:color w:val="E83E8C"/>
+                <w:shd w:val="clear" w:color="auto" w:fill="F9F2F4"/>
+              </w:rPr>
+              <w:t xml:space="preserve">kubectl -n lab get pods</w:t>
+            </w:r>
+            <w:r>
+              <w:t xml:space="preserve"> (¿están en </w:t>
+            </w:r>
+            <w:r>
+              <w:rPr>
+                <w:rStyle w:val="HTMLCode"/>
+                <w:rFonts w:eastAsiaTheme="minorHAnsi"/>
+                <w:color w:val="E83E8C"/>
+                <w:shd w:val="clear" w:color="auto" w:fill="F9F2F4"/>
+              </w:rPr>
+              <w:t xml:space="preserve">Running</w:t>
+            </w:r>
+            <w:r>
+              <w:t xml:space="preserve">?); luego </w:t>
+            </w:r>
+            <w:r>
+              <w:rPr>
+                <w:rStyle w:val="HTMLCode"/>
+                <w:rFonts w:eastAsiaTheme="minorHAnsi"/>
+                <w:color w:val="E83E8C"/>
+                <w:shd w:val="clear" w:color="auto" w:fill="F9F2F4"/>
+              </w:rPr>
+              <w:t xml:space="preserve">systemctl status minikube-expose@30080</w:t>
+            </w:r>
+            <w:r>
+              <w:t xml:space="preserve"> (¿está activo el reenvío?); por último, la regla del NSG (¿su IP actual está autorizada?).</w:t>
             </w:r>
           </w:p>
         </w:tc>
@@ -8108,7 +8809,7 @@
         <w:spacing w:before="200" w:after="60"/>
       </w:pPr>
       <w:r>
-        <w:t>Parte 7. Actualización progresiva y reversión</w:t>
+        <w:t>Parte 5. Observar los Pods</w:t>
       </w:r>
     </w:p>
     <w:p>
@@ -8117,7 +8818,19 @@
         <w:jc w:val="both"/>
       </w:pPr>
       <w:r>
-        <w:t xml:space="preserve">Construya una segunda versión de la imagen y publíquela sin interrumpir el servicio.</w:t>
+        <w:t xml:space="preserve">Cuatro órdenes que se usan a diario. </w:t>
+      </w:r>
+      <w:r>
+        <w:rPr>
+          <w:rStyle w:val="HTMLCode"/>
+          <w:rFonts w:eastAsiaTheme="minorHAnsi"/>
+          <w:color w:val="E83E8C"/>
+          <w:shd w:val="clear" w:color="auto" w:fill="F9F2F4"/>
+        </w:rPr>
+        <w:t xml:space="preserve">describe</w:t>
+      </w:r>
+      <w:r>
+        <w:t xml:space="preserve"> termina con la lista de eventos, que es el primer sitio donde mirar cuando algo falla.</w:t>
       </w:r>
     </w:p>
     <w:tbl>
@@ -8165,7 +8878,7 @@
                 <w:szCs w:val="18"/>
                 <w:lang w:val="en-US"/>
               </w:rPr>
-              <w:t xml:space="preserve">cd ~/lab/app-guia</w:t>
+              <w:t xml:space="preserve">kubectl -n lab get pods -o wide</w:t>
             </w:r>
           </w:p>
           <w:p>
@@ -8180,7 +8893,7 @@
                 <w:szCs w:val="18"/>
                 <w:lang w:val="en-US"/>
               </w:rPr>
-              <w:t xml:space="preserve">sed -i 's|vive dentro del clúster|vive dentro del clúster · v2|' index.html</w:t>
+              <w:t xml:space="preserve">kubectl -n lab describe pod &lt;nombre-del-pod&gt;</w:t>
             </w:r>
           </w:p>
           <w:p>
@@ -8195,19 +8908,7 @@
                 <w:szCs w:val="18"/>
                 <w:lang w:val="en-US"/>
               </w:rPr>
-              <w:t xml:space="preserve">minikube image build -t guia-k8s:2.0 .</w:t>
-            </w:r>
-          </w:p>
-          <w:p>
-            <w:pPr>
-              <w:spacing w:after="0" w:line="240" w:lineRule="auto"/>
-            </w:pPr>
-            <w:r>
-              <w:rPr>
-                <w:rFonts w:ascii="Consolas" w:hAnsi="Consolas"/>
-                <w:sz w:val="18"/>
-              </w:rPr>
-              <w:t xml:space="preserve"> </w:t>
+              <w:t xml:space="preserve">kubectl -n lab logs -l app=guia --tail=20</w:t>
             </w:r>
           </w:p>
           <w:p>
@@ -8222,7 +8923,7 @@
                 <w:szCs w:val="18"/>
                 <w:lang w:val="en-US"/>
               </w:rPr>
-              <w:t xml:space="preserve">kubectl -n lab set image deployment/guia guia=guia-k8s:2.0</w:t>
+              <w:t xml:space="preserve">kubectl -n lab exec -it &lt;nombre-del-pod&gt; -- sh</w:t>
             </w:r>
           </w:p>
           <w:p>
@@ -8237,7 +8938,7 @@
                 <w:szCs w:val="18"/>
                 <w:lang w:val="en-US"/>
               </w:rPr>
-              <w:t xml:space="preserve">kubectl -n lab rollout status deployment/guia</w:t>
+              <w:t xml:space="preserve">  cat /usr/share/nginx/html/pod.json</w:t>
             </w:r>
           </w:p>
           <w:p>
@@ -8252,64 +8953,7 @@
                 <w:szCs w:val="18"/>
                 <w:lang w:val="en-US"/>
               </w:rPr>
-              <w:t xml:space="preserve">kubectl -n lab get replicasets</w:t>
-            </w:r>
-          </w:p>
-          <w:p>
-            <w:pPr>
-              <w:spacing w:after="0" w:line="240" w:lineRule="auto"/>
-            </w:pPr>
-            <w:r>
-              <w:rPr>
-                <w:rFonts w:ascii="Consolas" w:hAnsi="Consolas"/>
-                <w:sz w:val="18"/>
-              </w:rPr>
-              <w:t xml:space="preserve"> </w:t>
-            </w:r>
-          </w:p>
-          <w:p>
-            <w:pPr>
-              <w:spacing w:after="0" w:line="240" w:lineRule="auto"/>
-            </w:pPr>
-            <w:r>
-              <w:rPr>
-                <w:rFonts w:ascii="Consolas" w:hAnsi="Consolas" w:cs="Courier New"/>
-                <w:color w:val="9AA7B4"/>
-                <w:sz w:val="18"/>
-                <w:szCs w:val="18"/>
-                <w:lang w:val="en-US"/>
-              </w:rPr>
-              <w:t xml:space="preserve"># Regrese a la versión anterior:</w:t>
-            </w:r>
-          </w:p>
-          <w:p>
-            <w:pPr>
-              <w:spacing w:after="0" w:line="240" w:lineRule="auto"/>
-            </w:pPr>
-            <w:r>
-              <w:rPr>
-                <w:rFonts w:ascii="Consolas" w:hAnsi="Consolas" w:cs="Courier New"/>
-                <w:color w:val="FFFFFF"/>
-                <w:sz w:val="18"/>
-                <w:szCs w:val="18"/>
-                <w:lang w:val="en-US"/>
-              </w:rPr>
-              <w:t xml:space="preserve">kubectl -n lab rollout undo deployment/guia</w:t>
-            </w:r>
-          </w:p>
-          <w:p>
-            <w:pPr>
-              <w:spacing w:after="0" w:line="240" w:lineRule="auto"/>
-            </w:pPr>
-            <w:r>
-              <w:rPr>
-                <w:rFonts w:ascii="Consolas" w:hAnsi="Consolas" w:cs="Courier New"/>
-                <w:color w:val="FFFFFF"/>
-                <w:sz w:val="18"/>
-                <w:szCs w:val="18"/>
-                <w:lang w:val="en-US"/>
-              </w:rPr>
-              <w:t xml:space="preserve">kubectl -n lab rollout history deployment/guia</w:t>
+              <w:t xml:space="preserve">  exit</w:t>
             </w:r>
           </w:p>
         </w:tc>
@@ -8319,39 +8963,6 @@
       <w:pPr>
         <w:spacing w:after="0" w:line="140" w:lineRule="exact"/>
       </w:pPr>
-    </w:p>
-    <w:p>
-      <w:pPr>
-        <w:spacing w:after="120"/>
-        <w:jc w:val="both"/>
-      </w:pPr>
-      <w:r>
-        <w:t xml:space="preserve">Recargue el navegador mientras corre </w:t>
-      </w:r>
-      <w:r>
-        <w:rPr>
-          <w:rStyle w:val="HTMLCode"/>
-          <w:rFonts w:eastAsiaTheme="minorHAnsi"/>
-          <w:color w:val="E83E8C"/>
-          <w:shd w:val="clear" w:color="auto" w:fill="F9F2F4"/>
-        </w:rPr>
-        <w:t xml:space="preserve">rollout status</w:t>
-      </w:r>
-      <w:r>
-        <w:t xml:space="preserve">: el servicio nunca se cae, porque </w:t>
-      </w:r>
-      <w:r>
-        <w:rPr>
-          <w:rStyle w:val="HTMLCode"/>
-          <w:rFonts w:eastAsiaTheme="minorHAnsi"/>
-          <w:color w:val="E83E8C"/>
-          <w:shd w:val="clear" w:color="auto" w:fill="F9F2F4"/>
-        </w:rPr>
-        <w:t xml:space="preserve">maxUnavailable: 0</w:t>
-      </w:r>
-      <w:r>
-        <w:t xml:space="preserve"> obliga a mantener dos Pods disponibles durante el cambio.</w:t>
-      </w:r>
     </w:p>
     <w:tbl>
       <w:tblPr>
@@ -8396,7 +9007,10 @@
                 <w:bCs/>
                 <w:color w:val="6F42C1"/>
               </w:rPr>
-              <w:t xml:space="preserve">Pregunta 4. </w:t>
+              <w:t xml:space="preserve">Pregunta 2. </w:t>
+            </w:r>
+            <w:r>
+              <w:t xml:space="preserve">Anote las IPs que devuelve </w:t>
             </w:r>
             <w:r>
               <w:rPr>
@@ -8405,10 +9019,10 @@
                 <w:color w:val="E83E8C"/>
                 <w:shd w:val="clear" w:color="auto" w:fill="F9F2F4"/>
               </w:rPr>
-              <w:t xml:space="preserve">kubectl -n lab get replicasets</w:t>
-            </w:r>
-            <w:r>
-              <w:t xml:space="preserve"> muestra dos ReplicaSets. ¿Cuántas réplicas tiene cada uno y por qué Kubernetes conserva el antiguo en lugar de borrarlo?</w:t>
+              <w:t xml:space="preserve">kubectl -n lab get pods -o wide</w:t>
+            </w:r>
+            <w:r>
+              <w:t xml:space="preserve">. Reinicie un Pod y vuelva a mirarlas. ¿Qué implica esto para una aplicación que quisiera guardar la IP de otra en un archivo de configuración?</w:t>
             </w:r>
           </w:p>
         </w:tc>
@@ -8425,16 +9039,7 @@
         <w:spacing w:before="200" w:after="60"/>
       </w:pPr>
       <w:r>
-        <w:t>Parte 8. Publicar el Dashboard y consultar métricas</w:t>
-      </w:r>
-    </w:p>
-    <w:p>
-      <w:pPr>
-        <w:spacing w:after="120"/>
-        <w:jc w:val="both"/>
-      </w:pPr>
-      <w:r>
-        <w:t xml:space="preserve">El complemento ya está instalado; falta darle una puerta de salida con un Service de tipo NodePort. Se crea un Service nuevo en lugar de modificar el del complemento, porque minikube reconcilia sus propios objetos y revertiría el cambio.</w:t>
+        <w:t>Parte 6. Escalar y comprobar la autosanación</w:t>
       </w:r>
     </w:p>
     <w:tbl>
@@ -8482,7 +9087,7 @@
                 <w:szCs w:val="18"/>
                 <w:lang w:val="en-US"/>
               </w:rPr>
-              <w:t xml:space="preserve">kubectl apply -f ~/lab/manifests/40-dashboard-nodeport.yaml</w:t>
+              <w:t xml:space="preserve">kubectl -n lab scale deployment/guia --replicas=4</w:t>
             </w:r>
           </w:p>
           <w:p>
@@ -8497,7 +9102,17 @@
                 <w:szCs w:val="18"/>
                 <w:lang w:val="en-US"/>
               </w:rPr>
-              <w:t xml:space="preserve">kubectl -n kubernetes-dashboard get svc</w:t>
+              <w:t xml:space="preserve">kubectl -n lab get pods -w</w:t>
+            </w:r>
+            <w:r>
+              <w:rPr>
+                <w:rFonts w:ascii="Consolas" w:hAnsi="Consolas" w:cs="Courier New"/>
+                <w:color w:val="9AA7B4"/>
+                <w:sz w:val="18"/>
+                <w:szCs w:val="18"/>
+                <w:lang w:val="en-US"/>
+              </w:rPr>
+              <w:t xml:space="preserve">         # Ctrl-C para salir</w:t>
             </w:r>
           </w:p>
           <w:p>
@@ -8510,6 +9125,21 @@
                 <w:sz w:val="18"/>
               </w:rPr>
               <w:t xml:space="preserve"> </w:t>
+            </w:r>
+          </w:p>
+          <w:p>
+            <w:pPr>
+              <w:spacing w:after="0" w:line="240" w:lineRule="auto"/>
+            </w:pPr>
+            <w:r>
+              <w:rPr>
+                <w:rFonts w:ascii="Consolas" w:hAnsi="Consolas" w:cs="Courier New"/>
+                <w:color w:val="9AA7B4"/>
+                <w:sz w:val="18"/>
+                <w:szCs w:val="18"/>
+                <w:lang w:val="en-US"/>
+              </w:rPr>
+              <w:t xml:space="preserve"># Borre un Pod a propósito y observe cuánto tarda en volver:</w:t>
             </w:r>
           </w:p>
           <w:p>
@@ -8524,7 +9154,7 @@
                 <w:szCs w:val="18"/>
                 <w:lang w:val="en-US"/>
               </w:rPr>
-              <w:t xml:space="preserve">kubectl top nodes</w:t>
+              <w:t xml:space="preserve">kubectl -n lab delete pod &lt;nombre-del-pod&gt;</w:t>
             </w:r>
           </w:p>
           <w:p>
@@ -8539,7 +9169,7 @@
                 <w:szCs w:val="18"/>
                 <w:lang w:val="en-US"/>
               </w:rPr>
-              <w:t xml:space="preserve">kubectl top pods -n lab</w:t>
+              <w:t xml:space="preserve">kubectl -n lab get pods</w:t>
             </w:r>
           </w:p>
         </w:tc>
@@ -8556,62 +9186,65 @@
         <w:jc w:val="both"/>
       </w:pPr>
       <w:r>
-        <w:t xml:space="preserve">Abra </w:t>
-      </w:r>
-      <w:r>
-        <w:rPr>
-          <w:rStyle w:val="HTMLCode"/>
-          <w:rFonts w:eastAsiaTheme="minorHAnsi"/>
-          <w:color w:val="E83E8C"/>
-          <w:shd w:val="clear" w:color="auto" w:fill="F9F2F4"/>
-        </w:rPr>
-        <w:t xml:space="preserve">http://FQDN:30090</w:t>
-      </w:r>
-      <w:r>
-        <w:t xml:space="preserve"> y recorra </w:t>
-      </w:r>
-      <w:r>
-        <w:rPr>
-          <w:i/>
-          <w:iCs/>
-        </w:rPr>
-        <w:t xml:space="preserve">Workloads</w:t>
-      </w:r>
-      <w:r>
-        <w:t xml:space="preserve">, </w:t>
-      </w:r>
-      <w:r>
-        <w:rPr>
-          <w:i/>
-          <w:iCs/>
-        </w:rPr>
-        <w:t xml:space="preserve">Pods</w:t>
-      </w:r>
-      <w:r>
-        <w:t xml:space="preserve"> y </w:t>
-      </w:r>
-      <w:r>
-        <w:rPr>
-          <w:i/>
-          <w:iCs/>
-        </w:rPr>
-        <w:t xml:space="preserve">Services</w:t>
-      </w:r>
-      <w:r>
-        <w:t xml:space="preserve"> hasta ubicar el Deployment que creó. Compare lo que ve en la consola web con lo que devuelve </w:t>
-      </w:r>
-      <w:r>
-        <w:rPr>
-          <w:rStyle w:val="HTMLCode"/>
-          <w:rFonts w:eastAsiaTheme="minorHAnsi"/>
-          <w:color w:val="E83E8C"/>
-          <w:shd w:val="clear" w:color="auto" w:fill="F9F2F4"/>
-        </w:rPr>
-        <w:t xml:space="preserve">kubectl get</w:t>
-      </w:r>
-      <w:r>
-        <w:t xml:space="preserve">: es la misma información, leída de la misma API.</w:t>
-      </w:r>
+        <w:t xml:space="preserve">Fíjese en que el Pod que aparece tiene un nombre distinto. No resucitó: el ReplicaSet creó uno nuevo.</w:t>
+      </w:r>
+    </w:p>
+    <w:tbl>
+      <w:tblPr>
+        <w:tblW w:w="8829" w:type="dxa"/>
+        <w:tblBorders>
+          <w:top w:val="nil"/>
+          <w:left w:val="single" w:sz="36" w:space="0" w:color="6F42C1"/>
+          <w:bottom w:val="nil"/>
+          <w:right w:val="nil"/>
+          <w:insideH w:val="nil"/>
+          <w:insideV w:val="nil"/>
+        </w:tblBorders>
+        <w:tblLayout w:type="fixed"/>
+        <w:tblCellMar>
+          <w:top w:w="90" w:type="dxa"/>
+          <w:left w:w="180" w:type="dxa"/>
+          <w:bottom w:w="90" w:type="dxa"/>
+          <w:right w:w="140" w:type="dxa"/>
+        </w:tblCellMar>
+        <w:tblLook w:val="0600" w:firstRow="0" w:lastRow="0" w:firstColumn="0" w:lastColumn="0" w:noHBand="1" w:noVBand="1"/>
+      </w:tblPr>
+      <w:tblGrid>
+        <w:gridCol w:w="8829"/>
+      </w:tblGrid>
+      <w:tr>
+        <w:trPr>
+          <w:cantSplit/>
+        </w:trPr>
+        <w:tc>
+          <w:tcPr>
+            <w:tcW w:w="8829" w:type="dxa"/>
+            <w:shd w:val="clear" w:color="auto" w:fill="F3ECFA"/>
+          </w:tcPr>
+          <w:p>
+            <w:pPr>
+              <w:spacing w:before="30" w:after="30" w:line="252" w:lineRule="auto"/>
+              <w:jc w:val="both"/>
+            </w:pPr>
+            <w:r>
+              <w:rPr>
+                <w:b/>
+                <w:bCs/>
+                <w:color w:val="6F42C1"/>
+              </w:rPr>
+              <w:t xml:space="preserve">Pregunta 3. </w:t>
+            </w:r>
+            <w:r>
+              <w:t xml:space="preserve">¿Por qué el Pod que se creó tiene un nombre distinto del que usted borró? ¿Qué componente lo creó y cómo supo que hacía falta?</w:t>
+            </w:r>
+          </w:p>
+        </w:tc>
+      </w:tr>
+    </w:tbl>
+    <w:p>
+      <w:pPr>
+        <w:spacing w:after="0" w:line="140" w:lineRule="exact"/>
+      </w:pPr>
     </w:p>
     <w:p>
       <w:pPr>
@@ -8619,7 +9252,16 @@
         <w:spacing w:before="200" w:after="60"/>
       </w:pPr>
       <w:r>
-        <w:t>Parte 9. RBAC: una cuenta que solo mira</w:t>
+        <w:t>Parte 7. Actualización progresiva y reversión</w:t>
+      </w:r>
+    </w:p>
+    <w:p>
+      <w:pPr>
+        <w:spacing w:after="120"/>
+        <w:jc w:val="both"/>
+      </w:pPr>
+      <w:r>
+        <w:t xml:space="preserve">Construya una segunda versión de la imagen y publíquela sin interrumpir el servicio.</w:t>
       </w:r>
     </w:p>
     <w:tbl>
@@ -8667,7 +9309,7 @@
                 <w:szCs w:val="18"/>
                 <w:lang w:val="en-US"/>
               </w:rPr>
-              <w:t xml:space="preserve">cat ~/lab/manifests/20-rbac-observador.yaml</w:t>
+              <w:t xml:space="preserve">cd ~/lab/app-guia</w:t>
             </w:r>
           </w:p>
           <w:p>
@@ -8682,7 +9324,79 @@
                 <w:szCs w:val="18"/>
                 <w:lang w:val="en-US"/>
               </w:rPr>
-              <w:t xml:space="preserve">kubectl apply -f ~/lab/manifests/20-rbac-observador.yaml</w:t>
+              <w:t xml:space="preserve">sed -i 's|vive dentro del clúster|vive dentro del clúster · v2|' index.html</w:t>
+            </w:r>
+          </w:p>
+          <w:p>
+            <w:pPr>
+              <w:spacing w:after="0" w:line="240" w:lineRule="auto"/>
+            </w:pPr>
+            <w:r>
+              <w:rPr>
+                <w:rFonts w:ascii="Consolas" w:hAnsi="Consolas" w:cs="Courier New"/>
+                <w:color w:val="FFFFFF"/>
+                <w:sz w:val="18"/>
+                <w:szCs w:val="18"/>
+                <w:lang w:val="en-US"/>
+              </w:rPr>
+              <w:t xml:space="preserve">minikube image build -t guia-k8s:2.0 .</w:t>
+            </w:r>
+          </w:p>
+          <w:p>
+            <w:pPr>
+              <w:spacing w:after="0" w:line="240" w:lineRule="auto"/>
+            </w:pPr>
+            <w:r>
+              <w:rPr>
+                <w:rFonts w:ascii="Consolas" w:hAnsi="Consolas"/>
+                <w:sz w:val="18"/>
+              </w:rPr>
+              <w:t xml:space="preserve"> </w:t>
+            </w:r>
+          </w:p>
+          <w:p>
+            <w:pPr>
+              <w:spacing w:after="0" w:line="240" w:lineRule="auto"/>
+            </w:pPr>
+            <w:r>
+              <w:rPr>
+                <w:rFonts w:ascii="Consolas" w:hAnsi="Consolas" w:cs="Courier New"/>
+                <w:color w:val="FFFFFF"/>
+                <w:sz w:val="18"/>
+                <w:szCs w:val="18"/>
+                <w:lang w:val="en-US"/>
+              </w:rPr>
+              <w:t xml:space="preserve">kubectl -n lab set image deployment/guia guia=guia-k8s:2.0</w:t>
+            </w:r>
+          </w:p>
+          <w:p>
+            <w:pPr>
+              <w:spacing w:after="0" w:line="240" w:lineRule="auto"/>
+            </w:pPr>
+            <w:r>
+              <w:rPr>
+                <w:rFonts w:ascii="Consolas" w:hAnsi="Consolas" w:cs="Courier New"/>
+                <w:color w:val="FFFFFF"/>
+                <w:sz w:val="18"/>
+                <w:szCs w:val="18"/>
+                <w:lang w:val="en-US"/>
+              </w:rPr>
+              <w:t xml:space="preserve">kubectl -n lab rollout status deployment/guia</w:t>
+            </w:r>
+          </w:p>
+          <w:p>
+            <w:pPr>
+              <w:spacing w:after="0" w:line="240" w:lineRule="auto"/>
+            </w:pPr>
+            <w:r>
+              <w:rPr>
+                <w:rFonts w:ascii="Consolas" w:hAnsi="Consolas" w:cs="Courier New"/>
+                <w:color w:val="FFFFFF"/>
+                <w:sz w:val="18"/>
+                <w:szCs w:val="18"/>
+                <w:lang w:val="en-US"/>
+              </w:rPr>
+              <w:t xml:space="preserve">kubectl -n lab get replicasets</w:t>
             </w:r>
           </w:p>
           <w:p>
@@ -8709,7 +9423,7 @@
                 <w:szCs w:val="18"/>
                 <w:lang w:val="en-US"/>
               </w:rPr>
-              <w:t xml:space="preserve"># Verificación sin cambiar de identidad, suplantando a la cuenta:</w:t>
+              <w:t xml:space="preserve"># Regrese a la versión anterior:</w:t>
             </w:r>
           </w:p>
           <w:p>
@@ -8724,7 +9438,7 @@
                 <w:szCs w:val="18"/>
                 <w:lang w:val="en-US"/>
               </w:rPr>
-              <w:t xml:space="preserve">kubectl auth can-i list pods   --as=system:serviceaccount:lab:observador -n lab</w:t>
+              <w:t xml:space="preserve">kubectl -n lab rollout undo deployment/guia</w:t>
             </w:r>
           </w:p>
           <w:p>
@@ -8739,22 +9453,7 @@
                 <w:szCs w:val="18"/>
                 <w:lang w:val="en-US"/>
               </w:rPr>
-              <w:t xml:space="preserve">kubectl auth can-i delete pods --as=system:serviceaccount:lab:observador -n lab</w:t>
-            </w:r>
-          </w:p>
-          <w:p>
-            <w:pPr>
-              <w:spacing w:after="0" w:line="240" w:lineRule="auto"/>
-            </w:pPr>
-            <w:r>
-              <w:rPr>
-                <w:rFonts w:ascii="Consolas" w:hAnsi="Consolas" w:cs="Courier New"/>
-                <w:color w:val="FFFFFF"/>
-                <w:sz w:val="18"/>
-                <w:szCs w:val="18"/>
-                <w:lang w:val="en-US"/>
-              </w:rPr>
-              <w:t xml:space="preserve">kubectl auth can-i list pods   --as=system:serviceaccount:lab:observador -n kube-system</w:t>
+              <w:t xml:space="preserve">kubectl -n lab rollout history deployment/guia</w:t>
             </w:r>
           </w:p>
         </w:tc>
@@ -8771,7 +9470,7 @@
         <w:jc w:val="both"/>
       </w:pPr>
       <w:r>
-        <w:t xml:space="preserve">Debe obtener </w:t>
+        <w:t xml:space="preserve">Recargue el navegador mientras corre </w:t>
       </w:r>
       <w:r>
         <w:rPr>
@@ -8780,10 +9479,10 @@
           <w:color w:val="E83E8C"/>
           <w:shd w:val="clear" w:color="auto" w:fill="F9F2F4"/>
         </w:rPr>
-        <w:t xml:space="preserve">yes</w:t>
-      </w:r>
-      <w:r>
-        <w:t xml:space="preserve">, </w:t>
+        <w:t xml:space="preserve">rollout status</w:t>
+      </w:r>
+      <w:r>
+        <w:t xml:space="preserve">: el servicio nunca se cae, porque </w:t>
       </w:r>
       <w:r>
         <w:rPr>
@@ -8792,22 +9491,10 @@
           <w:color w:val="E83E8C"/>
           <w:shd w:val="clear" w:color="auto" w:fill="F9F2F4"/>
         </w:rPr>
-        <w:t xml:space="preserve">no</w:t>
-      </w:r>
-      <w:r>
-        <w:t xml:space="preserve"> y </w:t>
-      </w:r>
-      <w:r>
-        <w:rPr>
-          <w:rStyle w:val="HTMLCode"/>
-          <w:rFonts w:eastAsiaTheme="minorHAnsi"/>
-          <w:color w:val="E83E8C"/>
-          <w:shd w:val="clear" w:color="auto" w:fill="F9F2F4"/>
-        </w:rPr>
-        <w:t xml:space="preserve">no</w:t>
-      </w:r>
-      <w:r>
-        <w:t xml:space="preserve">. La tercera respuesta muestra que un Role solo vale dentro de su propio namespace.</w:t>
+        <w:t xml:space="preserve">maxUnavailable: 0</w:t>
+      </w:r>
+      <w:r>
+        <w:t xml:space="preserve"> obliga a mantener dos Pods disponibles durante el cambio.</w:t>
       </w:r>
     </w:p>
     <w:tbl>
@@ -8853,10 +9540,7 @@
                 <w:bCs/>
                 <w:color w:val="6F42C1"/>
               </w:rPr>
-              <w:t xml:space="preserve">Pregunta 5. </w:t>
-            </w:r>
-            <w:r>
-              <w:t xml:space="preserve">La cuenta </w:t>
+              <w:t xml:space="preserve">Pregunta 4. </w:t>
             </w:r>
             <w:r>
               <w:rPr>
@@ -8865,34 +9549,10 @@
                 <w:color w:val="E83E8C"/>
                 <w:shd w:val="clear" w:color="auto" w:fill="F9F2F4"/>
               </w:rPr>
-              <w:t xml:space="preserve">observador</w:t>
-            </w:r>
-            <w:r>
-              <w:t xml:space="preserve"> puede listar Pods en </w:t>
-            </w:r>
-            <w:r>
-              <w:rPr>
-                <w:rStyle w:val="HTMLCode"/>
-                <w:rFonts w:eastAsiaTheme="minorHAnsi"/>
-                <w:color w:val="E83E8C"/>
-                <w:shd w:val="clear" w:color="auto" w:fill="F9F2F4"/>
-              </w:rPr>
-              <w:t xml:space="preserve">lab</w:t>
-            </w:r>
-            <w:r>
-              <w:t xml:space="preserve"> pero no en </w:t>
-            </w:r>
-            <w:r>
-              <w:rPr>
-                <w:rStyle w:val="HTMLCode"/>
-                <w:rFonts w:eastAsiaTheme="minorHAnsi"/>
-                <w:color w:val="E83E8C"/>
-                <w:shd w:val="clear" w:color="auto" w:fill="F9F2F4"/>
-              </w:rPr>
-              <w:t xml:space="preserve">kube-system</w:t>
-            </w:r>
-            <w:r>
-              <w:t xml:space="preserve">. ¿Qué objeto habría que cambiar para concederle esa lectura en todo el clúster, y por qué eso es una decisión de seguridad y no un detalle técnico?</w:t>
+              <w:t xml:space="preserve">kubectl -n lab get replicasets</w:t>
+            </w:r>
+            <w:r>
+              <w:t xml:space="preserve"> muestra dos ReplicaSets. ¿Cuántas réplicas tiene cada uno y por qué Kubernetes conserva el antiguo en lugar de borrarlo?</w:t>
             </w:r>
           </w:p>
         </w:tc>
@@ -8909,7 +9569,7 @@
         <w:spacing w:before="200" w:after="60"/>
       </w:pPr>
       <w:r>
-        <w:t>Parte 10. Construir y publicar su propio portal</w:t>
+        <w:t>Parte 8. Publicar el Dashboard y consultar métricas</w:t>
       </w:r>
     </w:p>
     <w:p>
@@ -8918,31 +9578,7 @@
         <w:jc w:val="both"/>
       </w:pPr>
       <w:r>
-        <w:t xml:space="preserve">Ahora el ciclo completo por su cuenta, con la carpeta </w:t>
-      </w:r>
-      <w:r>
-        <w:rPr>
-          <w:rStyle w:val="HTMLCode"/>
-          <w:rFonts w:eastAsiaTheme="minorHAnsi"/>
-          <w:color w:val="E83E8C"/>
-          <w:shd w:val="clear" w:color="auto" w:fill="F9F2F4"/>
-        </w:rPr>
-        <w:t xml:space="preserve">~/lab/app-portal</w:t>
-      </w:r>
-      <w:r>
-        <w:t xml:space="preserve">, que trae el mismo </w:t>
-      </w:r>
-      <w:r>
-        <w:rPr>
-          <w:rStyle w:val="HTMLCode"/>
-          <w:rFonts w:eastAsiaTheme="minorHAnsi"/>
-          <w:color w:val="E83E8C"/>
-          <w:shd w:val="clear" w:color="auto" w:fill="F9F2F4"/>
-        </w:rPr>
-        <w:t xml:space="preserve">Dockerfile</w:t>
-      </w:r>
-      <w:r>
-        <w:t xml:space="preserve"> con comentarios en cada instrucción. Empiece por personalizar la página y el metadato de autor.</w:t>
+        <w:t xml:space="preserve">El complemento ya está instalado; falta darle una puerta de salida con un Service de tipo NodePort. Se crea un Service nuevo en lugar de modificar el del complemento, porque minikube reconcilia sus propios objetos y revertiría el cambio.</w:t>
       </w:r>
     </w:p>
     <w:tbl>
@@ -8990,7 +9626,7 @@
                 <w:szCs w:val="18"/>
                 <w:lang w:val="en-US"/>
               </w:rPr>
-              <w:t xml:space="preserve">cd ~/lab/app-portal</w:t>
+              <w:t xml:space="preserve">kubectl apply -f ~/lab/manifests/40-dashboard-nodeport.yaml</w:t>
             </w:r>
           </w:p>
           <w:p>
@@ -9005,17 +9641,19 @@
                 <w:szCs w:val="18"/>
                 <w:lang w:val="en-US"/>
               </w:rPr>
-              <w:t xml:space="preserve">nano index.html</w:t>
-            </w:r>
-            <w:r>
-              <w:rPr>
-                <w:rFonts w:ascii="Consolas" w:hAnsi="Consolas" w:cs="Courier New"/>
-                <w:color w:val="9AA7B4"/>
+              <w:t xml:space="preserve">kubectl -n kubernetes-dashboard get svc</w:t>
+            </w:r>
+          </w:p>
+          <w:p>
+            <w:pPr>
+              <w:spacing w:after="0" w:line="240" w:lineRule="auto"/>
+            </w:pPr>
+            <w:r>
+              <w:rPr>
+                <w:rFonts w:ascii="Consolas" w:hAnsi="Consolas"/>
                 <w:sz w:val="18"/>
-                <w:szCs w:val="18"/>
-                <w:lang w:val="en-US"/>
-              </w:rPr>
-              <w:t xml:space="preserve">        # cambie el título y ponga su nombre</w:t>
+              </w:rPr>
+              <w:t xml:space="preserve"> </w:t>
             </w:r>
           </w:p>
           <w:p>
@@ -9030,29 +9668,7 @@
                 <w:szCs w:val="18"/>
                 <w:lang w:val="en-US"/>
               </w:rPr>
-              <w:t xml:space="preserve">nano Dockerfile</w:t>
-            </w:r>
-            <w:r>
-              <w:rPr>
-                <w:rFonts w:ascii="Consolas" w:hAnsi="Consolas" w:cs="Courier New"/>
-                <w:color w:val="9AA7B4"/>
-                <w:sz w:val="18"/>
-                <w:szCs w:val="18"/>
-                <w:lang w:val="en-US"/>
-              </w:rPr>
-              <w:t xml:space="preserve">        # reemplace el LABEL autor</w:t>
-            </w:r>
-          </w:p>
-          <w:p>
-            <w:pPr>
-              <w:spacing w:after="0" w:line="240" w:lineRule="auto"/>
-            </w:pPr>
-            <w:r>
-              <w:rPr>
-                <w:rFonts w:ascii="Consolas" w:hAnsi="Consolas"/>
-                <w:sz w:val="18"/>
-              </w:rPr>
-              <w:t xml:space="preserve"> </w:t>
+              <w:t xml:space="preserve">kubectl top nodes</w:t>
             </w:r>
           </w:p>
           <w:p>
@@ -9067,22 +9683,7 @@
                 <w:szCs w:val="18"/>
                 <w:lang w:val="en-US"/>
               </w:rPr>
-              <w:t xml:space="preserve">minikube image build -t portal:1.0 .</w:t>
-            </w:r>
-          </w:p>
-          <w:p>
-            <w:pPr>
-              <w:spacing w:after="0" w:line="240" w:lineRule="auto"/>
-            </w:pPr>
-            <w:r>
-              <w:rPr>
-                <w:rFonts w:ascii="Consolas" w:hAnsi="Consolas" w:cs="Courier New"/>
-                <w:color w:val="FFFFFF"/>
-                <w:sz w:val="18"/>
-                <w:szCs w:val="18"/>
-                <w:lang w:val="en-US"/>
-              </w:rPr>
-              <w:t xml:space="preserve">minikube image ls | grep portal</w:t>
+              <w:t xml:space="preserve">kubectl top pods -n lab</w:t>
             </w:r>
           </w:p>
         </w:tc>
@@ -9099,7 +9700,7 @@
         <w:jc w:val="both"/>
       </w:pPr>
       <w:r>
-        <w:t xml:space="preserve">El Deployment ya está escrito en </w:t>
+        <w:t xml:space="preserve">Abra </w:t>
       </w:r>
       <w:r>
         <w:rPr>
@@ -9108,20 +9709,40 @@
           <w:color w:val="E83E8C"/>
           <w:shd w:val="clear" w:color="auto" w:fill="F9F2F4"/>
         </w:rPr>
-        <w:t xml:space="preserve">50-deployment-portal.yaml</w:t>
-      </w:r>
-      <w:r>
-        <w:t xml:space="preserve">. </w:t>
+        <w:t xml:space="preserve">http://FQDN:30090</w:t>
+      </w:r>
+      <w:r>
+        <w:t xml:space="preserve"> y recorra </w:t>
       </w:r>
       <w:r>
         <w:rPr>
-          <w:b/>
-          <w:bCs/>
+          <w:i/>
+          <w:iCs/>
         </w:rPr>
-        <w:t xml:space="preserve">El Service lo escribe usted</w:t>
-      </w:r>
-      <w:r>
-        <w:t xml:space="preserve">: tome </w:t>
+        <w:t xml:space="preserve">Workloads</w:t>
+      </w:r>
+      <w:r>
+        <w:t xml:space="preserve">, </w:t>
+      </w:r>
+      <w:r>
+        <w:rPr>
+          <w:i/>
+          <w:iCs/>
+        </w:rPr>
+        <w:t xml:space="preserve">Pods</w:t>
+      </w:r>
+      <w:r>
+        <w:t xml:space="preserve"> y </w:t>
+      </w:r>
+      <w:r>
+        <w:rPr>
+          <w:i/>
+          <w:iCs/>
+        </w:rPr>
+        <w:t xml:space="preserve">Services</w:t>
+      </w:r>
+      <w:r>
+        <w:t xml:space="preserve"> hasta ubicar el Deployment que creó. Compare lo que ve en la consola web con lo que devuelve </w:t>
       </w:r>
       <w:r>
         <w:rPr>
@@ -9130,34 +9751,19 @@
           <w:color w:val="E83E8C"/>
           <w:shd w:val="clear" w:color="auto" w:fill="F9F2F4"/>
         </w:rPr>
-        <w:t xml:space="preserve">11-service-guia.yaml</w:t>
-      </w:r>
-      <w:r>
-        <w:t xml:space="preserve"> como modelo, cámbiele el namespace, el selector y el </w:t>
-      </w:r>
-      <w:r>
-        <w:rPr>
-          <w:rStyle w:val="HTMLCode"/>
-          <w:rFonts w:eastAsiaTheme="minorHAnsi"/>
-          <w:color w:val="E83E8C"/>
-          <w:shd w:val="clear" w:color="auto" w:fill="F9F2F4"/>
-        </w:rPr>
-        <w:t xml:space="preserve">nodePort</w:t>
-      </w:r>
-      <w:r>
-        <w:t xml:space="preserve"> a 30081, y guárdelo como </w:t>
-      </w:r>
-      <w:r>
-        <w:rPr>
-          <w:rStyle w:val="HTMLCode"/>
-          <w:rFonts w:eastAsiaTheme="minorHAnsi"/>
-          <w:color w:val="E83E8C"/>
-          <w:shd w:val="clear" w:color="auto" w:fill="F9F2F4"/>
-        </w:rPr>
-        <w:t xml:space="preserve">mi-service.yaml</w:t>
-      </w:r>
-      <w:r>
-        <w:t xml:space="preserve">. Solo después compare con el archivo de referencia.</w:t>
+        <w:t xml:space="preserve">kubectl get</w:t>
+      </w:r>
+      <w:r>
+        <w:t xml:space="preserve">: es la misma información, leída de la misma API.</w:t>
+      </w:r>
+    </w:p>
+    <w:p>
+      <w:pPr>
+        <w:pStyle w:val="Heading2"/>
+        <w:spacing w:before="200" w:after="60"/>
+      </w:pPr>
+      <w:r>
+        <w:t>Parte 9. RBAC: una cuenta que solo mira</w:t>
       </w:r>
     </w:p>
     <w:tbl>
@@ -9205,7 +9811,7 @@
                 <w:szCs w:val="18"/>
                 <w:lang w:val="en-US"/>
               </w:rPr>
-              <w:t xml:space="preserve">cd ~/lab/manifests</w:t>
+              <w:t xml:space="preserve">cat ~/lab/manifests/20-rbac-observador.yaml</w:t>
             </w:r>
           </w:p>
           <w:p>
@@ -9220,7 +9826,34 @@
                 <w:szCs w:val="18"/>
                 <w:lang w:val="en-US"/>
               </w:rPr>
-              <w:t xml:space="preserve">kubectl apply -f 00-namespace.yaml</w:t>
+              <w:t xml:space="preserve">kubectl apply -f ~/lab/manifests/20-rbac-observador.yaml</w:t>
+            </w:r>
+          </w:p>
+          <w:p>
+            <w:pPr>
+              <w:spacing w:after="0" w:line="240" w:lineRule="auto"/>
+            </w:pPr>
+            <w:r>
+              <w:rPr>
+                <w:rFonts w:ascii="Consolas" w:hAnsi="Consolas"/>
+                <w:sz w:val="18"/>
+              </w:rPr>
+              <w:t xml:space="preserve"> </w:t>
+            </w:r>
+          </w:p>
+          <w:p>
+            <w:pPr>
+              <w:spacing w:after="0" w:line="240" w:lineRule="auto"/>
+            </w:pPr>
+            <w:r>
+              <w:rPr>
+                <w:rFonts w:ascii="Consolas" w:hAnsi="Consolas" w:cs="Courier New"/>
+                <w:color w:val="9AA7B4"/>
+                <w:sz w:val="18"/>
+                <w:szCs w:val="18"/>
+                <w:lang w:val="en-US"/>
+              </w:rPr>
+              <w:t xml:space="preserve"># Verificación sin cambiar de identidad, suplantando a la cuenta:</w:t>
             </w:r>
           </w:p>
           <w:p>
@@ -9235,7 +9868,7 @@
                 <w:szCs w:val="18"/>
                 <w:lang w:val="en-US"/>
               </w:rPr>
-              <w:t xml:space="preserve">kubectl apply -f 50-deployment-portal.yaml</w:t>
+              <w:t xml:space="preserve">kubectl auth can-i list pods   --as=system:serviceaccount:lab:observador -n lab</w:t>
             </w:r>
           </w:p>
           <w:p>
@@ -9250,29 +9883,7 @@
                 <w:szCs w:val="18"/>
                 <w:lang w:val="en-US"/>
               </w:rPr>
-              <w:t xml:space="preserve">kubectl apply -f mi-service.yaml</w:t>
-            </w:r>
-            <w:r>
-              <w:rPr>
-                <w:rFonts w:ascii="Consolas" w:hAnsi="Consolas" w:cs="Courier New"/>
-                <w:color w:val="9AA7B4"/>
-                <w:sz w:val="18"/>
-                <w:szCs w:val="18"/>
-                <w:lang w:val="en-US"/>
-              </w:rPr>
-              <w:t xml:space="preserve">          # el suyo</w:t>
-            </w:r>
-          </w:p>
-          <w:p>
-            <w:pPr>
-              <w:spacing w:after="0" w:line="240" w:lineRule="auto"/>
-            </w:pPr>
-            <w:r>
-              <w:rPr>
-                <w:rFonts w:ascii="Consolas" w:hAnsi="Consolas"/>
-                <w:sz w:val="18"/>
-              </w:rPr>
-              <w:t xml:space="preserve"> </w:t>
+              <w:t xml:space="preserve">kubectl auth can-i delete pods --as=system:serviceaccount:lab:observador -n lab</w:t>
             </w:r>
           </w:p>
           <w:p>
@@ -9287,22 +9898,7 @@
                 <w:szCs w:val="18"/>
                 <w:lang w:val="en-US"/>
               </w:rPr>
-              <w:t xml:space="preserve">kubectl -n portal get deployment,pod,svc</w:t>
-            </w:r>
-          </w:p>
-          <w:p>
-            <w:pPr>
-              <w:spacing w:after="0" w:line="240" w:lineRule="auto"/>
-            </w:pPr>
-            <w:r>
-              <w:rPr>
-                <w:rFonts w:ascii="Consolas" w:hAnsi="Consolas" w:cs="Courier New"/>
-                <w:color w:val="FFFFFF"/>
-                <w:sz w:val="18"/>
-                <w:szCs w:val="18"/>
-                <w:lang w:val="en-US"/>
-              </w:rPr>
-              <w:t xml:space="preserve">diff mi-service.yaml 51-service-portal.yaml</w:t>
+              <w:t xml:space="preserve">kubectl auth can-i list pods   --as=system:serviceaccount:lab:observador -n kube-system</w:t>
             </w:r>
           </w:p>
         </w:tc>
@@ -9319,7 +9915,7 @@
         <w:jc w:val="both"/>
       </w:pPr>
       <w:r>
-        <w:t xml:space="preserve">Abra </w:t>
+        <w:t xml:space="preserve">Debe obtener </w:t>
       </w:r>
       <w:r>
         <w:rPr>
@@ -9328,20 +9924,169 @@
           <w:color w:val="E83E8C"/>
           <w:shd w:val="clear" w:color="auto" w:fill="F9F2F4"/>
         </w:rPr>
-        <w:t xml:space="preserve">http://FQDN:30081</w:t>
-      </w:r>
-      <w:r>
-        <w:t xml:space="preserve">. Si el navegador no responde, mire primero los </w:t>
+        <w:t xml:space="preserve">yes</w:t>
+      </w:r>
+      <w:r>
+        <w:t xml:space="preserve">, </w:t>
       </w:r>
       <w:r>
         <w:rPr>
-          <w:i/>
-          <w:iCs/>
+          <w:rStyle w:val="HTMLCode"/>
+          <w:rFonts w:eastAsiaTheme="minorHAnsi"/>
+          <w:color w:val="E83E8C"/>
+          <w:shd w:val="clear" w:color="auto" w:fill="F9F2F4"/>
         </w:rPr>
-        <w:t xml:space="preserve">endpoints</w:t>
-      </w:r>
-      <w:r>
-        <w:t xml:space="preserve">: si la lista sale vacía, el selector del Service no coincide con las etiquetas de los Pods, que es el error más frecuente.</w:t>
+        <w:t xml:space="preserve">no</w:t>
+      </w:r>
+      <w:r>
+        <w:t xml:space="preserve"> y </w:t>
+      </w:r>
+      <w:r>
+        <w:rPr>
+          <w:rStyle w:val="HTMLCode"/>
+          <w:rFonts w:eastAsiaTheme="minorHAnsi"/>
+          <w:color w:val="E83E8C"/>
+          <w:shd w:val="clear" w:color="auto" w:fill="F9F2F4"/>
+        </w:rPr>
+        <w:t xml:space="preserve">no</w:t>
+      </w:r>
+      <w:r>
+        <w:t xml:space="preserve">. La tercera respuesta muestra que un Role solo vale dentro de su propio namespace.</w:t>
+      </w:r>
+    </w:p>
+    <w:tbl>
+      <w:tblPr>
+        <w:tblW w:w="8829" w:type="dxa"/>
+        <w:tblBorders>
+          <w:top w:val="nil"/>
+          <w:left w:val="single" w:sz="36" w:space="0" w:color="6F42C1"/>
+          <w:bottom w:val="nil"/>
+          <w:right w:val="nil"/>
+          <w:insideH w:val="nil"/>
+          <w:insideV w:val="nil"/>
+        </w:tblBorders>
+        <w:tblLayout w:type="fixed"/>
+        <w:tblCellMar>
+          <w:top w:w="90" w:type="dxa"/>
+          <w:left w:w="180" w:type="dxa"/>
+          <w:bottom w:w="90" w:type="dxa"/>
+          <w:right w:w="140" w:type="dxa"/>
+        </w:tblCellMar>
+        <w:tblLook w:val="0600" w:firstRow="0" w:lastRow="0" w:firstColumn="0" w:lastColumn="0" w:noHBand="1" w:noVBand="1"/>
+      </w:tblPr>
+      <w:tblGrid>
+        <w:gridCol w:w="8829"/>
+      </w:tblGrid>
+      <w:tr>
+        <w:trPr>
+          <w:cantSplit/>
+        </w:trPr>
+        <w:tc>
+          <w:tcPr>
+            <w:tcW w:w="8829" w:type="dxa"/>
+            <w:shd w:val="clear" w:color="auto" w:fill="F3ECFA"/>
+          </w:tcPr>
+          <w:p>
+            <w:pPr>
+              <w:spacing w:before="30" w:after="30" w:line="252" w:lineRule="auto"/>
+              <w:jc w:val="both"/>
+            </w:pPr>
+            <w:r>
+              <w:rPr>
+                <w:b/>
+                <w:bCs/>
+                <w:color w:val="6F42C1"/>
+              </w:rPr>
+              <w:t xml:space="preserve">Pregunta 5. </w:t>
+            </w:r>
+            <w:r>
+              <w:t xml:space="preserve">La cuenta </w:t>
+            </w:r>
+            <w:r>
+              <w:rPr>
+                <w:rStyle w:val="HTMLCode"/>
+                <w:rFonts w:eastAsiaTheme="minorHAnsi"/>
+                <w:color w:val="E83E8C"/>
+                <w:shd w:val="clear" w:color="auto" w:fill="F9F2F4"/>
+              </w:rPr>
+              <w:t xml:space="preserve">observador</w:t>
+            </w:r>
+            <w:r>
+              <w:t xml:space="preserve"> puede listar Pods en </w:t>
+            </w:r>
+            <w:r>
+              <w:rPr>
+                <w:rStyle w:val="HTMLCode"/>
+                <w:rFonts w:eastAsiaTheme="minorHAnsi"/>
+                <w:color w:val="E83E8C"/>
+                <w:shd w:val="clear" w:color="auto" w:fill="F9F2F4"/>
+              </w:rPr>
+              <w:t xml:space="preserve">lab</w:t>
+            </w:r>
+            <w:r>
+              <w:t xml:space="preserve"> pero no en </w:t>
+            </w:r>
+            <w:r>
+              <w:rPr>
+                <w:rStyle w:val="HTMLCode"/>
+                <w:rFonts w:eastAsiaTheme="minorHAnsi"/>
+                <w:color w:val="E83E8C"/>
+                <w:shd w:val="clear" w:color="auto" w:fill="F9F2F4"/>
+              </w:rPr>
+              <w:t xml:space="preserve">kube-system</w:t>
+            </w:r>
+            <w:r>
+              <w:t xml:space="preserve">. ¿Qué objeto habría que cambiar para concederle esa lectura en todo el clúster, y por qué eso es una decisión de seguridad y no un detalle técnico?</w:t>
+            </w:r>
+          </w:p>
+        </w:tc>
+      </w:tr>
+    </w:tbl>
+    <w:p>
+      <w:pPr>
+        <w:spacing w:after="0" w:line="140" w:lineRule="exact"/>
+      </w:pPr>
+    </w:p>
+    <w:p>
+      <w:pPr>
+        <w:pStyle w:val="Heading2"/>
+        <w:spacing w:before="200" w:after="60"/>
+      </w:pPr>
+      <w:r>
+        <w:t>Parte 10. Construir y publicar su propio portal</w:t>
+      </w:r>
+    </w:p>
+    <w:p>
+      <w:pPr>
+        <w:spacing w:after="120"/>
+        <w:jc w:val="both"/>
+      </w:pPr>
+      <w:r>
+        <w:t xml:space="preserve">Ahora el ciclo completo por su cuenta, con la carpeta </w:t>
+      </w:r>
+      <w:r>
+        <w:rPr>
+          <w:rStyle w:val="HTMLCode"/>
+          <w:rFonts w:eastAsiaTheme="minorHAnsi"/>
+          <w:color w:val="E83E8C"/>
+          <w:shd w:val="clear" w:color="auto" w:fill="F9F2F4"/>
+        </w:rPr>
+        <w:t xml:space="preserve">~/lab/app-portal</w:t>
+      </w:r>
+      <w:r>
+        <w:t xml:space="preserve">, que trae el mismo </w:t>
+      </w:r>
+      <w:r>
+        <w:rPr>
+          <w:rStyle w:val="HTMLCode"/>
+          <w:rFonts w:eastAsiaTheme="minorHAnsi"/>
+          <w:color w:val="E83E8C"/>
+          <w:shd w:val="clear" w:color="auto" w:fill="F9F2F4"/>
+        </w:rPr>
+        <w:t xml:space="preserve">Dockerfile</w:t>
+      </w:r>
+      <w:r>
+        <w:t xml:space="preserve"> con comentarios en cada instrucción. Empiece por personalizar la página y el metadato de autor.</w:t>
       </w:r>
     </w:p>
     <w:tbl>
@@ -9389,7 +10134,7 @@
                 <w:szCs w:val="18"/>
                 <w:lang w:val="en-US"/>
               </w:rPr>
-              <w:t xml:space="preserve">kubectl -n portal get endpoints portal</w:t>
+              <w:t xml:space="preserve">cd ~/lab/app-portal</w:t>
             </w:r>
           </w:p>
           <w:p>
@@ -9404,7 +10149,84 @@
                 <w:szCs w:val="18"/>
                 <w:lang w:val="en-US"/>
               </w:rPr>
-              <w:t xml:space="preserve">kubectl -n portal describe svc portal</w:t>
+              <w:t xml:space="preserve">nano index.html</w:t>
+            </w:r>
+            <w:r>
+              <w:rPr>
+                <w:rFonts w:ascii="Consolas" w:hAnsi="Consolas" w:cs="Courier New"/>
+                <w:color w:val="9AA7B4"/>
+                <w:sz w:val="18"/>
+                <w:szCs w:val="18"/>
+                <w:lang w:val="en-US"/>
+              </w:rPr>
+              <w:t xml:space="preserve">        # cambie el título y ponga su nombre</w:t>
+            </w:r>
+          </w:p>
+          <w:p>
+            <w:pPr>
+              <w:spacing w:after="0" w:line="240" w:lineRule="auto"/>
+            </w:pPr>
+            <w:r>
+              <w:rPr>
+                <w:rFonts w:ascii="Consolas" w:hAnsi="Consolas" w:cs="Courier New"/>
+                <w:color w:val="FFFFFF"/>
+                <w:sz w:val="18"/>
+                <w:szCs w:val="18"/>
+                <w:lang w:val="en-US"/>
+              </w:rPr>
+              <w:t xml:space="preserve">nano Dockerfile</w:t>
+            </w:r>
+            <w:r>
+              <w:rPr>
+                <w:rFonts w:ascii="Consolas" w:hAnsi="Consolas" w:cs="Courier New"/>
+                <w:color w:val="9AA7B4"/>
+                <w:sz w:val="18"/>
+                <w:szCs w:val="18"/>
+                <w:lang w:val="en-US"/>
+              </w:rPr>
+              <w:t xml:space="preserve">        # reemplace el LABEL autor</w:t>
+            </w:r>
+          </w:p>
+          <w:p>
+            <w:pPr>
+              <w:spacing w:after="0" w:line="240" w:lineRule="auto"/>
+            </w:pPr>
+            <w:r>
+              <w:rPr>
+                <w:rFonts w:ascii="Consolas" w:hAnsi="Consolas"/>
+                <w:sz w:val="18"/>
+              </w:rPr>
+              <w:t xml:space="preserve"> </w:t>
+            </w:r>
+          </w:p>
+          <w:p>
+            <w:pPr>
+              <w:spacing w:after="0" w:line="240" w:lineRule="auto"/>
+            </w:pPr>
+            <w:r>
+              <w:rPr>
+                <w:rFonts w:ascii="Consolas" w:hAnsi="Consolas" w:cs="Courier New"/>
+                <w:color w:val="FFFFFF"/>
+                <w:sz w:val="18"/>
+                <w:szCs w:val="18"/>
+                <w:lang w:val="en-US"/>
+              </w:rPr>
+              <w:t xml:space="preserve">minikube image build -t portal:1.0 .</w:t>
+            </w:r>
+          </w:p>
+          <w:p>
+            <w:pPr>
+              <w:spacing w:after="0" w:line="240" w:lineRule="auto"/>
+            </w:pPr>
+            <w:r>
+              <w:rPr>
+                <w:rFonts w:ascii="Consolas" w:hAnsi="Consolas" w:cs="Courier New"/>
+                <w:color w:val="FFFFFF"/>
+                <w:sz w:val="18"/>
+                <w:szCs w:val="18"/>
+                <w:lang w:val="en-US"/>
+              </w:rPr>
+              <w:t xml:space="preserve">minikube image ls | grep portal</w:t>
             </w:r>
           </w:p>
         </w:tc>
@@ -9421,7 +10243,7 @@
         <w:jc w:val="both"/>
       </w:pPr>
       <w:r>
-        <w:t xml:space="preserve">Para cerrar, edite otra vez la página, construya </w:t>
+        <w:t xml:space="preserve">El Deployment ya está escrito en </w:t>
       </w:r>
       <w:r>
         <w:rPr>
@@ -9430,10 +10252,56 @@
           <w:color w:val="E83E8C"/>
           <w:shd w:val="clear" w:color="auto" w:fill="F9F2F4"/>
         </w:rPr>
-        <w:t xml:space="preserve">portal:1.1</w:t>
-      </w:r>
-      <w:r>
-        <w:t xml:space="preserve"> y publíquela con una actualización progresiva:</w:t>
+        <w:t xml:space="preserve">50-deployment-portal.yaml</w:t>
+      </w:r>
+      <w:r>
+        <w:t xml:space="preserve">. </w:t>
+      </w:r>
+      <w:r>
+        <w:rPr>
+          <w:b/>
+          <w:bCs/>
+        </w:rPr>
+        <w:t xml:space="preserve">El Service lo escribe usted</w:t>
+      </w:r>
+      <w:r>
+        <w:t xml:space="preserve">: tome </w:t>
+      </w:r>
+      <w:r>
+        <w:rPr>
+          <w:rStyle w:val="HTMLCode"/>
+          <w:rFonts w:eastAsiaTheme="minorHAnsi"/>
+          <w:color w:val="E83E8C"/>
+          <w:shd w:val="clear" w:color="auto" w:fill="F9F2F4"/>
+        </w:rPr>
+        <w:t xml:space="preserve">11-service-guia.yaml</w:t>
+      </w:r>
+      <w:r>
+        <w:t xml:space="preserve"> como modelo, cámbiele el namespace, el selector y el </w:t>
+      </w:r>
+      <w:r>
+        <w:rPr>
+          <w:rStyle w:val="HTMLCode"/>
+          <w:rFonts w:eastAsiaTheme="minorHAnsi"/>
+          <w:color w:val="E83E8C"/>
+          <w:shd w:val="clear" w:color="auto" w:fill="F9F2F4"/>
+        </w:rPr>
+        <w:t xml:space="preserve">nodePort</w:t>
+      </w:r>
+      <w:r>
+        <w:t xml:space="preserve"> a 30081, y guárdelo como </w:t>
+      </w:r>
+      <w:r>
+        <w:rPr>
+          <w:rStyle w:val="HTMLCode"/>
+          <w:rFonts w:eastAsiaTheme="minorHAnsi"/>
+          <w:color w:val="E83E8C"/>
+          <w:shd w:val="clear" w:color="auto" w:fill="F9F2F4"/>
+        </w:rPr>
+        <w:t xml:space="preserve">mi-service.yaml</w:t>
+      </w:r>
+      <w:r>
+        <w:t xml:space="preserve">. Solo después compare con el archivo de referencia.</w:t>
       </w:r>
     </w:p>
     <w:tbl>
@@ -9481,7 +10349,7 @@
                 <w:szCs w:val="18"/>
                 <w:lang w:val="en-US"/>
               </w:rPr>
-              <w:t xml:space="preserve">cd ~/lab/app-portal &amp;&amp; minikube image build -t portal:1.1 .</w:t>
+              <w:t xml:space="preserve">cd ~/lab/manifests</w:t>
             </w:r>
           </w:p>
           <w:p>
@@ -9496,7 +10364,7 @@
                 <w:szCs w:val="18"/>
                 <w:lang w:val="en-US"/>
               </w:rPr>
-              <w:t xml:space="preserve">kubectl -n portal set image deployment/portal portal=portal:1.1</w:t>
+              <w:t xml:space="preserve">kubectl apply -f 00-namespace.yaml</w:t>
             </w:r>
           </w:p>
           <w:p>
@@ -9511,7 +10379,74 @@
                 <w:szCs w:val="18"/>
                 <w:lang w:val="en-US"/>
               </w:rPr>
-              <w:t xml:space="preserve">kubectl -n portal rollout status deployment/portal</w:t>
+              <w:t xml:space="preserve">kubectl apply -f 50-deployment-portal.yaml</w:t>
+            </w:r>
+          </w:p>
+          <w:p>
+            <w:pPr>
+              <w:spacing w:after="0" w:line="240" w:lineRule="auto"/>
+            </w:pPr>
+            <w:r>
+              <w:rPr>
+                <w:rFonts w:ascii="Consolas" w:hAnsi="Consolas" w:cs="Courier New"/>
+                <w:color w:val="FFFFFF"/>
+                <w:sz w:val="18"/>
+                <w:szCs w:val="18"/>
+                <w:lang w:val="en-US"/>
+              </w:rPr>
+              <w:t xml:space="preserve">kubectl apply -f mi-service.yaml</w:t>
+            </w:r>
+            <w:r>
+              <w:rPr>
+                <w:rFonts w:ascii="Consolas" w:hAnsi="Consolas" w:cs="Courier New"/>
+                <w:color w:val="9AA7B4"/>
+                <w:sz w:val="18"/>
+                <w:szCs w:val="18"/>
+                <w:lang w:val="en-US"/>
+              </w:rPr>
+              <w:t xml:space="preserve">          # el suyo</w:t>
+            </w:r>
+          </w:p>
+          <w:p>
+            <w:pPr>
+              <w:spacing w:after="0" w:line="240" w:lineRule="auto"/>
+            </w:pPr>
+            <w:r>
+              <w:rPr>
+                <w:rFonts w:ascii="Consolas" w:hAnsi="Consolas"/>
+                <w:sz w:val="18"/>
+              </w:rPr>
+              <w:t xml:space="preserve"> </w:t>
+            </w:r>
+          </w:p>
+          <w:p>
+            <w:pPr>
+              <w:spacing w:after="0" w:line="240" w:lineRule="auto"/>
+            </w:pPr>
+            <w:r>
+              <w:rPr>
+                <w:rFonts w:ascii="Consolas" w:hAnsi="Consolas" w:cs="Courier New"/>
+                <w:color w:val="FFFFFF"/>
+                <w:sz w:val="18"/>
+                <w:szCs w:val="18"/>
+                <w:lang w:val="en-US"/>
+              </w:rPr>
+              <w:t xml:space="preserve">kubectl -n portal get deployment,pod,svc</w:t>
+            </w:r>
+          </w:p>
+          <w:p>
+            <w:pPr>
+              <w:spacing w:after="0" w:line="240" w:lineRule="auto"/>
+            </w:pPr>
+            <w:r>
+              <w:rPr>
+                <w:rFonts w:ascii="Consolas" w:hAnsi="Consolas" w:cs="Courier New"/>
+                <w:color w:val="FFFFFF"/>
+                <w:sz w:val="18"/>
+                <w:szCs w:val="18"/>
+                <w:lang w:val="en-US"/>
+              </w:rPr>
+              <w:t xml:space="preserve">diff mi-service.yaml 51-service-portal.yaml</w:t>
             </w:r>
           </w:p>
         </w:tc>
@@ -9522,196 +10457,35 @@
         <w:spacing w:after="0" w:line="140" w:lineRule="exact"/>
       </w:pPr>
     </w:p>
-    <w:tbl>
-      <w:tblPr>
-        <w:tblW w:w="8829" w:type="dxa"/>
-        <w:tblBorders>
-          <w:top w:val="nil"/>
-          <w:left w:val="single" w:sz="36" w:space="0" w:color="6F42C1"/>
-          <w:bottom w:val="nil"/>
-          <w:right w:val="nil"/>
-          <w:insideH w:val="nil"/>
-          <w:insideV w:val="nil"/>
-        </w:tblBorders>
-        <w:tblLayout w:type="fixed"/>
-        <w:tblCellMar>
-          <w:top w:w="90" w:type="dxa"/>
-          <w:left w:w="180" w:type="dxa"/>
-          <w:bottom w:w="90" w:type="dxa"/>
-          <w:right w:w="140" w:type="dxa"/>
-        </w:tblCellMar>
-        <w:tblLook w:val="0600" w:firstRow="0" w:lastRow="0" w:firstColumn="0" w:lastColumn="0" w:noHBand="1" w:noVBand="1"/>
-      </w:tblPr>
-      <w:tblGrid>
-        <w:gridCol w:w="8829"/>
-      </w:tblGrid>
-      <w:tr>
-        <w:trPr>
-          <w:cantSplit/>
-        </w:trPr>
-        <w:tc>
-          <w:tcPr>
-            <w:tcW w:w="8829" w:type="dxa"/>
-            <w:shd w:val="clear" w:color="auto" w:fill="F3ECFA"/>
-          </w:tcPr>
-          <w:p>
-            <w:pPr>
-              <w:spacing w:before="30" w:after="30" w:line="252" w:lineRule="auto"/>
-              <w:jc w:val="both"/>
-            </w:pPr>
-            <w:r>
-              <w:rPr>
-                <w:b/>
-                <w:bCs/>
-                <w:color w:val="6F42C1"/>
-              </w:rPr>
-              <w:t xml:space="preserve">Pregunta 6. </w:t>
-            </w:r>
-            <w:r>
-              <w:t xml:space="preserve">Construyó la imagen con </w:t>
-            </w:r>
-            <w:r>
-              <w:rPr>
-                <w:rStyle w:val="HTMLCode"/>
-                <w:rFonts w:eastAsiaTheme="minorHAnsi"/>
-                <w:color w:val="E83E8C"/>
-                <w:shd w:val="clear" w:color="auto" w:fill="F9F2F4"/>
-              </w:rPr>
-              <w:t xml:space="preserve">docker build</w:t>
-            </w:r>
-            <w:r>
-              <w:t xml:space="preserve"> y el Pod quedó en </w:t>
-            </w:r>
-            <w:r>
-              <w:rPr>
-                <w:rStyle w:val="HTMLCode"/>
-                <w:rFonts w:eastAsiaTheme="minorHAnsi"/>
-                <w:color w:val="E83E8C"/>
-                <w:shd w:val="clear" w:color="auto" w:fill="F9F2F4"/>
-              </w:rPr>
-              <w:t xml:space="preserve">ErrImagePull</w:t>
-            </w:r>
-            <w:r>
-              <w:t xml:space="preserve"> hasta que la construyó con </w:t>
-            </w:r>
-            <w:r>
-              <w:rPr>
-                <w:rStyle w:val="HTMLCode"/>
-                <w:rFonts w:eastAsiaTheme="minorHAnsi"/>
-                <w:color w:val="E83E8C"/>
-                <w:shd w:val="clear" w:color="auto" w:fill="F9F2F4"/>
-              </w:rPr>
-              <w:t xml:space="preserve">minikube image build</w:t>
-            </w:r>
-            <w:r>
-              <w:t xml:space="preserve">. Explique dónde estaba guardada cada copia y por qué el clúster no veía la primera.</w:t>
-            </w:r>
-          </w:p>
-        </w:tc>
-      </w:tr>
-    </w:tbl>
-    <w:p>
-      <w:pPr>
-        <w:spacing w:after="0" w:line="140" w:lineRule="exact"/>
-      </w:pPr>
-    </w:p>
-    <w:tbl>
-      <w:tblPr>
-        <w:tblW w:w="8829" w:type="dxa"/>
-        <w:tblBorders>
-          <w:top w:val="nil"/>
-          <w:left w:val="single" w:sz="36" w:space="0" w:color="6F42C1"/>
-          <w:bottom w:val="nil"/>
-          <w:right w:val="nil"/>
-          <w:insideH w:val="nil"/>
-          <w:insideV w:val="nil"/>
-        </w:tblBorders>
-        <w:tblLayout w:type="fixed"/>
-        <w:tblCellMar>
-          <w:top w:w="90" w:type="dxa"/>
-          <w:left w:w="180" w:type="dxa"/>
-          <w:bottom w:w="90" w:type="dxa"/>
-          <w:right w:w="140" w:type="dxa"/>
-        </w:tblCellMar>
-        <w:tblLook w:val="0600" w:firstRow="0" w:lastRow="0" w:firstColumn="0" w:lastColumn="0" w:noHBand="1" w:noVBand="1"/>
-      </w:tblPr>
-      <w:tblGrid>
-        <w:gridCol w:w="8829"/>
-      </w:tblGrid>
-      <w:tr>
-        <w:trPr>
-          <w:cantSplit/>
-        </w:trPr>
-        <w:tc>
-          <w:tcPr>
-            <w:tcW w:w="8829" w:type="dxa"/>
-            <w:shd w:val="clear" w:color="auto" w:fill="F3ECFA"/>
-          </w:tcPr>
-          <w:p>
-            <w:pPr>
-              <w:spacing w:before="30" w:after="30" w:line="252" w:lineRule="auto"/>
-              <w:jc w:val="both"/>
-            </w:pPr>
-            <w:r>
-              <w:rPr>
-                <w:b/>
-                <w:bCs/>
-                <w:color w:val="6F42C1"/>
-              </w:rPr>
-              <w:t xml:space="preserve">Pregunta 7. </w:t>
-            </w:r>
-            <w:r>
-              <w:t xml:space="preserve">Reconstruya la imagen del portal cambiando el HTML pero conservando la etiqueta </w:t>
-            </w:r>
-            <w:r>
-              <w:rPr>
-                <w:rStyle w:val="HTMLCode"/>
-                <w:rFonts w:eastAsiaTheme="minorHAnsi"/>
-                <w:color w:val="E83E8C"/>
-                <w:shd w:val="clear" w:color="auto" w:fill="F9F2F4"/>
-              </w:rPr>
-              <w:t xml:space="preserve">1.0</w:t>
-            </w:r>
-            <w:r>
-              <w:t xml:space="preserve">, y aplique de nuevo el Deployment. ¿Cambió algo en el navegador? ¿Por qué, y qué dice esto sobre usar </w:t>
-            </w:r>
-            <w:r>
-              <w:rPr>
-                <w:rStyle w:val="HTMLCode"/>
-                <w:rFonts w:eastAsiaTheme="minorHAnsi"/>
-                <w:color w:val="E83E8C"/>
-                <w:shd w:val="clear" w:color="auto" w:fill="F9F2F4"/>
-              </w:rPr>
-              <w:t xml:space="preserve">latest</w:t>
-            </w:r>
-            <w:r>
-              <w:t xml:space="preserve"> en producción?</w:t>
-            </w:r>
-          </w:p>
-        </w:tc>
-      </w:tr>
-    </w:tbl>
-    <w:p>
-      <w:pPr>
-        <w:spacing w:after="0" w:line="140" w:lineRule="exact"/>
-      </w:pPr>
-    </w:p>
-    <w:p>
-      <w:pPr>
-        <w:pStyle w:val="Heading2"/>
-        <w:spacing w:before="200" w:after="60"/>
-      </w:pPr>
-      <w:r>
-        <w:t>Parte 11 (opcional). Ingress en el puerto 80</w:t>
-      </w:r>
-    </w:p>
     <w:p>
       <w:pPr>
         <w:spacing w:after="120"/>
         <w:jc w:val="both"/>
       </w:pPr>
       <w:r>
-        <w:t xml:space="preserve">En lugar de recordar el puerto 30080, publique la aplicación en el 80 con el controlador de Ingress. El NSG debe tener abierto el puerto 80 hacia su IP.</w:t>
+        <w:t xml:space="preserve">Abra </w:t>
+      </w:r>
+      <w:r>
+        <w:rPr>
+          <w:rStyle w:val="HTMLCode"/>
+          <w:rFonts w:eastAsiaTheme="minorHAnsi"/>
+          <w:color w:val="E83E8C"/>
+          <w:shd w:val="clear" w:color="auto" w:fill="F9F2F4"/>
+        </w:rPr>
+        <w:t xml:space="preserve">http://FQDN:30081</w:t>
+      </w:r>
+      <w:r>
+        <w:t xml:space="preserve">. Si el navegador no responde, mire primero los </w:t>
+      </w:r>
+      <w:r>
+        <w:rPr>
+          <w:i/>
+          <w:iCs/>
+        </w:rPr>
+        <w:t xml:space="preserve">endpoints</w:t>
+      </w:r>
+      <w:r>
+        <w:t xml:space="preserve">: si la lista sale vacía, el selector del Service no coincide con las etiquetas de los Pods, que es el error más frecuente.</w:t>
       </w:r>
     </w:p>
     <w:tbl>
@@ -9759,7 +10533,7 @@
                 <w:szCs w:val="18"/>
                 <w:lang w:val="en-US"/>
               </w:rPr>
-              <w:t xml:space="preserve">kubectl apply -f ~/lab/manifests/30-ingress-guia.yaml</w:t>
+              <w:t xml:space="preserve">kubectl -n portal get endpoints portal</w:t>
             </w:r>
           </w:p>
           <w:p>
@@ -9774,22 +10548,7 @@
                 <w:szCs w:val="18"/>
                 <w:lang w:val="en-US"/>
               </w:rPr>
-              <w:t xml:space="preserve">sudo systemctl enable --now minikube-expose@80</w:t>
-            </w:r>
-          </w:p>
-          <w:p>
-            <w:pPr>
-              <w:spacing w:after="0" w:line="240" w:lineRule="auto"/>
-            </w:pPr>
-            <w:r>
-              <w:rPr>
-                <w:rFonts w:ascii="Consolas" w:hAnsi="Consolas" w:cs="Courier New"/>
-                <w:color w:val="FFFFFF"/>
-                <w:sz w:val="18"/>
-                <w:szCs w:val="18"/>
-                <w:lang w:val="en-US"/>
-              </w:rPr>
-              <w:t xml:space="preserve">kubectl -n lab get ingress</w:t>
+              <w:t xml:space="preserve">kubectl -n portal describe svc portal</w:t>
             </w:r>
           </w:p>
         </w:tc>
@@ -9806,7 +10565,7 @@
         <w:jc w:val="both"/>
       </w:pPr>
       <w:r>
-        <w:t xml:space="preserve">Abra </w:t>
+        <w:t xml:space="preserve">Para cerrar, edite otra vez la página, construya </w:t>
       </w:r>
       <w:r>
         <w:rPr>
@@ -9815,34 +10574,97 @@
           <w:color w:val="E83E8C"/>
           <w:shd w:val="clear" w:color="auto" w:fill="F9F2F4"/>
         </w:rPr>
-        <w:t xml:space="preserve">http://FQDN</w:t>
-      </w:r>
-      <w:r>
-        <w:t xml:space="preserve">, ya sin puerto.</w:t>
-      </w:r>
-    </w:p>
-    <w:p>
-      <w:r>
-        <w:br w:type="page"/>
-      </w:r>
-    </w:p>
-    <w:p>
-      <w:pPr>
-        <w:pStyle w:val="Heading1"/>
-        <w:spacing w:after="80"/>
-      </w:pPr>
-      <w:r>
-        <w:t>Preguntas finales</w:t>
-      </w:r>
-    </w:p>
-    <w:p>
-      <w:pPr>
-        <w:spacing w:after="120"/>
-        <w:jc w:val="both"/>
-      </w:pPr>
-      <w:r>
-        <w:t xml:space="preserve">Además de las preguntas embebidas en las partes anteriores, responda estas dos. Acompañe cada respuesta con la captura o la salida de consola que la sustenta.</w:t>
-      </w:r>
+        <w:t xml:space="preserve">portal:1.1</w:t>
+      </w:r>
+      <w:r>
+        <w:t xml:space="preserve"> y publíquela con una actualización progresiva:</w:t>
+      </w:r>
+    </w:p>
+    <w:tbl>
+      <w:tblPr>
+        <w:tblStyle w:val="TableGrid"/>
+        <w:tblW w:w="8829" w:type="dxa"/>
+        <w:tblBorders>
+          <w:top w:val="nil"/>
+          <w:left w:val="nil"/>
+          <w:bottom w:val="nil"/>
+          <w:right w:val="nil"/>
+          <w:insideH w:val="nil"/>
+          <w:insideV w:val="nil"/>
+        </w:tblBorders>
+        <w:tblLayout w:type="fixed"/>
+        <w:tblCellMar>
+          <w:top w:w="100" w:type="dxa"/>
+          <w:left w:w="140" w:type="dxa"/>
+          <w:bottom w:w="100" w:type="dxa"/>
+          <w:right w:w="140" w:type="dxa"/>
+        </w:tblCellMar>
+        <w:tblLook w:val="0600" w:firstRow="0" w:lastRow="0" w:firstColumn="0" w:lastColumn="0" w:noHBand="1" w:noVBand="1"/>
+      </w:tblPr>
+      <w:tblGrid>
+        <w:gridCol w:w="8829"/>
+      </w:tblGrid>
+      <w:tr>
+        <w:trPr>
+          <w:cantSplit/>
+        </w:trPr>
+        <w:tc>
+          <w:tcPr>
+            <w:tcW w:w="8829" w:type="dxa"/>
+            <w:shd w:val="clear" w:color="auto" w:fill="1E1E1E"/>
+          </w:tcPr>
+          <w:p>
+            <w:pPr>
+              <w:spacing w:after="0" w:line="240" w:lineRule="auto"/>
+            </w:pPr>
+            <w:r>
+              <w:rPr>
+                <w:rFonts w:ascii="Consolas" w:hAnsi="Consolas" w:cs="Courier New"/>
+                <w:color w:val="FFFFFF"/>
+                <w:sz w:val="18"/>
+                <w:szCs w:val="18"/>
+                <w:lang w:val="en-US"/>
+              </w:rPr>
+              <w:t xml:space="preserve">cd ~/lab/app-portal &amp;&amp; minikube image build -t portal:1.1 .</w:t>
+            </w:r>
+          </w:p>
+          <w:p>
+            <w:pPr>
+              <w:spacing w:after="0" w:line="240" w:lineRule="auto"/>
+            </w:pPr>
+            <w:r>
+              <w:rPr>
+                <w:rFonts w:ascii="Consolas" w:hAnsi="Consolas" w:cs="Courier New"/>
+                <w:color w:val="FFFFFF"/>
+                <w:sz w:val="18"/>
+                <w:szCs w:val="18"/>
+                <w:lang w:val="en-US"/>
+              </w:rPr>
+              <w:t xml:space="preserve">kubectl -n portal set image deployment/portal portal=portal:1.1</w:t>
+            </w:r>
+          </w:p>
+          <w:p>
+            <w:pPr>
+              <w:spacing w:after="0" w:line="240" w:lineRule="auto"/>
+            </w:pPr>
+            <w:r>
+              <w:rPr>
+                <w:rFonts w:ascii="Consolas" w:hAnsi="Consolas" w:cs="Courier New"/>
+                <w:color w:val="FFFFFF"/>
+                <w:sz w:val="18"/>
+                <w:szCs w:val="18"/>
+                <w:lang w:val="en-US"/>
+              </w:rPr>
+              <w:t xml:space="preserve">kubectl -n portal rollout status deployment/portal</w:t>
+            </w:r>
+          </w:p>
+        </w:tc>
+      </w:tr>
+    </w:tbl>
+    <w:p>
+      <w:pPr>
+        <w:spacing w:after="0" w:line="140" w:lineRule="exact"/>
+      </w:pPr>
     </w:p>
     <w:tbl>
       <w:tblPr>
@@ -9887,10 +10709,46 @@
                 <w:bCs/>
                 <w:color w:val="6F42C1"/>
               </w:rPr>
-              <w:t xml:space="preserve">Pregunta 8. </w:t>
-            </w:r>
-            <w:r>
-              <w:t xml:space="preserve">Explique el recorrido completo de una petición desde su navegador hasta el proceso nginx, nombrando en orden cada pieza que la atiende. Indique cuál de ellas no existiría en un clúster de producción y por qué.</w:t>
+              <w:t xml:space="preserve">Pregunta 6. </w:t>
+            </w:r>
+            <w:r>
+              <w:t xml:space="preserve">Construyó la imagen con </w:t>
+            </w:r>
+            <w:r>
+              <w:rPr>
+                <w:rStyle w:val="HTMLCode"/>
+                <w:rFonts w:eastAsiaTheme="minorHAnsi"/>
+                <w:color w:val="E83E8C"/>
+                <w:shd w:val="clear" w:color="auto" w:fill="F9F2F4"/>
+              </w:rPr>
+              <w:t xml:space="preserve">docker build</w:t>
+            </w:r>
+            <w:r>
+              <w:t xml:space="preserve"> y el Pod quedó en </w:t>
+            </w:r>
+            <w:r>
+              <w:rPr>
+                <w:rStyle w:val="HTMLCode"/>
+                <w:rFonts w:eastAsiaTheme="minorHAnsi"/>
+                <w:color w:val="E83E8C"/>
+                <w:shd w:val="clear" w:color="auto" w:fill="F9F2F4"/>
+              </w:rPr>
+              <w:t xml:space="preserve">ErrImagePull</w:t>
+            </w:r>
+            <w:r>
+              <w:t xml:space="preserve"> hasta que la construyó con </w:t>
+            </w:r>
+            <w:r>
+              <w:rPr>
+                <w:rStyle w:val="HTMLCode"/>
+                <w:rFonts w:eastAsiaTheme="minorHAnsi"/>
+                <w:color w:val="E83E8C"/>
+                <w:shd w:val="clear" w:color="auto" w:fill="F9F2F4"/>
+              </w:rPr>
+              <w:t xml:space="preserve">minikube image build</w:t>
+            </w:r>
+            <w:r>
+              <w:t xml:space="preserve">. Explique dónde estaba guardada cada copia y por qué el clúster no veía la primera.</w:t>
             </w:r>
           </w:p>
         </w:tc>
@@ -9944,6 +10802,292 @@
                 <w:bCs/>
                 <w:color w:val="6F42C1"/>
               </w:rPr>
+              <w:t xml:space="preserve">Pregunta 7. </w:t>
+            </w:r>
+            <w:r>
+              <w:t xml:space="preserve">Reconstruya la imagen del portal cambiando el HTML pero conservando la etiqueta </w:t>
+            </w:r>
+            <w:r>
+              <w:rPr>
+                <w:rStyle w:val="HTMLCode"/>
+                <w:rFonts w:eastAsiaTheme="minorHAnsi"/>
+                <w:color w:val="E83E8C"/>
+                <w:shd w:val="clear" w:color="auto" w:fill="F9F2F4"/>
+              </w:rPr>
+              <w:t xml:space="preserve">1.0</w:t>
+            </w:r>
+            <w:r>
+              <w:t xml:space="preserve">, y aplique de nuevo el Deployment. ¿Cambió algo en el navegador? ¿Por qué, y qué dice esto sobre usar </w:t>
+            </w:r>
+            <w:r>
+              <w:rPr>
+                <w:rStyle w:val="HTMLCode"/>
+                <w:rFonts w:eastAsiaTheme="minorHAnsi"/>
+                <w:color w:val="E83E8C"/>
+                <w:shd w:val="clear" w:color="auto" w:fill="F9F2F4"/>
+              </w:rPr>
+              <w:t xml:space="preserve">latest</w:t>
+            </w:r>
+            <w:r>
+              <w:t xml:space="preserve"> en producción?</w:t>
+            </w:r>
+          </w:p>
+        </w:tc>
+      </w:tr>
+    </w:tbl>
+    <w:p>
+      <w:pPr>
+        <w:spacing w:after="0" w:line="140" w:lineRule="exact"/>
+      </w:pPr>
+    </w:p>
+    <w:p>
+      <w:pPr>
+        <w:pStyle w:val="Heading2"/>
+        <w:spacing w:before="200" w:after="60"/>
+      </w:pPr>
+      <w:r>
+        <w:t>Parte 11 (opcional). Ingress en el puerto 80</w:t>
+      </w:r>
+    </w:p>
+    <w:p>
+      <w:pPr>
+        <w:spacing w:after="120"/>
+        <w:jc w:val="both"/>
+      </w:pPr>
+      <w:r>
+        <w:t xml:space="preserve">En lugar de recordar el puerto 30080, publique la aplicación en el 80 con el controlador de Ingress. El NSG debe tener abierto el puerto 80 hacia su IP.</w:t>
+      </w:r>
+    </w:p>
+    <w:tbl>
+      <w:tblPr>
+        <w:tblStyle w:val="TableGrid"/>
+        <w:tblW w:w="8829" w:type="dxa"/>
+        <w:tblBorders>
+          <w:top w:val="nil"/>
+          <w:left w:val="nil"/>
+          <w:bottom w:val="nil"/>
+          <w:right w:val="nil"/>
+          <w:insideH w:val="nil"/>
+          <w:insideV w:val="nil"/>
+        </w:tblBorders>
+        <w:tblLayout w:type="fixed"/>
+        <w:tblCellMar>
+          <w:top w:w="100" w:type="dxa"/>
+          <w:left w:w="140" w:type="dxa"/>
+          <w:bottom w:w="100" w:type="dxa"/>
+          <w:right w:w="140" w:type="dxa"/>
+        </w:tblCellMar>
+        <w:tblLook w:val="0600" w:firstRow="0" w:lastRow="0" w:firstColumn="0" w:lastColumn="0" w:noHBand="1" w:noVBand="1"/>
+      </w:tblPr>
+      <w:tblGrid>
+        <w:gridCol w:w="8829"/>
+      </w:tblGrid>
+      <w:tr>
+        <w:trPr>
+          <w:cantSplit/>
+        </w:trPr>
+        <w:tc>
+          <w:tcPr>
+            <w:tcW w:w="8829" w:type="dxa"/>
+            <w:shd w:val="clear" w:color="auto" w:fill="1E1E1E"/>
+          </w:tcPr>
+          <w:p>
+            <w:pPr>
+              <w:spacing w:after="0" w:line="240" w:lineRule="auto"/>
+            </w:pPr>
+            <w:r>
+              <w:rPr>
+                <w:rFonts w:ascii="Consolas" w:hAnsi="Consolas" w:cs="Courier New"/>
+                <w:color w:val="FFFFFF"/>
+                <w:sz w:val="18"/>
+                <w:szCs w:val="18"/>
+                <w:lang w:val="en-US"/>
+              </w:rPr>
+              <w:t xml:space="preserve">kubectl apply -f ~/lab/manifests/30-ingress-guia.yaml</w:t>
+            </w:r>
+          </w:p>
+          <w:p>
+            <w:pPr>
+              <w:spacing w:after="0" w:line="240" w:lineRule="auto"/>
+            </w:pPr>
+            <w:r>
+              <w:rPr>
+                <w:rFonts w:ascii="Consolas" w:hAnsi="Consolas" w:cs="Courier New"/>
+                <w:color w:val="FFFFFF"/>
+                <w:sz w:val="18"/>
+                <w:szCs w:val="18"/>
+                <w:lang w:val="en-US"/>
+              </w:rPr>
+              <w:t xml:space="preserve">sudo systemctl enable --now minikube-expose@80</w:t>
+            </w:r>
+          </w:p>
+          <w:p>
+            <w:pPr>
+              <w:spacing w:after="0" w:line="240" w:lineRule="auto"/>
+            </w:pPr>
+            <w:r>
+              <w:rPr>
+                <w:rFonts w:ascii="Consolas" w:hAnsi="Consolas" w:cs="Courier New"/>
+                <w:color w:val="FFFFFF"/>
+                <w:sz w:val="18"/>
+                <w:szCs w:val="18"/>
+                <w:lang w:val="en-US"/>
+              </w:rPr>
+              <w:t xml:space="preserve">kubectl -n lab get ingress</w:t>
+            </w:r>
+          </w:p>
+        </w:tc>
+      </w:tr>
+    </w:tbl>
+    <w:p>
+      <w:pPr>
+        <w:spacing w:after="0" w:line="140" w:lineRule="exact"/>
+      </w:pPr>
+    </w:p>
+    <w:p>
+      <w:pPr>
+        <w:spacing w:after="120"/>
+        <w:jc w:val="both"/>
+      </w:pPr>
+      <w:r>
+        <w:t xml:space="preserve">Abra </w:t>
+      </w:r>
+      <w:r>
+        <w:rPr>
+          <w:rStyle w:val="HTMLCode"/>
+          <w:rFonts w:eastAsiaTheme="minorHAnsi"/>
+          <w:color w:val="E83E8C"/>
+          <w:shd w:val="clear" w:color="auto" w:fill="F9F2F4"/>
+        </w:rPr>
+        <w:t xml:space="preserve">http://FQDN</w:t>
+      </w:r>
+      <w:r>
+        <w:t xml:space="preserve">, ya sin puerto.</w:t>
+      </w:r>
+    </w:p>
+    <w:p>
+      <w:r>
+        <w:br w:type="page"/>
+      </w:r>
+    </w:p>
+    <w:p>
+      <w:pPr>
+        <w:pStyle w:val="Heading1"/>
+        <w:spacing w:after="80"/>
+      </w:pPr>
+      <w:r>
+        <w:t>Preguntas finales</w:t>
+      </w:r>
+    </w:p>
+    <w:p>
+      <w:pPr>
+        <w:spacing w:after="120"/>
+        <w:jc w:val="both"/>
+      </w:pPr>
+      <w:r>
+        <w:t xml:space="preserve">Además de las preguntas embebidas en las partes anteriores, responda estas dos. Acompañe cada respuesta con la captura o la salida de consola que la sustenta.</w:t>
+      </w:r>
+    </w:p>
+    <w:tbl>
+      <w:tblPr>
+        <w:tblW w:w="8829" w:type="dxa"/>
+        <w:tblBorders>
+          <w:top w:val="nil"/>
+          <w:left w:val="single" w:sz="36" w:space="0" w:color="6F42C1"/>
+          <w:bottom w:val="nil"/>
+          <w:right w:val="nil"/>
+          <w:insideH w:val="nil"/>
+          <w:insideV w:val="nil"/>
+        </w:tblBorders>
+        <w:tblLayout w:type="fixed"/>
+        <w:tblCellMar>
+          <w:top w:w="90" w:type="dxa"/>
+          <w:left w:w="180" w:type="dxa"/>
+          <w:bottom w:w="90" w:type="dxa"/>
+          <w:right w:w="140" w:type="dxa"/>
+        </w:tblCellMar>
+        <w:tblLook w:val="0600" w:firstRow="0" w:lastRow="0" w:firstColumn="0" w:lastColumn="0" w:noHBand="1" w:noVBand="1"/>
+      </w:tblPr>
+      <w:tblGrid>
+        <w:gridCol w:w="8829"/>
+      </w:tblGrid>
+      <w:tr>
+        <w:trPr>
+          <w:cantSplit/>
+        </w:trPr>
+        <w:tc>
+          <w:tcPr>
+            <w:tcW w:w="8829" w:type="dxa"/>
+            <w:shd w:val="clear" w:color="auto" w:fill="F3ECFA"/>
+          </w:tcPr>
+          <w:p>
+            <w:pPr>
+              <w:spacing w:before="30" w:after="30" w:line="252" w:lineRule="auto"/>
+              <w:jc w:val="both"/>
+            </w:pPr>
+            <w:r>
+              <w:rPr>
+                <w:b/>
+                <w:bCs/>
+                <w:color w:val="6F42C1"/>
+              </w:rPr>
+              <w:t xml:space="preserve">Pregunta 8. </w:t>
+            </w:r>
+            <w:r>
+              <w:t xml:space="preserve">Explique el recorrido completo de una petición desde su navegador hasta el proceso nginx, nombrando en orden cada pieza que la atiende. Indique cuál de ellas no existiría en un clúster de producción y por qué.</w:t>
+            </w:r>
+          </w:p>
+        </w:tc>
+      </w:tr>
+    </w:tbl>
+    <w:p>
+      <w:pPr>
+        <w:spacing w:after="0" w:line="140" w:lineRule="exact"/>
+      </w:pPr>
+    </w:p>
+    <w:tbl>
+      <w:tblPr>
+        <w:tblW w:w="8829" w:type="dxa"/>
+        <w:tblBorders>
+          <w:top w:val="nil"/>
+          <w:left w:val="single" w:sz="36" w:space="0" w:color="6F42C1"/>
+          <w:bottom w:val="nil"/>
+          <w:right w:val="nil"/>
+          <w:insideH w:val="nil"/>
+          <w:insideV w:val="nil"/>
+        </w:tblBorders>
+        <w:tblLayout w:type="fixed"/>
+        <w:tblCellMar>
+          <w:top w:w="90" w:type="dxa"/>
+          <w:left w:w="180" w:type="dxa"/>
+          <w:bottom w:w="90" w:type="dxa"/>
+          <w:right w:w="140" w:type="dxa"/>
+        </w:tblCellMar>
+        <w:tblLook w:val="0600" w:firstRow="0" w:lastRow="0" w:firstColumn="0" w:lastColumn="0" w:noHBand="1" w:noVBand="1"/>
+      </w:tblPr>
+      <w:tblGrid>
+        <w:gridCol w:w="8829"/>
+      </w:tblGrid>
+      <w:tr>
+        <w:trPr>
+          <w:cantSplit/>
+        </w:trPr>
+        <w:tc>
+          <w:tcPr>
+            <w:tcW w:w="8829" w:type="dxa"/>
+            <w:shd w:val="clear" w:color="auto" w:fill="F3ECFA"/>
+          </w:tcPr>
+          <w:p>
+            <w:pPr>
+              <w:spacing w:before="30" w:after="30" w:line="252" w:lineRule="auto"/>
+              <w:jc w:val="both"/>
+            </w:pPr>
+            <w:r>
+              <w:rPr>
+                <w:b/>
+                <w:bCs/>
+                <w:color w:val="6F42C1"/>
+              </w:rPr>
               <w:t xml:space="preserve">Pregunta 9. </w:t>
             </w:r>
             <w:r>
@@ -10069,6 +11213,30 @@
       </w:pPr>
       <w:r>
         <w:t xml:space="preserve">Captura del Dashboard mostrando los dos namespaces con sus Deployments.</w:t>
+      </w:r>
+    </w:p>
+    <w:p>
+      <w:pPr>
+        <w:pStyle w:val="ListParagraph"/>
+        <w:numPr>
+          <w:ilvl w:val="0"/>
+          <w:numId w:val="19"/>
+        </w:numPr>
+        <w:spacing w:after="100"/>
+        <w:jc w:val="both"/>
+      </w:pPr>
+      <w:r>
+        <w:t xml:space="preserve">Opcional: enlace a su </w:t>
+      </w:r>
+      <w:r>
+        <w:rPr>
+          <w:i/>
+          <w:iCs/>
+        </w:rPr>
+        <w:t xml:space="preserve">fork</w:t>
+      </w:r>
+      <w:r>
+        <w:t xml:space="preserve"> del repositorio con los cambios que haya hecho.</w:t>
       </w:r>
     </w:p>
     <w:p>

</xml_diff>

<commit_message>
Corregir el arranque de nginx: keepalive_timeout duplicado
La imagen base nginx:1.29-alpine ya declara "keepalive_timeout 65;" en el
bloque http de /etc/nginx/nginx.conf. Al copiar 00-keepalive.conf a
/etc/nginx/conf.d/ la directiva quedaba declarada dos veces en el mismo
contexto y nginx abortaba con "directive is duplicate", de modo que el
contenedor no arrancaba en local y el Pod quedaba en CrashLoopBackOff.

Los dos Dockerfile borran ahora la directiva del archivo base antes de
dejar la del laboratorio. Se actualizan tambien los fragmentos de la guia
(markdown, HTML y docx) y se agrega la fila correspondiente en la tabla
de problemas frecuentes.

Co-Authored-By: Claude Opus 5 <noreply@anthropic.com>
Claude-Session: https://claude.ai/code/session_01YTGrcSm4wYWgYacYyYSkPp
</commit_message>
<xml_diff>
--- a/Laboratorio_Kubernetes.docx
+++ b/Laboratorio_Kubernetes.docx
@@ -4571,6 +4571,31 @@
                 <w:szCs w:val="18"/>
                 <w:lang w:val="en-US"/>
               </w:rPr>
+              <w:t xml:space="preserve">RUN sed -i '/keepalive_timeout/d' /etc/nginx/nginx.conf</w:t>
+            </w:r>
+            <w:r>
+              <w:rPr>
+                <w:rFonts w:ascii="Consolas" w:hAnsi="Consolas" w:cs="Courier New"/>
+                <w:color w:val="9AA7B4"/>
+                <w:sz w:val="18"/>
+                <w:szCs w:val="18"/>
+                <w:lang w:val="en-US"/>
+              </w:rPr>
+              <w:t xml:space="preserve">   # la base ya la trae</w:t>
+            </w:r>
+          </w:p>
+          <w:p>
+            <w:pPr>
+              <w:spacing w:after="0" w:line="240" w:lineRule="auto"/>
+            </w:pPr>
+            <w:r>
+              <w:rPr>
+                <w:rFonts w:ascii="Consolas" w:hAnsi="Consolas" w:cs="Courier New"/>
+                <w:color w:val="FFFFFF"/>
+                <w:sz w:val="18"/>
+                <w:szCs w:val="18"/>
+                <w:lang w:val="en-US"/>
+              </w:rPr>
               <w:t xml:space="preserve">COPY 30-pod-info.sh /docker-entrypoint.d/</w:t>
             </w:r>
           </w:p>
@@ -12578,6 +12603,159 @@
                 <w:szCs w:val="19"/>
               </w:rPr>
               <w:t xml:space="preserve"> y espere; puede tomar dos minutos</w:t>
+            </w:r>
+          </w:p>
+        </w:tc>
+      </w:tr>
+      <w:tr>
+        <w:trPr>
+          <w:cantSplit/>
+        </w:trPr>
+        <w:tc>
+          <w:tcPr>
+            <w:tcW w:w="2500" w:type="dxa"/>
+            <w:shd w:val="clear" w:color="auto" w:fill="FFFFFF"/>
+          </w:tcPr>
+          <w:p>
+            <w:pPr>
+              <w:spacing w:before="20" w:after="20" w:line="252" w:lineRule="auto"/>
+            </w:pPr>
+            <w:r>
+              <w:rPr>
+                <w:sz w:val="19"/>
+                <w:szCs w:val="19"/>
+              </w:rPr>
+              <w:t xml:space="preserve">Pod en </w:t>
+            </w:r>
+            <w:r>
+              <w:rPr>
+                <w:rStyle w:val="HTMLCode"/>
+                <w:rFonts w:eastAsiaTheme="minorHAnsi"/>
+                <w:color w:val="E83E8C"/>
+                <w:shd w:val="clear" w:color="auto" w:fill="F9F2F4"/>
+                <w:sz w:val="19"/>
+                <w:szCs w:val="19"/>
+              </w:rPr>
+              <w:t xml:space="preserve">CrashLoopBackOff</w:t>
+            </w:r>
+            <w:r>
+              <w:rPr>
+                <w:sz w:val="19"/>
+                <w:szCs w:val="19"/>
+              </w:rPr>
+              <w:t xml:space="preserve"> recién construida la imagen</w:t>
+            </w:r>
+          </w:p>
+        </w:tc>
+        <w:tc>
+          <w:tcPr>
+            <w:tcW w:w="3200" w:type="dxa"/>
+            <w:shd w:val="clear" w:color="auto" w:fill="FFFFFF"/>
+          </w:tcPr>
+          <w:p>
+            <w:pPr>
+              <w:spacing w:before="20" w:after="20" w:line="252" w:lineRule="auto"/>
+            </w:pPr>
+            <w:r>
+              <w:rPr>
+                <w:sz w:val="19"/>
+                <w:szCs w:val="19"/>
+              </w:rPr>
+              <w:t xml:space="preserve">nginx no arranca: </w:t>
+            </w:r>
+            <w:r>
+              <w:rPr>
+                <w:rStyle w:val="HTMLCode"/>
+                <w:rFonts w:eastAsiaTheme="minorHAnsi"/>
+                <w:color w:val="E83E8C"/>
+                <w:shd w:val="clear" w:color="auto" w:fill="F9F2F4"/>
+                <w:sz w:val="19"/>
+                <w:szCs w:val="19"/>
+              </w:rPr>
+              <w:t xml:space="preserve">keepalive_timeout</w:t>
+            </w:r>
+            <w:r>
+              <w:rPr>
+                <w:sz w:val="19"/>
+                <w:szCs w:val="19"/>
+              </w:rPr>
+              <w:t xml:space="preserve"> queda declarado dos veces</w:t>
+            </w:r>
+          </w:p>
+        </w:tc>
+        <w:tc>
+          <w:tcPr>
+            <w:tcW w:w="3129" w:type="dxa"/>
+            <w:shd w:val="clear" w:color="auto" w:fill="FFFFFF"/>
+          </w:tcPr>
+          <w:p>
+            <w:pPr>
+              <w:spacing w:before="20" w:after="20" w:line="252" w:lineRule="auto"/>
+            </w:pPr>
+            <w:r>
+              <w:rPr>
+                <w:rStyle w:val="HTMLCode"/>
+                <w:rFonts w:eastAsiaTheme="minorHAnsi"/>
+                <w:color w:val="E83E8C"/>
+                <w:shd w:val="clear" w:color="auto" w:fill="F9F2F4"/>
+                <w:sz w:val="19"/>
+                <w:szCs w:val="19"/>
+              </w:rPr>
+              <w:t xml:space="preserve">kubectl -n lab logs &lt;pod&gt; --previous</w:t>
+            </w:r>
+            <w:r>
+              <w:rPr>
+                <w:sz w:val="19"/>
+                <w:szCs w:val="19"/>
+              </w:rPr>
+              <w:t xml:space="preserve"> muestra el </w:t>
+            </w:r>
+            <w:r>
+              <w:rPr>
+                <w:rStyle w:val="HTMLCode"/>
+                <w:rFonts w:eastAsiaTheme="minorHAnsi"/>
+                <w:color w:val="E83E8C"/>
+                <w:shd w:val="clear" w:color="auto" w:fill="F9F2F4"/>
+                <w:sz w:val="19"/>
+                <w:szCs w:val="19"/>
+              </w:rPr>
+              <w:t xml:space="preserve">[emerg]</w:t>
+            </w:r>
+            <w:r>
+              <w:rPr>
+                <w:sz w:val="19"/>
+                <w:szCs w:val="19"/>
+              </w:rPr>
+              <w:t xml:space="preserve">. El Dockerfile debe borrar la directiva del </w:t>
+            </w:r>
+            <w:r>
+              <w:rPr>
+                <w:rStyle w:val="HTMLCode"/>
+                <w:rFonts w:eastAsiaTheme="minorHAnsi"/>
+                <w:color w:val="E83E8C"/>
+                <w:shd w:val="clear" w:color="auto" w:fill="F9F2F4"/>
+                <w:sz w:val="19"/>
+                <w:szCs w:val="19"/>
+              </w:rPr>
+              <w:t xml:space="preserve">nginx.conf</w:t>
+            </w:r>
+            <w:r>
+              <w:rPr>
+                <w:sz w:val="19"/>
+                <w:szCs w:val="19"/>
+              </w:rPr>
+              <w:t xml:space="preserve"> base con </w:t>
+            </w:r>
+            <w:r>
+              <w:rPr>
+                <w:rStyle w:val="HTMLCode"/>
+                <w:rFonts w:eastAsiaTheme="minorHAnsi"/>
+                <w:color w:val="E83E8C"/>
+                <w:shd w:val="clear" w:color="auto" w:fill="F9F2F4"/>
+                <w:sz w:val="19"/>
+                <w:szCs w:val="19"/>
+              </w:rPr>
+              <w:t xml:space="preserve">sed</w:t>
             </w:r>
           </w:p>
         </w:tc>

</xml_diff>